<commit_message>
created STD and added (Section 4.4)
</commit_message>
<xml_diff>
--- a/adil/#48 SRS Hospital System Adil Arshad.docx
+++ b/adil/#48 SRS Hospital System Adil Arshad.docx
@@ -9380,24 +9380,14 @@
       <w:r>
         <w:t xml:space="preserve">Figure </w:t>
       </w:r>
-      <w:r>
-        <w:fldChar w:fldCharType="begin"/>
-      </w:r>
-      <w:r>
-        <w:instrText xml:space="preserve"> SEQ Figure \* ARABIC </w:instrText>
-      </w:r>
-      <w:r>
-        <w:fldChar w:fldCharType="separate"/>
-      </w:r>
-      <w:r>
-        <w:rPr>
-          <w:noProof/>
-        </w:rPr>
-        <w:t>1</w:t>
-      </w:r>
-      <w:r>
-        <w:fldChar w:fldCharType="end"/>
-      </w:r>
+      <w:fldSimple w:instr=" SEQ Figure \* ARABIC ">
+        <w:r>
+          <w:rPr>
+            <w:noProof/>
+          </w:rPr>
+          <w:t>1</w:t>
+        </w:r>
+      </w:fldSimple>
       <w:r>
         <w:t xml:space="preserve"> </w:t>
       </w:r>
@@ -9832,24 +9822,14 @@
       <w:r>
         <w:t xml:space="preserve">Figure </w:t>
       </w:r>
-      <w:r>
-        <w:fldChar w:fldCharType="begin"/>
-      </w:r>
-      <w:r>
-        <w:instrText xml:space="preserve"> SEQ Figure \* ARABIC </w:instrText>
-      </w:r>
-      <w:r>
-        <w:fldChar w:fldCharType="separate"/>
-      </w:r>
-      <w:r>
-        <w:rPr>
-          <w:noProof/>
-        </w:rPr>
-        <w:t>2</w:t>
-      </w:r>
-      <w:r>
-        <w:fldChar w:fldCharType="end"/>
-      </w:r>
+      <w:fldSimple w:instr=" SEQ Figure \* ARABIC ">
+        <w:r>
+          <w:rPr>
+            <w:noProof/>
+          </w:rPr>
+          <w:t>2</w:t>
+        </w:r>
+      </w:fldSimple>
       <w:r>
         <w:t xml:space="preserve"> User Login, Logout Use Case Diagram</w:t>
       </w:r>
@@ -10250,24 +10230,14 @@
       <w:r>
         <w:t xml:space="preserve">Figure </w:t>
       </w:r>
-      <w:r>
-        <w:fldChar w:fldCharType="begin"/>
-      </w:r>
-      <w:r>
-        <w:instrText xml:space="preserve"> SEQ Figure \* ARABIC </w:instrText>
-      </w:r>
-      <w:r>
-        <w:fldChar w:fldCharType="separate"/>
-      </w:r>
-      <w:r>
-        <w:rPr>
-          <w:noProof/>
-        </w:rPr>
-        <w:t>3</w:t>
-      </w:r>
-      <w:r>
-        <w:fldChar w:fldCharType="end"/>
-      </w:r>
+      <w:fldSimple w:instr=" SEQ Figure \* ARABIC ">
+        <w:r>
+          <w:rPr>
+            <w:noProof/>
+          </w:rPr>
+          <w:t>3</w:t>
+        </w:r>
+      </w:fldSimple>
       <w:r>
         <w:t xml:space="preserve"> User </w:t>
       </w:r>
@@ -10671,24 +10641,14 @@
       <w:r>
         <w:t xml:space="preserve">Figure </w:t>
       </w:r>
-      <w:r>
-        <w:fldChar w:fldCharType="begin"/>
-      </w:r>
-      <w:r>
-        <w:instrText xml:space="preserve"> SEQ Figure \* ARABIC </w:instrText>
-      </w:r>
-      <w:r>
-        <w:fldChar w:fldCharType="separate"/>
-      </w:r>
-      <w:r>
-        <w:rPr>
-          <w:noProof/>
-        </w:rPr>
-        <w:t>4</w:t>
-      </w:r>
-      <w:r>
-        <w:fldChar w:fldCharType="end"/>
-      </w:r>
+      <w:fldSimple w:instr=" SEQ Figure \* ARABIC ">
+        <w:r>
+          <w:rPr>
+            <w:noProof/>
+          </w:rPr>
+          <w:t>4</w:t>
+        </w:r>
+      </w:fldSimple>
       <w:r>
         <w:t xml:space="preserve"> User </w:t>
       </w:r>
@@ -11096,24 +11056,14 @@
       <w:r>
         <w:t xml:space="preserve">Figure </w:t>
       </w:r>
-      <w:r>
-        <w:fldChar w:fldCharType="begin"/>
-      </w:r>
-      <w:r>
-        <w:instrText xml:space="preserve"> SEQ Figure \* ARABIC </w:instrText>
-      </w:r>
-      <w:r>
-        <w:fldChar w:fldCharType="separate"/>
-      </w:r>
-      <w:r>
-        <w:rPr>
-          <w:noProof/>
-        </w:rPr>
-        <w:t>5</w:t>
-      </w:r>
-      <w:r>
-        <w:fldChar w:fldCharType="end"/>
-      </w:r>
+      <w:fldSimple w:instr=" SEQ Figure \* ARABIC ">
+        <w:r>
+          <w:rPr>
+            <w:noProof/>
+          </w:rPr>
+          <w:t>5</w:t>
+        </w:r>
+      </w:fldSimple>
       <w:r>
         <w:t xml:space="preserve"> User Delete Account Use Case Diagram</w:t>
       </w:r>
@@ -11531,24 +11481,14 @@
       <w:r>
         <w:t xml:space="preserve">Figure </w:t>
       </w:r>
-      <w:r>
-        <w:fldChar w:fldCharType="begin"/>
-      </w:r>
-      <w:r>
-        <w:instrText xml:space="preserve"> SEQ Figure \* ARABIC </w:instrText>
-      </w:r>
-      <w:r>
-        <w:fldChar w:fldCharType="separate"/>
-      </w:r>
-      <w:r>
-        <w:rPr>
-          <w:noProof/>
-        </w:rPr>
-        <w:t>6</w:t>
-      </w:r>
-      <w:r>
-        <w:fldChar w:fldCharType="end"/>
-      </w:r>
+      <w:fldSimple w:instr=" SEQ Figure \* ARABIC ">
+        <w:r>
+          <w:rPr>
+            <w:noProof/>
+          </w:rPr>
+          <w:t>6</w:t>
+        </w:r>
+      </w:fldSimple>
       <w:r>
         <w:t xml:space="preserve"> </w:t>
       </w:r>
@@ -11958,24 +11898,14 @@
       <w:r>
         <w:t xml:space="preserve">Figure </w:t>
       </w:r>
-      <w:r>
-        <w:fldChar w:fldCharType="begin"/>
-      </w:r>
-      <w:r>
-        <w:instrText xml:space="preserve"> SEQ Figure \* ARABIC </w:instrText>
-      </w:r>
-      <w:r>
-        <w:fldChar w:fldCharType="separate"/>
-      </w:r>
-      <w:r>
-        <w:rPr>
-          <w:noProof/>
-        </w:rPr>
-        <w:t>7</w:t>
-      </w:r>
-      <w:r>
-        <w:fldChar w:fldCharType="end"/>
-      </w:r>
+      <w:fldSimple w:instr=" SEQ Figure \* ARABIC ">
+        <w:r>
+          <w:rPr>
+            <w:noProof/>
+          </w:rPr>
+          <w:t>7</w:t>
+        </w:r>
+      </w:fldSimple>
       <w:r>
         <w:t xml:space="preserve"> Patient </w:t>
       </w:r>
@@ -12378,24 +12308,14 @@
       <w:r>
         <w:t xml:space="preserve">Figure </w:t>
       </w:r>
-      <w:r>
-        <w:fldChar w:fldCharType="begin"/>
-      </w:r>
-      <w:r>
-        <w:instrText xml:space="preserve"> SEQ Figure \* ARABIC </w:instrText>
-      </w:r>
-      <w:r>
-        <w:fldChar w:fldCharType="separate"/>
-      </w:r>
-      <w:r>
-        <w:rPr>
-          <w:noProof/>
-        </w:rPr>
-        <w:t>8</w:t>
-      </w:r>
-      <w:r>
-        <w:fldChar w:fldCharType="end"/>
-      </w:r>
+      <w:fldSimple w:instr=" SEQ Figure \* ARABIC ">
+        <w:r>
+          <w:rPr>
+            <w:noProof/>
+          </w:rPr>
+          <w:t>8</w:t>
+        </w:r>
+      </w:fldSimple>
       <w:r>
         <w:t xml:space="preserve"> Patient </w:t>
       </w:r>
@@ -12799,24 +12719,14 @@
       <w:r>
         <w:t xml:space="preserve">Figure </w:t>
       </w:r>
-      <w:r>
-        <w:fldChar w:fldCharType="begin"/>
-      </w:r>
-      <w:r>
-        <w:instrText xml:space="preserve"> SEQ Figure \* ARABIC </w:instrText>
-      </w:r>
-      <w:r>
-        <w:fldChar w:fldCharType="separate"/>
-      </w:r>
-      <w:r>
-        <w:rPr>
-          <w:noProof/>
-        </w:rPr>
-        <w:t>9</w:t>
-      </w:r>
-      <w:r>
-        <w:fldChar w:fldCharType="end"/>
-      </w:r>
+      <w:fldSimple w:instr=" SEQ Figure \* ARABIC ">
+        <w:r>
+          <w:rPr>
+            <w:noProof/>
+          </w:rPr>
+          <w:t>9</w:t>
+        </w:r>
+      </w:fldSimple>
       <w:r>
         <w:t xml:space="preserve"> Patient </w:t>
       </w:r>
@@ -13216,24 +13126,14 @@
       <w:r>
         <w:t xml:space="preserve">Figure </w:t>
       </w:r>
-      <w:r>
-        <w:fldChar w:fldCharType="begin"/>
-      </w:r>
-      <w:r>
-        <w:instrText xml:space="preserve"> SEQ Figure \* ARABIC </w:instrText>
-      </w:r>
-      <w:r>
-        <w:fldChar w:fldCharType="separate"/>
-      </w:r>
-      <w:r>
-        <w:rPr>
-          <w:noProof/>
-        </w:rPr>
-        <w:t>10</w:t>
-      </w:r>
-      <w:r>
-        <w:fldChar w:fldCharType="end"/>
-      </w:r>
+      <w:fldSimple w:instr=" SEQ Figure \* ARABIC ">
+        <w:r>
+          <w:rPr>
+            <w:noProof/>
+          </w:rPr>
+          <w:t>10</w:t>
+        </w:r>
+      </w:fldSimple>
       <w:r>
         <w:t xml:space="preserve"> Patient </w:t>
       </w:r>
@@ -13632,24 +13532,14 @@
       <w:r>
         <w:t xml:space="preserve">Figure </w:t>
       </w:r>
-      <w:r>
-        <w:fldChar w:fldCharType="begin"/>
-      </w:r>
-      <w:r>
-        <w:instrText xml:space="preserve"> SEQ Figure \* ARABIC </w:instrText>
-      </w:r>
-      <w:r>
-        <w:fldChar w:fldCharType="separate"/>
-      </w:r>
-      <w:r>
-        <w:rPr>
-          <w:noProof/>
-        </w:rPr>
-        <w:t>11</w:t>
-      </w:r>
-      <w:r>
-        <w:fldChar w:fldCharType="end"/>
-      </w:r>
+      <w:fldSimple w:instr=" SEQ Figure \* ARABIC ">
+        <w:r>
+          <w:rPr>
+            <w:noProof/>
+          </w:rPr>
+          <w:t>11</w:t>
+        </w:r>
+      </w:fldSimple>
       <w:r>
         <w:t xml:space="preserve"> Patient </w:t>
       </w:r>
@@ -14053,24 +13943,14 @@
       <w:r>
         <w:t xml:space="preserve">Figure </w:t>
       </w:r>
-      <w:r>
-        <w:fldChar w:fldCharType="begin"/>
-      </w:r>
-      <w:r>
-        <w:instrText xml:space="preserve"> SEQ Figure \* ARABIC </w:instrText>
-      </w:r>
-      <w:r>
-        <w:fldChar w:fldCharType="separate"/>
-      </w:r>
-      <w:r>
-        <w:rPr>
-          <w:noProof/>
-        </w:rPr>
-        <w:t>12</w:t>
-      </w:r>
-      <w:r>
-        <w:fldChar w:fldCharType="end"/>
-      </w:r>
+      <w:fldSimple w:instr=" SEQ Figure \* ARABIC ">
+        <w:r>
+          <w:rPr>
+            <w:noProof/>
+          </w:rPr>
+          <w:t>12</w:t>
+        </w:r>
+      </w:fldSimple>
       <w:r>
         <w:t xml:space="preserve"> Patient </w:t>
       </w:r>
@@ -14490,24 +14370,14 @@
       <w:r>
         <w:t xml:space="preserve">Figure </w:t>
       </w:r>
-      <w:r>
-        <w:fldChar w:fldCharType="begin"/>
-      </w:r>
-      <w:r>
-        <w:instrText xml:space="preserve"> SEQ Figure \* ARABIC </w:instrText>
-      </w:r>
-      <w:r>
-        <w:fldChar w:fldCharType="separate"/>
-      </w:r>
-      <w:r>
-        <w:rPr>
-          <w:noProof/>
-        </w:rPr>
-        <w:t>13</w:t>
-      </w:r>
-      <w:r>
-        <w:fldChar w:fldCharType="end"/>
-      </w:r>
+      <w:fldSimple w:instr=" SEQ Figure \* ARABIC ">
+        <w:r>
+          <w:rPr>
+            <w:noProof/>
+          </w:rPr>
+          <w:t>13</w:t>
+        </w:r>
+      </w:fldSimple>
       <w:r>
         <w:t xml:space="preserve"> Doctor Dashboard Use Case Diagram</w:t>
       </w:r>
@@ -14900,24 +14770,14 @@
       <w:r>
         <w:t xml:space="preserve">Figure </w:t>
       </w:r>
-      <w:r>
-        <w:fldChar w:fldCharType="begin"/>
-      </w:r>
-      <w:r>
-        <w:instrText xml:space="preserve"> SEQ Figure \* ARABIC </w:instrText>
-      </w:r>
-      <w:r>
-        <w:fldChar w:fldCharType="separate"/>
-      </w:r>
-      <w:r>
-        <w:rPr>
-          <w:noProof/>
-        </w:rPr>
-        <w:t>14</w:t>
-      </w:r>
-      <w:r>
-        <w:fldChar w:fldCharType="end"/>
-      </w:r>
+      <w:fldSimple w:instr=" SEQ Figure \* ARABIC ">
+        <w:r>
+          <w:rPr>
+            <w:noProof/>
+          </w:rPr>
+          <w:t>14</w:t>
+        </w:r>
+      </w:fldSimple>
       <w:r>
         <w:t xml:space="preserve"> Doctor </w:t>
       </w:r>
@@ -15317,24 +15177,14 @@
       <w:r>
         <w:t xml:space="preserve">Figure </w:t>
       </w:r>
-      <w:r>
-        <w:fldChar w:fldCharType="begin"/>
-      </w:r>
-      <w:r>
-        <w:instrText xml:space="preserve"> SEQ Figure \* ARABIC </w:instrText>
-      </w:r>
-      <w:r>
-        <w:fldChar w:fldCharType="separate"/>
-      </w:r>
-      <w:r>
-        <w:rPr>
-          <w:noProof/>
-        </w:rPr>
-        <w:t>15</w:t>
-      </w:r>
-      <w:r>
-        <w:fldChar w:fldCharType="end"/>
-      </w:r>
+      <w:fldSimple w:instr=" SEQ Figure \* ARABIC ">
+        <w:r>
+          <w:rPr>
+            <w:noProof/>
+          </w:rPr>
+          <w:t>15</w:t>
+        </w:r>
+      </w:fldSimple>
       <w:r>
         <w:t xml:space="preserve"> Doctor </w:t>
       </w:r>
@@ -15738,24 +15588,14 @@
       <w:r>
         <w:t xml:space="preserve">Figure </w:t>
       </w:r>
-      <w:r>
-        <w:fldChar w:fldCharType="begin"/>
-      </w:r>
-      <w:r>
-        <w:instrText xml:space="preserve"> SEQ Figure \* ARABIC </w:instrText>
-      </w:r>
-      <w:r>
-        <w:fldChar w:fldCharType="separate"/>
-      </w:r>
-      <w:r>
-        <w:rPr>
-          <w:noProof/>
-        </w:rPr>
-        <w:t>16</w:t>
-      </w:r>
-      <w:r>
-        <w:fldChar w:fldCharType="end"/>
-      </w:r>
+      <w:fldSimple w:instr=" SEQ Figure \* ARABIC ">
+        <w:r>
+          <w:rPr>
+            <w:noProof/>
+          </w:rPr>
+          <w:t>16</w:t>
+        </w:r>
+      </w:fldSimple>
       <w:r>
         <w:t xml:space="preserve"> Doctor </w:t>
       </w:r>
@@ -16154,24 +15994,14 @@
       <w:r>
         <w:t xml:space="preserve">Figure </w:t>
       </w:r>
-      <w:r>
-        <w:fldChar w:fldCharType="begin"/>
-      </w:r>
-      <w:r>
-        <w:instrText xml:space="preserve"> SEQ Figure \* ARABIC </w:instrText>
-      </w:r>
-      <w:r>
-        <w:fldChar w:fldCharType="separate"/>
-      </w:r>
-      <w:r>
-        <w:rPr>
-          <w:noProof/>
-        </w:rPr>
-        <w:t>17</w:t>
-      </w:r>
-      <w:r>
-        <w:fldChar w:fldCharType="end"/>
-      </w:r>
+      <w:fldSimple w:instr=" SEQ Figure \* ARABIC ">
+        <w:r>
+          <w:rPr>
+            <w:noProof/>
+          </w:rPr>
+          <w:t>17</w:t>
+        </w:r>
+      </w:fldSimple>
       <w:r>
         <w:t xml:space="preserve"> Doctor </w:t>
       </w:r>
@@ -16579,24 +16409,14 @@
       <w:r>
         <w:t xml:space="preserve">Figure </w:t>
       </w:r>
-      <w:r>
-        <w:fldChar w:fldCharType="begin"/>
-      </w:r>
-      <w:r>
-        <w:instrText xml:space="preserve"> SEQ Figure \* ARABIC </w:instrText>
-      </w:r>
-      <w:r>
-        <w:fldChar w:fldCharType="separate"/>
-      </w:r>
-      <w:r>
-        <w:rPr>
-          <w:noProof/>
-        </w:rPr>
-        <w:t>18</w:t>
-      </w:r>
-      <w:r>
-        <w:fldChar w:fldCharType="end"/>
-      </w:r>
+      <w:fldSimple w:instr=" SEQ Figure \* ARABIC ">
+        <w:r>
+          <w:rPr>
+            <w:noProof/>
+          </w:rPr>
+          <w:t>18</w:t>
+        </w:r>
+      </w:fldSimple>
       <w:r>
         <w:t xml:space="preserve"> Doctor </w:t>
       </w:r>
@@ -17020,24 +16840,14 @@
       <w:r>
         <w:t xml:space="preserve">Figure </w:t>
       </w:r>
-      <w:r>
-        <w:fldChar w:fldCharType="begin"/>
-      </w:r>
-      <w:r>
-        <w:instrText xml:space="preserve"> SEQ Figure \* ARABIC </w:instrText>
-      </w:r>
-      <w:r>
-        <w:fldChar w:fldCharType="separate"/>
-      </w:r>
-      <w:r>
-        <w:rPr>
-          <w:noProof/>
-        </w:rPr>
-        <w:t>19</w:t>
-      </w:r>
-      <w:r>
-        <w:fldChar w:fldCharType="end"/>
-      </w:r>
+      <w:fldSimple w:instr=" SEQ Figure \* ARABIC ">
+        <w:r>
+          <w:rPr>
+            <w:noProof/>
+          </w:rPr>
+          <w:t>19</w:t>
+        </w:r>
+      </w:fldSimple>
       <w:r>
         <w:t xml:space="preserve"> Admin </w:t>
       </w:r>
@@ -17436,24 +17246,14 @@
       <w:r>
         <w:t xml:space="preserve">Figure </w:t>
       </w:r>
-      <w:r>
-        <w:fldChar w:fldCharType="begin"/>
-      </w:r>
-      <w:r>
-        <w:instrText xml:space="preserve"> SEQ Figure \* ARABIC </w:instrText>
-      </w:r>
-      <w:r>
-        <w:fldChar w:fldCharType="separate"/>
-      </w:r>
-      <w:r>
-        <w:rPr>
-          <w:noProof/>
-        </w:rPr>
-        <w:t>20</w:t>
-      </w:r>
-      <w:r>
-        <w:fldChar w:fldCharType="end"/>
-      </w:r>
+      <w:fldSimple w:instr=" SEQ Figure \* ARABIC ">
+        <w:r>
+          <w:rPr>
+            <w:noProof/>
+          </w:rPr>
+          <w:t>20</w:t>
+        </w:r>
+      </w:fldSimple>
       <w:r>
         <w:t xml:space="preserve"> Admin </w:t>
       </w:r>
@@ -17857,24 +17657,14 @@
       <w:r>
         <w:t xml:space="preserve">Figure </w:t>
       </w:r>
-      <w:r>
-        <w:fldChar w:fldCharType="begin"/>
-      </w:r>
-      <w:r>
-        <w:instrText xml:space="preserve"> SEQ Figure \* ARABIC </w:instrText>
-      </w:r>
-      <w:r>
-        <w:fldChar w:fldCharType="separate"/>
-      </w:r>
-      <w:r>
-        <w:rPr>
-          <w:noProof/>
-        </w:rPr>
-        <w:t>21</w:t>
-      </w:r>
-      <w:r>
-        <w:fldChar w:fldCharType="end"/>
-      </w:r>
+      <w:fldSimple w:instr=" SEQ Figure \* ARABIC ">
+        <w:r>
+          <w:rPr>
+            <w:noProof/>
+          </w:rPr>
+          <w:t>21</w:t>
+        </w:r>
+      </w:fldSimple>
       <w:r>
         <w:t xml:space="preserve"> Admin </w:t>
       </w:r>
@@ -18274,24 +18064,14 @@
       <w:r>
         <w:t xml:space="preserve">Figure </w:t>
       </w:r>
-      <w:r>
-        <w:fldChar w:fldCharType="begin"/>
-      </w:r>
-      <w:r>
-        <w:instrText xml:space="preserve"> SEQ Figure \* ARABIC </w:instrText>
-      </w:r>
-      <w:r>
-        <w:fldChar w:fldCharType="separate"/>
-      </w:r>
-      <w:r>
-        <w:rPr>
-          <w:noProof/>
-        </w:rPr>
-        <w:t>22</w:t>
-      </w:r>
-      <w:r>
-        <w:fldChar w:fldCharType="end"/>
-      </w:r>
+      <w:fldSimple w:instr=" SEQ Figure \* ARABIC ">
+        <w:r>
+          <w:rPr>
+            <w:noProof/>
+          </w:rPr>
+          <w:t>22</w:t>
+        </w:r>
+      </w:fldSimple>
       <w:r>
         <w:t xml:space="preserve"> Admin </w:t>
       </w:r>
@@ -18694,24 +18474,14 @@
       <w:r>
         <w:t xml:space="preserve">Figure </w:t>
       </w:r>
-      <w:r>
-        <w:fldChar w:fldCharType="begin"/>
-      </w:r>
-      <w:r>
-        <w:instrText xml:space="preserve"> SEQ Figure \* ARABIC </w:instrText>
-      </w:r>
-      <w:r>
-        <w:fldChar w:fldCharType="separate"/>
-      </w:r>
-      <w:r>
-        <w:rPr>
-          <w:noProof/>
-        </w:rPr>
-        <w:t>23</w:t>
-      </w:r>
-      <w:r>
-        <w:fldChar w:fldCharType="end"/>
-      </w:r>
+      <w:fldSimple w:instr=" SEQ Figure \* ARABIC ">
+        <w:r>
+          <w:rPr>
+            <w:noProof/>
+          </w:rPr>
+          <w:t>23</w:t>
+        </w:r>
+      </w:fldSimple>
       <w:r>
         <w:t xml:space="preserve"> Admin Generate Reports Use Case Diagram</w:t>
       </w:r>
@@ -19099,24 +18869,14 @@
       <w:r>
         <w:t xml:space="preserve">Figure </w:t>
       </w:r>
-      <w:r>
-        <w:fldChar w:fldCharType="begin"/>
-      </w:r>
-      <w:r>
-        <w:instrText xml:space="preserve"> SEQ Figure \* ARABIC </w:instrText>
-      </w:r>
-      <w:r>
-        <w:fldChar w:fldCharType="separate"/>
-      </w:r>
-      <w:r>
-        <w:rPr>
-          <w:noProof/>
-        </w:rPr>
-        <w:t>24</w:t>
-      </w:r>
-      <w:r>
-        <w:fldChar w:fldCharType="end"/>
-      </w:r>
+      <w:fldSimple w:instr=" SEQ Figure \* ARABIC ">
+        <w:r>
+          <w:rPr>
+            <w:noProof/>
+          </w:rPr>
+          <w:t>24</w:t>
+        </w:r>
+      </w:fldSimple>
       <w:r>
         <w:t xml:space="preserve"> Admin </w:t>
       </w:r>
@@ -19331,24 +19091,14 @@
       <w:r>
         <w:t xml:space="preserve">Figure </w:t>
       </w:r>
-      <w:r>
-        <w:fldChar w:fldCharType="begin"/>
-      </w:r>
-      <w:r>
-        <w:instrText xml:space="preserve"> SEQ Figure \* ARABIC </w:instrText>
-      </w:r>
-      <w:r>
-        <w:fldChar w:fldCharType="separate"/>
-      </w:r>
-      <w:r>
-        <w:rPr>
-          <w:noProof/>
-        </w:rPr>
-        <w:t>25</w:t>
-      </w:r>
-      <w:r>
-        <w:fldChar w:fldCharType="end"/>
-      </w:r>
+      <w:fldSimple w:instr=" SEQ Figure \* ARABIC ">
+        <w:r>
+          <w:rPr>
+            <w:noProof/>
+          </w:rPr>
+          <w:t>25</w:t>
+        </w:r>
+      </w:fldSimple>
       <w:r>
         <w:t xml:space="preserve"> User Class Diagram</w:t>
       </w:r>
@@ -19484,24 +19234,14 @@
       <w:r>
         <w:t xml:space="preserve">Figure </w:t>
       </w:r>
-      <w:r>
-        <w:fldChar w:fldCharType="begin"/>
-      </w:r>
-      <w:r>
-        <w:instrText xml:space="preserve"> SEQ Figure \* ARABIC </w:instrText>
-      </w:r>
-      <w:r>
-        <w:fldChar w:fldCharType="separate"/>
-      </w:r>
-      <w:r>
-        <w:rPr>
-          <w:noProof/>
-        </w:rPr>
-        <w:t>26</w:t>
-      </w:r>
-      <w:r>
-        <w:fldChar w:fldCharType="end"/>
-      </w:r>
+      <w:fldSimple w:instr=" SEQ Figure \* ARABIC ">
+        <w:r>
+          <w:rPr>
+            <w:noProof/>
+          </w:rPr>
+          <w:t>26</w:t>
+        </w:r>
+      </w:fldSimple>
       <w:r>
         <w:t xml:space="preserve"> Patient Class Diagram</w:t>
       </w:r>
@@ -19634,24 +19374,14 @@
       <w:r>
         <w:t xml:space="preserve">Figure </w:t>
       </w:r>
-      <w:r>
-        <w:fldChar w:fldCharType="begin"/>
-      </w:r>
-      <w:r>
-        <w:instrText xml:space="preserve"> SEQ Figure \* ARABIC </w:instrText>
-      </w:r>
-      <w:r>
-        <w:fldChar w:fldCharType="separate"/>
-      </w:r>
-      <w:r>
-        <w:rPr>
-          <w:noProof/>
-        </w:rPr>
-        <w:t>27</w:t>
-      </w:r>
-      <w:r>
-        <w:fldChar w:fldCharType="end"/>
-      </w:r>
+      <w:fldSimple w:instr=" SEQ Figure \* ARABIC ">
+        <w:r>
+          <w:rPr>
+            <w:noProof/>
+          </w:rPr>
+          <w:t>27</w:t>
+        </w:r>
+      </w:fldSimple>
       <w:r>
         <w:t xml:space="preserve"> Doctor Class Diagram</w:t>
       </w:r>
@@ -19686,10 +19416,7 @@
         <w:t>appointmentID, patientID, doctorID, appointmentDate, timeSlot, status, notes, createdAt</w:t>
       </w:r>
       <w:r>
-        <w:t xml:space="preserve"> </w:t>
-      </w:r>
-      <w:r>
-        <w:t xml:space="preserve"> </w:t>
+        <w:t xml:space="preserve">  </w:t>
       </w:r>
       <w:r>
         <w:br/>
@@ -19781,24 +19508,14 @@
       <w:r>
         <w:t xml:space="preserve">Figure </w:t>
       </w:r>
-      <w:r>
-        <w:fldChar w:fldCharType="begin"/>
-      </w:r>
-      <w:r>
-        <w:instrText xml:space="preserve"> SEQ Figure \* ARABIC </w:instrText>
-      </w:r>
-      <w:r>
-        <w:fldChar w:fldCharType="separate"/>
-      </w:r>
-      <w:r>
-        <w:rPr>
-          <w:noProof/>
-        </w:rPr>
-        <w:t>28</w:t>
-      </w:r>
-      <w:r>
-        <w:fldChar w:fldCharType="end"/>
-      </w:r>
+      <w:fldSimple w:instr=" SEQ Figure \* ARABIC ">
+        <w:r>
+          <w:rPr>
+            <w:noProof/>
+          </w:rPr>
+          <w:t>28</w:t>
+        </w:r>
+      </w:fldSimple>
       <w:r>
         <w:t xml:space="preserve"> Appointment Class Diagram</w:t>
       </w:r>
@@ -19923,24 +19640,14 @@
       <w:r>
         <w:t xml:space="preserve">Figure </w:t>
       </w:r>
-      <w:r>
-        <w:fldChar w:fldCharType="begin"/>
-      </w:r>
-      <w:r>
-        <w:instrText xml:space="preserve"> SEQ Figure \* ARABIC </w:instrText>
-      </w:r>
-      <w:r>
-        <w:fldChar w:fldCharType="separate"/>
-      </w:r>
-      <w:r>
-        <w:rPr>
-          <w:noProof/>
-        </w:rPr>
-        <w:t>29</w:t>
-      </w:r>
-      <w:r>
-        <w:fldChar w:fldCharType="end"/>
-      </w:r>
+      <w:fldSimple w:instr=" SEQ Figure \* ARABIC ">
+        <w:r>
+          <w:rPr>
+            <w:noProof/>
+          </w:rPr>
+          <w:t>29</w:t>
+        </w:r>
+      </w:fldSimple>
       <w:r>
         <w:t xml:space="preserve"> </w:t>
       </w:r>
@@ -20070,24 +19777,14 @@
       <w:r>
         <w:t xml:space="preserve">Figure </w:t>
       </w:r>
-      <w:r>
-        <w:fldChar w:fldCharType="begin"/>
-      </w:r>
-      <w:r>
-        <w:instrText xml:space="preserve"> SEQ Figure \* ARABIC </w:instrText>
-      </w:r>
-      <w:r>
-        <w:fldChar w:fldCharType="separate"/>
-      </w:r>
-      <w:r>
-        <w:rPr>
-          <w:noProof/>
-        </w:rPr>
-        <w:t>30</w:t>
-      </w:r>
-      <w:r>
-        <w:fldChar w:fldCharType="end"/>
-      </w:r>
+      <w:fldSimple w:instr=" SEQ Figure \* ARABIC ">
+        <w:r>
+          <w:rPr>
+            <w:noProof/>
+          </w:rPr>
+          <w:t>30</w:t>
+        </w:r>
+      </w:fldSimple>
       <w:r>
         <w:t xml:space="preserve"> </w:t>
       </w:r>
@@ -20218,24 +19915,14 @@
       <w:r>
         <w:t xml:space="preserve">Figure </w:t>
       </w:r>
-      <w:r>
-        <w:fldChar w:fldCharType="begin"/>
-      </w:r>
-      <w:r>
-        <w:instrText xml:space="preserve"> SEQ Figure \* ARABIC </w:instrText>
-      </w:r>
-      <w:r>
-        <w:fldChar w:fldCharType="separate"/>
-      </w:r>
-      <w:r>
-        <w:rPr>
-          <w:noProof/>
-        </w:rPr>
-        <w:t>31</w:t>
-      </w:r>
-      <w:r>
-        <w:fldChar w:fldCharType="end"/>
-      </w:r>
+      <w:fldSimple w:instr=" SEQ Figure \* ARABIC ">
+        <w:r>
+          <w:rPr>
+            <w:noProof/>
+          </w:rPr>
+          <w:t>31</w:t>
+        </w:r>
+      </w:fldSimple>
       <w:r>
         <w:t xml:space="preserve"> </w:t>
       </w:r>
@@ -20365,24 +20052,14 @@
       <w:r>
         <w:t xml:space="preserve">Figure </w:t>
       </w:r>
-      <w:r>
-        <w:fldChar w:fldCharType="begin"/>
-      </w:r>
-      <w:r>
-        <w:instrText xml:space="preserve"> SEQ Figure \* ARABIC </w:instrText>
-      </w:r>
-      <w:r>
-        <w:fldChar w:fldCharType="separate"/>
-      </w:r>
-      <w:r>
-        <w:rPr>
-          <w:noProof/>
-        </w:rPr>
-        <w:t>32</w:t>
-      </w:r>
-      <w:r>
-        <w:fldChar w:fldCharType="end"/>
-      </w:r>
+      <w:fldSimple w:instr=" SEQ Figure \* ARABIC ">
+        <w:r>
+          <w:rPr>
+            <w:noProof/>
+          </w:rPr>
+          <w:t>32</w:t>
+        </w:r>
+      </w:fldSimple>
       <w:r>
         <w:t xml:space="preserve"> </w:t>
       </w:r>
@@ -20513,24 +20190,14 @@
       <w:r>
         <w:t xml:space="preserve">Figure </w:t>
       </w:r>
-      <w:r>
-        <w:fldChar w:fldCharType="begin"/>
-      </w:r>
-      <w:r>
-        <w:instrText xml:space="preserve"> SEQ Figure \* ARABIC </w:instrText>
-      </w:r>
-      <w:r>
-        <w:fldChar w:fldCharType="separate"/>
-      </w:r>
-      <w:r>
-        <w:rPr>
-          <w:noProof/>
-        </w:rPr>
-        <w:t>33</w:t>
-      </w:r>
-      <w:r>
-        <w:fldChar w:fldCharType="end"/>
-      </w:r>
+      <w:fldSimple w:instr=" SEQ Figure \* ARABIC ">
+        <w:r>
+          <w:rPr>
+            <w:noProof/>
+          </w:rPr>
+          <w:t>33</w:t>
+        </w:r>
+      </w:fldSimple>
       <w:r>
         <w:t xml:space="preserve"> Bed Class Diagram</w:t>
       </w:r>
@@ -20660,24 +20327,14 @@
       <w:r>
         <w:t xml:space="preserve">Figure </w:t>
       </w:r>
-      <w:r>
-        <w:fldChar w:fldCharType="begin"/>
-      </w:r>
-      <w:r>
-        <w:instrText xml:space="preserve"> SEQ Figure \* ARABIC </w:instrText>
-      </w:r>
-      <w:r>
-        <w:fldChar w:fldCharType="separate"/>
-      </w:r>
-      <w:r>
-        <w:rPr>
-          <w:noProof/>
-        </w:rPr>
-        <w:t>34</w:t>
-      </w:r>
-      <w:r>
-        <w:fldChar w:fldCharType="end"/>
-      </w:r>
+      <w:fldSimple w:instr=" SEQ Figure \* ARABIC ">
+        <w:r>
+          <w:rPr>
+            <w:noProof/>
+          </w:rPr>
+          <w:t>34</w:t>
+        </w:r>
+      </w:fldSimple>
       <w:r>
         <w:t xml:space="preserve"> </w:t>
       </w:r>
@@ -20847,24 +20504,14 @@
       <w:r>
         <w:t xml:space="preserve">Figure </w:t>
       </w:r>
-      <w:r>
-        <w:fldChar w:fldCharType="begin"/>
-      </w:r>
-      <w:r>
-        <w:instrText xml:space="preserve"> SEQ Figure \* ARABIC </w:instrText>
-      </w:r>
-      <w:r>
-        <w:fldChar w:fldCharType="separate"/>
-      </w:r>
-      <w:r>
-        <w:rPr>
-          <w:noProof/>
-        </w:rPr>
-        <w:t>35</w:t>
-      </w:r>
-      <w:r>
-        <w:fldChar w:fldCharType="end"/>
-      </w:r>
+      <w:fldSimple w:instr=" SEQ Figure \* ARABIC ">
+        <w:r>
+          <w:rPr>
+            <w:noProof/>
+          </w:rPr>
+          <w:t>35</w:t>
+        </w:r>
+      </w:fldSimple>
       <w:r>
         <w:t xml:space="preserve"> </w:t>
       </w:r>
@@ -21625,24 +21272,14 @@
       <w:r>
         <w:t xml:space="preserve">Figure </w:t>
       </w:r>
-      <w:r>
-        <w:fldChar w:fldCharType="begin"/>
-      </w:r>
-      <w:r>
-        <w:instrText xml:space="preserve"> SEQ Figure \* ARABIC </w:instrText>
-      </w:r>
-      <w:r>
-        <w:fldChar w:fldCharType="separate"/>
-      </w:r>
-      <w:r>
-        <w:rPr>
-          <w:noProof/>
-        </w:rPr>
-        <w:t>36</w:t>
-      </w:r>
-      <w:r>
-        <w:fldChar w:fldCharType="end"/>
-      </w:r>
+      <w:fldSimple w:instr=" SEQ Figure \* ARABIC ">
+        <w:r>
+          <w:rPr>
+            <w:noProof/>
+          </w:rPr>
+          <w:t>36</w:t>
+        </w:r>
+      </w:fldSimple>
       <w:r>
         <w:t xml:space="preserve"> </w:t>
       </w:r>
@@ -21793,24 +21430,14 @@
       <w:r>
         <w:t xml:space="preserve">Figure </w:t>
       </w:r>
-      <w:r>
-        <w:fldChar w:fldCharType="begin"/>
-      </w:r>
-      <w:r>
-        <w:instrText xml:space="preserve"> SEQ Figure \* ARABIC </w:instrText>
-      </w:r>
-      <w:r>
-        <w:fldChar w:fldCharType="separate"/>
-      </w:r>
-      <w:r>
-        <w:rPr>
-          <w:noProof/>
-        </w:rPr>
-        <w:t>37</w:t>
-      </w:r>
-      <w:r>
-        <w:fldChar w:fldCharType="end"/>
-      </w:r>
+      <w:fldSimple w:instr=" SEQ Figure \* ARABIC ">
+        <w:r>
+          <w:rPr>
+            <w:noProof/>
+          </w:rPr>
+          <w:t>37</w:t>
+        </w:r>
+      </w:fldSimple>
       <w:r>
         <w:t xml:space="preserve"> User Login Sequence Diagram</w:t>
       </w:r>
@@ -21966,24 +21593,14 @@
       <w:r>
         <w:t xml:space="preserve">Figure </w:t>
       </w:r>
-      <w:r>
-        <w:fldChar w:fldCharType="begin"/>
-      </w:r>
-      <w:r>
-        <w:instrText xml:space="preserve"> SEQ Figure \* ARABIC </w:instrText>
-      </w:r>
-      <w:r>
-        <w:fldChar w:fldCharType="separate"/>
-      </w:r>
-      <w:r>
-        <w:rPr>
-          <w:noProof/>
-        </w:rPr>
-        <w:t>38</w:t>
-      </w:r>
-      <w:r>
-        <w:fldChar w:fldCharType="end"/>
-      </w:r>
+      <w:fldSimple w:instr=" SEQ Figure \* ARABIC ">
+        <w:r>
+          <w:rPr>
+            <w:noProof/>
+          </w:rPr>
+          <w:t>38</w:t>
+        </w:r>
+      </w:fldSimple>
       <w:r>
         <w:t xml:space="preserve"> Forgot Password Sequence Diagram</w:t>
       </w:r>
@@ -22140,24 +21757,14 @@
       <w:r>
         <w:t xml:space="preserve">Figure </w:t>
       </w:r>
-      <w:r>
-        <w:fldChar w:fldCharType="begin"/>
-      </w:r>
-      <w:r>
-        <w:instrText xml:space="preserve"> SEQ Figure \* ARABIC </w:instrText>
-      </w:r>
-      <w:r>
-        <w:fldChar w:fldCharType="separate"/>
-      </w:r>
-      <w:r>
-        <w:rPr>
-          <w:noProof/>
-        </w:rPr>
-        <w:t>39</w:t>
-      </w:r>
-      <w:r>
-        <w:fldChar w:fldCharType="end"/>
-      </w:r>
+      <w:fldSimple w:instr=" SEQ Figure \* ARABIC ">
+        <w:r>
+          <w:rPr>
+            <w:noProof/>
+          </w:rPr>
+          <w:t>39</w:t>
+        </w:r>
+      </w:fldSimple>
       <w:r>
         <w:t xml:space="preserve"> </w:t>
       </w:r>
@@ -22325,24 +21932,14 @@
       <w:r>
         <w:t xml:space="preserve">Figure </w:t>
       </w:r>
-      <w:r>
-        <w:fldChar w:fldCharType="begin"/>
-      </w:r>
-      <w:r>
-        <w:instrText xml:space="preserve"> SEQ Figure \* ARABIC </w:instrText>
-      </w:r>
-      <w:r>
-        <w:fldChar w:fldCharType="separate"/>
-      </w:r>
-      <w:r>
-        <w:rPr>
-          <w:noProof/>
-        </w:rPr>
-        <w:t>40</w:t>
-      </w:r>
-      <w:r>
-        <w:fldChar w:fldCharType="end"/>
-      </w:r>
+      <w:fldSimple w:instr=" SEQ Figure \* ARABIC ">
+        <w:r>
+          <w:rPr>
+            <w:noProof/>
+          </w:rPr>
+          <w:t>40</w:t>
+        </w:r>
+      </w:fldSimple>
       <w:r>
         <w:t xml:space="preserve"> </w:t>
       </w:r>
@@ -22504,24 +22101,14 @@
       <w:r>
         <w:t xml:space="preserve">Figure </w:t>
       </w:r>
-      <w:r>
-        <w:fldChar w:fldCharType="begin"/>
-      </w:r>
-      <w:r>
-        <w:instrText xml:space="preserve"> SEQ Figure \* ARABIC </w:instrText>
-      </w:r>
-      <w:r>
-        <w:fldChar w:fldCharType="separate"/>
-      </w:r>
-      <w:r>
-        <w:rPr>
-          <w:noProof/>
-        </w:rPr>
-        <w:t>41</w:t>
-      </w:r>
-      <w:r>
-        <w:fldChar w:fldCharType="end"/>
-      </w:r>
+      <w:fldSimple w:instr=" SEQ Figure \* ARABIC ">
+        <w:r>
+          <w:rPr>
+            <w:noProof/>
+          </w:rPr>
+          <w:t>41</w:t>
+        </w:r>
+      </w:fldSimple>
       <w:r>
         <w:t xml:space="preserve"> </w:t>
       </w:r>
@@ -22684,24 +22271,14 @@
       <w:r>
         <w:t xml:space="preserve">Figure </w:t>
       </w:r>
-      <w:r>
-        <w:fldChar w:fldCharType="begin"/>
-      </w:r>
-      <w:r>
-        <w:instrText xml:space="preserve"> SEQ Figure \* ARABIC </w:instrText>
-      </w:r>
-      <w:r>
-        <w:fldChar w:fldCharType="separate"/>
-      </w:r>
-      <w:r>
-        <w:rPr>
-          <w:noProof/>
-        </w:rPr>
-        <w:t>42</w:t>
-      </w:r>
-      <w:r>
-        <w:fldChar w:fldCharType="end"/>
-      </w:r>
+      <w:fldSimple w:instr=" SEQ Figure \* ARABIC ">
+        <w:r>
+          <w:rPr>
+            <w:noProof/>
+          </w:rPr>
+          <w:t>42</w:t>
+        </w:r>
+      </w:fldSimple>
       <w:r>
         <w:t xml:space="preserve"> </w:t>
       </w:r>
@@ -22853,24 +22430,14 @@
       <w:r>
         <w:t xml:space="preserve">Figure </w:t>
       </w:r>
-      <w:r>
-        <w:fldChar w:fldCharType="begin"/>
-      </w:r>
-      <w:r>
-        <w:instrText xml:space="preserve"> SEQ Figure \* ARABIC </w:instrText>
-      </w:r>
-      <w:r>
-        <w:fldChar w:fldCharType="separate"/>
-      </w:r>
-      <w:r>
-        <w:rPr>
-          <w:noProof/>
-        </w:rPr>
-        <w:t>43</w:t>
-      </w:r>
-      <w:r>
-        <w:fldChar w:fldCharType="end"/>
-      </w:r>
+      <w:fldSimple w:instr=" SEQ Figure \* ARABIC ">
+        <w:r>
+          <w:rPr>
+            <w:noProof/>
+          </w:rPr>
+          <w:t>43</w:t>
+        </w:r>
+      </w:fldSimple>
       <w:r>
         <w:t xml:space="preserve"> </w:t>
       </w:r>
@@ -23021,24 +22588,14 @@
       <w:r>
         <w:t xml:space="preserve">Figure </w:t>
       </w:r>
-      <w:r>
-        <w:fldChar w:fldCharType="begin"/>
-      </w:r>
-      <w:r>
-        <w:instrText xml:space="preserve"> SEQ Figure \* ARABIC </w:instrText>
-      </w:r>
-      <w:r>
-        <w:fldChar w:fldCharType="separate"/>
-      </w:r>
-      <w:r>
-        <w:rPr>
-          <w:noProof/>
-        </w:rPr>
-        <w:t>44</w:t>
-      </w:r>
-      <w:r>
-        <w:fldChar w:fldCharType="end"/>
-      </w:r>
+      <w:fldSimple w:instr=" SEQ Figure \* ARABIC ">
+        <w:r>
+          <w:rPr>
+            <w:noProof/>
+          </w:rPr>
+          <w:t>44</w:t>
+        </w:r>
+      </w:fldSimple>
       <w:r>
         <w:t xml:space="preserve"> </w:t>
       </w:r>
@@ -23164,24 +22721,14 @@
       <w:r>
         <w:t xml:space="preserve">Figure </w:t>
       </w:r>
-      <w:r>
-        <w:fldChar w:fldCharType="begin"/>
-      </w:r>
-      <w:r>
-        <w:instrText xml:space="preserve"> SEQ Figure \* ARABIC </w:instrText>
-      </w:r>
-      <w:r>
-        <w:fldChar w:fldCharType="separate"/>
-      </w:r>
-      <w:r>
-        <w:rPr>
-          <w:noProof/>
-        </w:rPr>
-        <w:t>45</w:t>
-      </w:r>
-      <w:r>
-        <w:fldChar w:fldCharType="end"/>
-      </w:r>
+      <w:fldSimple w:instr=" SEQ Figure \* ARABIC ">
+        <w:r>
+          <w:rPr>
+            <w:noProof/>
+          </w:rPr>
+          <w:t>45</w:t>
+        </w:r>
+      </w:fldSimple>
       <w:r>
         <w:t xml:space="preserve"> Level 0 Data Flow Diagram (DFD)</w:t>
       </w:r>
@@ -23346,24 +22893,14 @@
       <w:r>
         <w:t xml:space="preserve">Figure </w:t>
       </w:r>
-      <w:r>
-        <w:fldChar w:fldCharType="begin"/>
-      </w:r>
-      <w:r>
-        <w:instrText xml:space="preserve"> SEQ Figure \* ARABIC </w:instrText>
-      </w:r>
-      <w:r>
-        <w:fldChar w:fldCharType="separate"/>
-      </w:r>
-      <w:r>
-        <w:rPr>
-          <w:noProof/>
-        </w:rPr>
-        <w:t>46</w:t>
-      </w:r>
-      <w:r>
-        <w:fldChar w:fldCharType="end"/>
-      </w:r>
+      <w:fldSimple w:instr=" SEQ Figure \* ARABIC ">
+        <w:r>
+          <w:rPr>
+            <w:noProof/>
+          </w:rPr>
+          <w:t>46</w:t>
+        </w:r>
+      </w:fldSimple>
       <w:r>
         <w:t xml:space="preserve"> Level 1 Data Flow Diagram (DFD)</w:t>
       </w:r>
@@ -23604,24 +23141,14 @@
       <w:r>
         <w:t xml:space="preserve">Figure </w:t>
       </w:r>
-      <w:r>
-        <w:fldChar w:fldCharType="begin"/>
-      </w:r>
-      <w:r>
-        <w:instrText xml:space="preserve"> SEQ Figure \* ARABIC </w:instrText>
-      </w:r>
-      <w:r>
-        <w:fldChar w:fldCharType="separate"/>
-      </w:r>
-      <w:r>
-        <w:rPr>
-          <w:noProof/>
-        </w:rPr>
-        <w:t>47</w:t>
-      </w:r>
-      <w:r>
-        <w:fldChar w:fldCharType="end"/>
-      </w:r>
+      <w:fldSimple w:instr=" SEQ Figure \* ARABIC ">
+        <w:r>
+          <w:rPr>
+            <w:noProof/>
+          </w:rPr>
+          <w:t>47</w:t>
+        </w:r>
+      </w:fldSimple>
       <w:r>
         <w:t xml:space="preserve"> </w:t>
       </w:r>
@@ -23732,24 +23259,14 @@
       <w:r>
         <w:t xml:space="preserve">Figure </w:t>
       </w:r>
-      <w:r>
-        <w:fldChar w:fldCharType="begin"/>
-      </w:r>
-      <w:r>
-        <w:instrText xml:space="preserve"> SEQ Figure \* ARABIC </w:instrText>
-      </w:r>
-      <w:r>
-        <w:fldChar w:fldCharType="separate"/>
-      </w:r>
-      <w:r>
-        <w:rPr>
-          <w:noProof/>
-        </w:rPr>
-        <w:t>48</w:t>
-      </w:r>
-      <w:r>
-        <w:fldChar w:fldCharType="end"/>
-      </w:r>
+      <w:fldSimple w:instr=" SEQ Figure \* ARABIC ">
+        <w:r>
+          <w:rPr>
+            <w:noProof/>
+          </w:rPr>
+          <w:t>48</w:t>
+        </w:r>
+      </w:fldSimple>
       <w:r>
         <w:t xml:space="preserve"> </w:t>
       </w:r>
@@ -23860,24 +23377,14 @@
       <w:r>
         <w:t xml:space="preserve">Figure </w:t>
       </w:r>
-      <w:r>
-        <w:fldChar w:fldCharType="begin"/>
-      </w:r>
-      <w:r>
-        <w:instrText xml:space="preserve"> SEQ Figure \* ARABIC </w:instrText>
-      </w:r>
-      <w:r>
-        <w:fldChar w:fldCharType="separate"/>
-      </w:r>
-      <w:r>
-        <w:rPr>
-          <w:noProof/>
-        </w:rPr>
-        <w:t>49</w:t>
-      </w:r>
-      <w:r>
-        <w:fldChar w:fldCharType="end"/>
-      </w:r>
+      <w:fldSimple w:instr=" SEQ Figure \* ARABIC ">
+        <w:r>
+          <w:rPr>
+            <w:noProof/>
+          </w:rPr>
+          <w:t>49</w:t>
+        </w:r>
+      </w:fldSimple>
       <w:r>
         <w:t xml:space="preserve"> Doctors ERD</w:t>
       </w:r>
@@ -23985,24 +23492,14 @@
       <w:r>
         <w:t xml:space="preserve">Figure </w:t>
       </w:r>
-      <w:r>
-        <w:fldChar w:fldCharType="begin"/>
-      </w:r>
-      <w:r>
-        <w:instrText xml:space="preserve"> SEQ Figure \* ARABIC </w:instrText>
-      </w:r>
-      <w:r>
-        <w:fldChar w:fldCharType="separate"/>
-      </w:r>
-      <w:r>
-        <w:rPr>
-          <w:noProof/>
-        </w:rPr>
-        <w:t>50</w:t>
-      </w:r>
-      <w:r>
-        <w:fldChar w:fldCharType="end"/>
-      </w:r>
+      <w:fldSimple w:instr=" SEQ Figure \* ARABIC ">
+        <w:r>
+          <w:rPr>
+            <w:noProof/>
+          </w:rPr>
+          <w:t>50</w:t>
+        </w:r>
+      </w:fldSimple>
       <w:r>
         <w:t xml:space="preserve"> Appointments ERD</w:t>
       </w:r>
@@ -24110,24 +23607,14 @@
       <w:r>
         <w:t xml:space="preserve">Figure </w:t>
       </w:r>
-      <w:r>
-        <w:fldChar w:fldCharType="begin"/>
-      </w:r>
-      <w:r>
-        <w:instrText xml:space="preserve"> SEQ Figure \* ARABIC </w:instrText>
-      </w:r>
-      <w:r>
-        <w:fldChar w:fldCharType="separate"/>
-      </w:r>
-      <w:r>
-        <w:rPr>
-          <w:noProof/>
-        </w:rPr>
-        <w:t>51</w:t>
-      </w:r>
-      <w:r>
-        <w:fldChar w:fldCharType="end"/>
-      </w:r>
+      <w:fldSimple w:instr=" SEQ Figure \* ARABIC ">
+        <w:r>
+          <w:rPr>
+            <w:noProof/>
+          </w:rPr>
+          <w:t>51</w:t>
+        </w:r>
+      </w:fldSimple>
       <w:r>
         <w:t xml:space="preserve"> </w:t>
       </w:r>
@@ -24237,24 +23724,14 @@
       <w:r>
         <w:t xml:space="preserve">Figure </w:t>
       </w:r>
-      <w:r>
-        <w:fldChar w:fldCharType="begin"/>
-      </w:r>
-      <w:r>
-        <w:instrText xml:space="preserve"> SEQ Figure \* ARABIC </w:instrText>
-      </w:r>
-      <w:r>
-        <w:fldChar w:fldCharType="separate"/>
-      </w:r>
-      <w:r>
-        <w:rPr>
-          <w:noProof/>
-        </w:rPr>
-        <w:t>52</w:t>
-      </w:r>
-      <w:r>
-        <w:fldChar w:fldCharType="end"/>
-      </w:r>
+      <w:fldSimple w:instr=" SEQ Figure \* ARABIC ">
+        <w:r>
+          <w:rPr>
+            <w:noProof/>
+          </w:rPr>
+          <w:t>52</w:t>
+        </w:r>
+      </w:fldSimple>
       <w:r>
         <w:t xml:space="preserve"> </w:t>
       </w:r>
@@ -24365,24 +23842,14 @@
       <w:r>
         <w:t xml:space="preserve">Figure </w:t>
       </w:r>
-      <w:r>
-        <w:fldChar w:fldCharType="begin"/>
-      </w:r>
-      <w:r>
-        <w:instrText xml:space="preserve"> SEQ Figure \* ARABIC </w:instrText>
-      </w:r>
-      <w:r>
-        <w:fldChar w:fldCharType="separate"/>
-      </w:r>
-      <w:r>
-        <w:rPr>
-          <w:noProof/>
-        </w:rPr>
-        <w:t>53</w:t>
-      </w:r>
-      <w:r>
-        <w:fldChar w:fldCharType="end"/>
-      </w:r>
+      <w:fldSimple w:instr=" SEQ Figure \* ARABIC ">
+        <w:r>
+          <w:rPr>
+            <w:noProof/>
+          </w:rPr>
+          <w:t>53</w:t>
+        </w:r>
+      </w:fldSimple>
       <w:r>
         <w:t xml:space="preserve"> </w:t>
       </w:r>
@@ -24493,24 +23960,14 @@
       <w:r>
         <w:t xml:space="preserve">Figure </w:t>
       </w:r>
-      <w:r>
-        <w:fldChar w:fldCharType="begin"/>
-      </w:r>
-      <w:r>
-        <w:instrText xml:space="preserve"> SEQ Figure \* ARABIC </w:instrText>
-      </w:r>
-      <w:r>
-        <w:fldChar w:fldCharType="separate"/>
-      </w:r>
-      <w:r>
-        <w:rPr>
-          <w:noProof/>
-        </w:rPr>
-        <w:t>54</w:t>
-      </w:r>
-      <w:r>
-        <w:fldChar w:fldCharType="end"/>
-      </w:r>
+      <w:fldSimple w:instr=" SEQ Figure \* ARABIC ">
+        <w:r>
+          <w:rPr>
+            <w:noProof/>
+          </w:rPr>
+          <w:t>54</w:t>
+        </w:r>
+      </w:fldSimple>
       <w:r>
         <w:t xml:space="preserve"> </w:t>
       </w:r>
@@ -24621,24 +24078,14 @@
       <w:r>
         <w:t xml:space="preserve">Figure </w:t>
       </w:r>
-      <w:r>
-        <w:fldChar w:fldCharType="begin"/>
-      </w:r>
-      <w:r>
-        <w:instrText xml:space="preserve"> SEQ Figure \* ARABIC </w:instrText>
-      </w:r>
-      <w:r>
-        <w:fldChar w:fldCharType="separate"/>
-      </w:r>
-      <w:r>
-        <w:rPr>
-          <w:noProof/>
-        </w:rPr>
-        <w:t>55</w:t>
-      </w:r>
-      <w:r>
-        <w:fldChar w:fldCharType="end"/>
-      </w:r>
+      <w:fldSimple w:instr=" SEQ Figure \* ARABIC ">
+        <w:r>
+          <w:rPr>
+            <w:noProof/>
+          </w:rPr>
+          <w:t>55</w:t>
+        </w:r>
+      </w:fldSimple>
       <w:r>
         <w:t xml:space="preserve"> </w:t>
       </w:r>
@@ -24749,24 +24196,14 @@
       <w:r>
         <w:t xml:space="preserve">Figure </w:t>
       </w:r>
-      <w:r>
-        <w:fldChar w:fldCharType="begin"/>
-      </w:r>
-      <w:r>
-        <w:instrText xml:space="preserve"> SEQ Figure \* ARABIC </w:instrText>
-      </w:r>
-      <w:r>
-        <w:fldChar w:fldCharType="separate"/>
-      </w:r>
-      <w:r>
-        <w:rPr>
-          <w:noProof/>
-        </w:rPr>
-        <w:t>56</w:t>
-      </w:r>
-      <w:r>
-        <w:fldChar w:fldCharType="end"/>
-      </w:r>
+      <w:fldSimple w:instr=" SEQ Figure \* ARABIC ">
+        <w:r>
+          <w:rPr>
+            <w:noProof/>
+          </w:rPr>
+          <w:t>56</w:t>
+        </w:r>
+      </w:fldSimple>
       <w:r>
         <w:t xml:space="preserve"> </w:t>
       </w:r>
@@ -24877,24 +24314,14 @@
       <w:r>
         <w:t xml:space="preserve">Figure </w:t>
       </w:r>
-      <w:r>
-        <w:fldChar w:fldCharType="begin"/>
-      </w:r>
-      <w:r>
-        <w:instrText xml:space="preserve"> SEQ Figure \* ARABIC </w:instrText>
-      </w:r>
-      <w:r>
-        <w:fldChar w:fldCharType="separate"/>
-      </w:r>
-      <w:r>
-        <w:rPr>
-          <w:noProof/>
-        </w:rPr>
-        <w:t>57</w:t>
-      </w:r>
-      <w:r>
-        <w:fldChar w:fldCharType="end"/>
-      </w:r>
+      <w:fldSimple w:instr=" SEQ Figure \* ARABIC ">
+        <w:r>
+          <w:rPr>
+            <w:noProof/>
+          </w:rPr>
+          <w:t>57</w:t>
+        </w:r>
+      </w:fldSimple>
       <w:r>
         <w:t xml:space="preserve"> Departments ERD</w:t>
       </w:r>
@@ -24959,24 +24386,14 @@
       <w:r>
         <w:t xml:space="preserve">Figure </w:t>
       </w:r>
-      <w:r>
-        <w:fldChar w:fldCharType="begin"/>
-      </w:r>
-      <w:r>
-        <w:instrText xml:space="preserve"> SEQ Figure \* ARABIC </w:instrText>
-      </w:r>
-      <w:r>
-        <w:fldChar w:fldCharType="separate"/>
-      </w:r>
-      <w:r>
-        <w:rPr>
-          <w:noProof/>
-        </w:rPr>
-        <w:t>58</w:t>
-      </w:r>
-      <w:r>
-        <w:fldChar w:fldCharType="end"/>
-      </w:r>
+      <w:fldSimple w:instr=" SEQ Figure \* ARABIC ">
+        <w:r>
+          <w:rPr>
+            <w:noProof/>
+          </w:rPr>
+          <w:t>58</w:t>
+        </w:r>
+      </w:fldSimple>
       <w:r>
         <w:t xml:space="preserve"> Wards ERD</w:t>
       </w:r>
@@ -25093,24 +24510,14 @@
       <w:r>
         <w:t xml:space="preserve">Figure </w:t>
       </w:r>
-      <w:r>
-        <w:fldChar w:fldCharType="begin"/>
-      </w:r>
-      <w:r>
-        <w:instrText xml:space="preserve"> SEQ Figure \* ARABIC </w:instrText>
-      </w:r>
-      <w:r>
-        <w:fldChar w:fldCharType="separate"/>
-      </w:r>
-      <w:r>
-        <w:rPr>
-          <w:noProof/>
-        </w:rPr>
-        <w:t>59</w:t>
-      </w:r>
-      <w:r>
-        <w:fldChar w:fldCharType="end"/>
-      </w:r>
+      <w:fldSimple w:instr=" SEQ Figure \* ARABIC ">
+        <w:r>
+          <w:rPr>
+            <w:noProof/>
+          </w:rPr>
+          <w:t>59</w:t>
+        </w:r>
+      </w:fldSimple>
       <w:r>
         <w:t xml:space="preserve"> </w:t>
       </w:r>
@@ -26407,6 +25814,29 @@
         <w:spacing w:before="100" w:beforeAutospacing="1" w:after="100" w:afterAutospacing="1" w:line="240" w:lineRule="auto"/>
         <w:outlineLvl w:val="1"/>
         <w:rPr>
+          <w:rFonts w:asciiTheme="minorBidi" w:eastAsia="Times New Roman" w:hAnsiTheme="minorBidi"/>
+          <w:b/>
+          <w:bCs/>
+          <w:sz w:val="27"/>
+          <w:szCs w:val="27"/>
+        </w:rPr>
+      </w:pPr>
+      <w:r>
+        <w:rPr>
+          <w:rFonts w:asciiTheme="minorBidi" w:eastAsia="Times New Roman" w:hAnsiTheme="minorBidi"/>
+          <w:b/>
+          <w:bCs/>
+          <w:sz w:val="27"/>
+          <w:szCs w:val="27"/>
+        </w:rPr>
+        <w:t>4.4 State-Transition Diagrams (STD)</w:t>
+      </w:r>
+    </w:p>
+    <w:p>
+      <w:pPr>
+        <w:spacing w:before="100" w:beforeAutospacing="1" w:after="100" w:afterAutospacing="1" w:line="240" w:lineRule="auto"/>
+        <w:outlineLvl w:val="1"/>
+        <w:rPr>
           <w:rFonts w:ascii="Arial" w:eastAsia="Times New Roman" w:hAnsi="Arial" w:cs="Times New Roman"/>
           <w:b/>
           <w:sz w:val="24"/>
@@ -26420,15 +25850,659 @@
           <w:sz w:val="24"/>
           <w:szCs w:val="20"/>
         </w:rPr>
-        <w:t>4.4 State-Transition Diagrams (STD)</w:t>
-      </w:r>
-    </w:p>
-    <w:p>
-      <w:pPr>
-        <w:rPr>
+        <w:t>4.4.1 Authentication STD</w:t>
+      </w:r>
+    </w:p>
+    <w:p>
+      <w:pPr>
+        <w:pStyle w:val="font-claude-response-body"/>
+      </w:pPr>
+      <w:r>
+        <w:rPr>
+          <w:rStyle w:val="Strong"/>
+        </w:rPr>
+        <w:t>Description:</w:t>
+      </w:r>
+      <w:r>
+        <w:t xml:space="preserve"> This diagram shows how a user moves through authentication states from login to logout or lockout.</w:t>
+      </w:r>
+    </w:p>
+    <w:p>
+      <w:pPr>
+        <w:keepNext/>
+        <w:jc w:val="center"/>
+      </w:pPr>
+      <w:r>
+        <w:rPr>
+          <w:noProof/>
           <w:u w:val="words"/>
         </w:rPr>
-      </w:pPr>
+        <w:lastRenderedPageBreak/>
+        <w:drawing>
+          <wp:inline distT="0" distB="0" distL="0" distR="0" wp14:anchorId="22C86B11" wp14:editId="030E31AA">
+            <wp:extent cx="1447800" cy="3223260"/>
+            <wp:effectExtent l="0" t="0" r="0" b="0"/>
+            <wp:docPr id="358701693" name="Picture 6"/>
+            <wp:cNvGraphicFramePr>
+              <a:graphicFrameLocks xmlns:a="http://schemas.openxmlformats.org/drawingml/2006/main" noChangeAspect="1"/>
+            </wp:cNvGraphicFramePr>
+            <a:graphic xmlns:a="http://schemas.openxmlformats.org/drawingml/2006/main">
+              <a:graphicData uri="http://schemas.openxmlformats.org/drawingml/2006/picture">
+                <pic:pic xmlns:pic="http://schemas.openxmlformats.org/drawingml/2006/picture">
+                  <pic:nvPicPr>
+                    <pic:cNvPr id="0" name="Picture 2"/>
+                    <pic:cNvPicPr>
+                      <a:picLocks noChangeAspect="1" noChangeArrowheads="1"/>
+                    </pic:cNvPicPr>
+                  </pic:nvPicPr>
+                  <pic:blipFill rotWithShape="1">
+                    <a:blip r:embed="rId70">
+                      <a:extLst>
+                        <a:ext uri="{28A0092B-C50C-407E-A947-70E740481C1C}">
+                          <a14:useLocalDpi xmlns:a14="http://schemas.microsoft.com/office/drawing/2010/main" val="0"/>
+                        </a:ext>
+                      </a:extLst>
+                    </a:blip>
+                    <a:srcRect t="2828" r="24000" b="22438"/>
+                    <a:stretch>
+                      <a:fillRect/>
+                    </a:stretch>
+                  </pic:blipFill>
+                  <pic:spPr bwMode="auto">
+                    <a:xfrm>
+                      <a:off x="0" y="0"/>
+                      <a:ext cx="1447800" cy="3223260"/>
+                    </a:xfrm>
+                    <a:prstGeom prst="rect">
+                      <a:avLst/>
+                    </a:prstGeom>
+                    <a:noFill/>
+                    <a:ln>
+                      <a:noFill/>
+                    </a:ln>
+                    <a:extLst>
+                      <a:ext uri="{53640926-AAD7-44D8-BBD7-CCE9431645EC}">
+                        <a14:shadowObscured xmlns:a14="http://schemas.microsoft.com/office/drawing/2010/main"/>
+                      </a:ext>
+                    </a:extLst>
+                  </pic:spPr>
+                </pic:pic>
+              </a:graphicData>
+            </a:graphic>
+          </wp:inline>
+        </w:drawing>
+      </w:r>
+    </w:p>
+    <w:p>
+      <w:pPr>
+        <w:pStyle w:val="Caption"/>
+        <w:jc w:val="center"/>
+      </w:pPr>
+      <w:r>
+        <w:t xml:space="preserve">Figure </w:t>
+      </w:r>
+      <w:fldSimple w:instr=" SEQ Figure \* ARABIC ">
+        <w:r>
+          <w:rPr>
+            <w:noProof/>
+          </w:rPr>
+          <w:t>60</w:t>
+        </w:r>
+      </w:fldSimple>
+      <w:r>
+        <w:t xml:space="preserve"> </w:t>
+      </w:r>
+      <w:r>
+        <w:t>Authentication STD</w:t>
+      </w:r>
+    </w:p>
+    <w:p>
+      <w:pPr>
+        <w:spacing w:before="100" w:beforeAutospacing="1" w:after="100" w:afterAutospacing="1" w:line="240" w:lineRule="auto"/>
+        <w:outlineLvl w:val="1"/>
+        <w:rPr>
+          <w:rFonts w:ascii="Arial" w:eastAsia="Times New Roman" w:hAnsi="Arial" w:cs="Times New Roman"/>
+          <w:b/>
+          <w:sz w:val="24"/>
+          <w:szCs w:val="20"/>
+        </w:rPr>
+      </w:pPr>
+      <w:r>
+        <w:rPr>
+          <w:rFonts w:ascii="Arial" w:eastAsia="Times New Roman" w:hAnsi="Arial" w:cs="Times New Roman"/>
+          <w:b/>
+          <w:sz w:val="24"/>
+          <w:szCs w:val="20"/>
+        </w:rPr>
+        <w:t>4.4.2 Appointment STD</w:t>
+      </w:r>
+    </w:p>
+    <w:p>
+      <w:pPr>
+        <w:spacing w:before="100" w:beforeAutospacing="1" w:after="100" w:afterAutospacing="1" w:line="240" w:lineRule="auto"/>
+        <w:rPr>
+          <w:rFonts w:ascii="Times New Roman" w:eastAsia="Times New Roman" w:hAnsi="Times New Roman" w:cs="Times New Roman"/>
+          <w:sz w:val="24"/>
+          <w:szCs w:val="24"/>
+        </w:rPr>
+      </w:pPr>
+      <w:r>
+        <w:rPr>
+          <w:rFonts w:ascii="Times New Roman" w:eastAsia="Times New Roman" w:hAnsi="Times New Roman" w:cs="Times New Roman"/>
+          <w:b/>
+          <w:bCs/>
+          <w:sz w:val="24"/>
+          <w:szCs w:val="24"/>
+        </w:rPr>
+        <w:t>Description:</w:t>
+      </w:r>
+      <w:r>
+        <w:rPr>
+          <w:rFonts w:ascii="Times New Roman" w:eastAsia="Times New Roman" w:hAnsi="Times New Roman" w:cs="Times New Roman"/>
+          <w:sz w:val="24"/>
+          <w:szCs w:val="24"/>
+        </w:rPr>
+        <w:t xml:space="preserve"> This diagram shows how an appointment moves from booking through to completion, cancellation, or no-show.</w:t>
+      </w:r>
+    </w:p>
+    <w:p>
+      <w:pPr>
+        <w:keepNext/>
+        <w:jc w:val="center"/>
+      </w:pPr>
+      <w:r>
+        <w:rPr>
+          <w:noProof/>
+        </w:rPr>
+        <w:lastRenderedPageBreak/>
+        <w:drawing>
+          <wp:inline distT="0" distB="0" distL="0" distR="0" wp14:anchorId="62818C72" wp14:editId="77A81F0C">
+            <wp:extent cx="1363980" cy="3177540"/>
+            <wp:effectExtent l="0" t="0" r="0" b="3810"/>
+            <wp:docPr id="210240001" name="Picture 7"/>
+            <wp:cNvGraphicFramePr>
+              <a:graphicFrameLocks xmlns:a="http://schemas.openxmlformats.org/drawingml/2006/main" noChangeAspect="1"/>
+            </wp:cNvGraphicFramePr>
+            <a:graphic xmlns:a="http://schemas.openxmlformats.org/drawingml/2006/main">
+              <a:graphicData uri="http://schemas.openxmlformats.org/drawingml/2006/picture">
+                <pic:pic xmlns:pic="http://schemas.openxmlformats.org/drawingml/2006/picture">
+                  <pic:nvPicPr>
+                    <pic:cNvPr id="0" name="Picture 3"/>
+                    <pic:cNvPicPr>
+                      <a:picLocks noChangeAspect="1" noChangeArrowheads="1"/>
+                    </pic:cNvPicPr>
+                  </pic:nvPicPr>
+                  <pic:blipFill rotWithShape="1">
+                    <a:blip r:embed="rId71">
+                      <a:extLst>
+                        <a:ext uri="{28A0092B-C50C-407E-A947-70E740481C1C}">
+                          <a14:useLocalDpi xmlns:a14="http://schemas.microsoft.com/office/drawing/2010/main" val="0"/>
+                        </a:ext>
+                      </a:extLst>
+                    </a:blip>
+                    <a:srcRect t="2158" r="21834" b="22842"/>
+                    <a:stretch>
+                      <a:fillRect/>
+                    </a:stretch>
+                  </pic:blipFill>
+                  <pic:spPr bwMode="auto">
+                    <a:xfrm>
+                      <a:off x="0" y="0"/>
+                      <a:ext cx="1363980" cy="3177540"/>
+                    </a:xfrm>
+                    <a:prstGeom prst="rect">
+                      <a:avLst/>
+                    </a:prstGeom>
+                    <a:noFill/>
+                    <a:ln>
+                      <a:noFill/>
+                    </a:ln>
+                    <a:extLst>
+                      <a:ext uri="{53640926-AAD7-44D8-BBD7-CCE9431645EC}">
+                        <a14:shadowObscured xmlns:a14="http://schemas.microsoft.com/office/drawing/2010/main"/>
+                      </a:ext>
+                    </a:extLst>
+                  </pic:spPr>
+                </pic:pic>
+              </a:graphicData>
+            </a:graphic>
+          </wp:inline>
+        </w:drawing>
+      </w:r>
+    </w:p>
+    <w:p>
+      <w:pPr>
+        <w:pStyle w:val="Caption"/>
+        <w:jc w:val="center"/>
+      </w:pPr>
+      <w:r>
+        <w:t xml:space="preserve">Figure </w:t>
+      </w:r>
+      <w:fldSimple w:instr=" SEQ Figure \* ARABIC ">
+        <w:r>
+          <w:rPr>
+            <w:noProof/>
+          </w:rPr>
+          <w:t>61</w:t>
+        </w:r>
+      </w:fldSimple>
+      <w:r>
+        <w:t xml:space="preserve"> </w:t>
+      </w:r>
+      <w:r>
+        <w:t>Appointment STD</w:t>
+      </w:r>
+    </w:p>
+    <w:p>
+      <w:pPr>
+        <w:spacing w:before="100" w:beforeAutospacing="1" w:after="100" w:afterAutospacing="1" w:line="240" w:lineRule="auto"/>
+        <w:outlineLvl w:val="1"/>
+        <w:rPr>
+          <w:rFonts w:ascii="Arial" w:eastAsia="Times New Roman" w:hAnsi="Arial" w:cs="Times New Roman"/>
+          <w:b/>
+          <w:sz w:val="24"/>
+          <w:szCs w:val="20"/>
+        </w:rPr>
+      </w:pPr>
+      <w:r>
+        <w:rPr>
+          <w:rFonts w:ascii="Arial" w:eastAsia="Times New Roman" w:hAnsi="Arial" w:cs="Times New Roman"/>
+          <w:b/>
+          <w:sz w:val="24"/>
+          <w:szCs w:val="20"/>
+        </w:rPr>
+        <w:t>4.4.3 Medical Record STD</w:t>
+      </w:r>
+    </w:p>
+    <w:p>
+      <w:pPr>
+        <w:spacing w:before="100" w:beforeAutospacing="1" w:after="100" w:afterAutospacing="1" w:line="240" w:lineRule="auto"/>
+        <w:rPr>
+          <w:rFonts w:ascii="Times New Roman" w:eastAsia="Times New Roman" w:hAnsi="Times New Roman" w:cs="Times New Roman"/>
+          <w:sz w:val="24"/>
+          <w:szCs w:val="24"/>
+        </w:rPr>
+      </w:pPr>
+      <w:r>
+        <w:rPr>
+          <w:rFonts w:ascii="Times New Roman" w:eastAsia="Times New Roman" w:hAnsi="Times New Roman" w:cs="Times New Roman"/>
+          <w:b/>
+          <w:bCs/>
+          <w:sz w:val="24"/>
+          <w:szCs w:val="24"/>
+        </w:rPr>
+        <w:t>Description:</w:t>
+      </w:r>
+      <w:r>
+        <w:rPr>
+          <w:rFonts w:ascii="Times New Roman" w:eastAsia="Times New Roman" w:hAnsi="Times New Roman" w:cs="Times New Roman"/>
+          <w:sz w:val="24"/>
+          <w:szCs w:val="24"/>
+        </w:rPr>
+        <w:t xml:space="preserve"> This diagram shows how a medical record moves from creation through finalization to archiving.</w:t>
+      </w:r>
+    </w:p>
+    <w:p>
+      <w:pPr>
+        <w:keepNext/>
+        <w:jc w:val="center"/>
+      </w:pPr>
+      <w:r>
+        <w:rPr>
+          <w:noProof/>
+        </w:rPr>
+        <w:lastRenderedPageBreak/>
+        <w:drawing>
+          <wp:inline distT="0" distB="0" distL="0" distR="0" wp14:anchorId="7805EC54" wp14:editId="0121260F">
+            <wp:extent cx="1661160" cy="3055620"/>
+            <wp:effectExtent l="0" t="0" r="0" b="0"/>
+            <wp:docPr id="1381726754" name="Picture 8"/>
+            <wp:cNvGraphicFramePr>
+              <a:graphicFrameLocks xmlns:a="http://schemas.openxmlformats.org/drawingml/2006/main" noChangeAspect="1"/>
+            </wp:cNvGraphicFramePr>
+            <a:graphic xmlns:a="http://schemas.openxmlformats.org/drawingml/2006/main">
+              <a:graphicData uri="http://schemas.openxmlformats.org/drawingml/2006/picture">
+                <pic:pic xmlns:pic="http://schemas.openxmlformats.org/drawingml/2006/picture">
+                  <pic:nvPicPr>
+                    <pic:cNvPr id="0" name="Picture 4"/>
+                    <pic:cNvPicPr>
+                      <a:picLocks noChangeAspect="1" noChangeArrowheads="1"/>
+                    </pic:cNvPicPr>
+                  </pic:nvPicPr>
+                  <pic:blipFill rotWithShape="1">
+                    <a:blip r:embed="rId72">
+                      <a:extLst>
+                        <a:ext uri="{28A0092B-C50C-407E-A947-70E740481C1C}">
+                          <a14:useLocalDpi xmlns:a14="http://schemas.microsoft.com/office/drawing/2010/main" val="0"/>
+                        </a:ext>
+                      </a:extLst>
+                    </a:blip>
+                    <a:srcRect t="2956" r="22143" b="22921"/>
+                    <a:stretch>
+                      <a:fillRect/>
+                    </a:stretch>
+                  </pic:blipFill>
+                  <pic:spPr bwMode="auto">
+                    <a:xfrm>
+                      <a:off x="0" y="0"/>
+                      <a:ext cx="1661160" cy="3055620"/>
+                    </a:xfrm>
+                    <a:prstGeom prst="rect">
+                      <a:avLst/>
+                    </a:prstGeom>
+                    <a:noFill/>
+                    <a:ln>
+                      <a:noFill/>
+                    </a:ln>
+                    <a:extLst>
+                      <a:ext uri="{53640926-AAD7-44D8-BBD7-CCE9431645EC}">
+                        <a14:shadowObscured xmlns:a14="http://schemas.microsoft.com/office/drawing/2010/main"/>
+                      </a:ext>
+                    </a:extLst>
+                  </pic:spPr>
+                </pic:pic>
+              </a:graphicData>
+            </a:graphic>
+          </wp:inline>
+        </w:drawing>
+      </w:r>
+    </w:p>
+    <w:p>
+      <w:pPr>
+        <w:pStyle w:val="Caption"/>
+        <w:jc w:val="center"/>
+      </w:pPr>
+      <w:r>
+        <w:t xml:space="preserve">Figure </w:t>
+      </w:r>
+      <w:fldSimple w:instr=" SEQ Figure \* ARABIC ">
+        <w:r>
+          <w:rPr>
+            <w:noProof/>
+          </w:rPr>
+          <w:t>62</w:t>
+        </w:r>
+      </w:fldSimple>
+      <w:r>
+        <w:t xml:space="preserve"> </w:t>
+      </w:r>
+      <w:r>
+        <w:t>Medical Record STD</w:t>
+      </w:r>
+    </w:p>
+    <w:p>
+      <w:pPr>
+        <w:spacing w:before="100" w:beforeAutospacing="1" w:after="100" w:afterAutospacing="1" w:line="240" w:lineRule="auto"/>
+        <w:outlineLvl w:val="1"/>
+        <w:rPr>
+          <w:rFonts w:ascii="Arial" w:eastAsia="Times New Roman" w:hAnsi="Arial" w:cs="Times New Roman"/>
+          <w:b/>
+          <w:sz w:val="24"/>
+          <w:szCs w:val="20"/>
+        </w:rPr>
+      </w:pPr>
+      <w:r>
+        <w:rPr>
+          <w:rFonts w:ascii="Arial" w:eastAsia="Times New Roman" w:hAnsi="Arial" w:cs="Times New Roman"/>
+          <w:b/>
+          <w:sz w:val="24"/>
+          <w:szCs w:val="20"/>
+        </w:rPr>
+        <w:t>4.4.4 Lab Test STD</w:t>
+      </w:r>
+    </w:p>
+    <w:p>
+      <w:pPr>
+        <w:spacing w:before="100" w:beforeAutospacing="1" w:after="100" w:afterAutospacing="1" w:line="240" w:lineRule="auto"/>
+        <w:rPr>
+          <w:rFonts w:ascii="Times New Roman" w:eastAsia="Times New Roman" w:hAnsi="Times New Roman" w:cs="Times New Roman"/>
+          <w:sz w:val="24"/>
+          <w:szCs w:val="24"/>
+        </w:rPr>
+      </w:pPr>
+      <w:r>
+        <w:rPr>
+          <w:rFonts w:ascii="Times New Roman" w:eastAsia="Times New Roman" w:hAnsi="Times New Roman" w:cs="Times New Roman"/>
+          <w:b/>
+          <w:bCs/>
+          <w:sz w:val="24"/>
+          <w:szCs w:val="24"/>
+        </w:rPr>
+        <w:t>Description:</w:t>
+      </w:r>
+      <w:r>
+        <w:rPr>
+          <w:rFonts w:ascii="Times New Roman" w:eastAsia="Times New Roman" w:hAnsi="Times New Roman" w:cs="Times New Roman"/>
+          <w:sz w:val="24"/>
+          <w:szCs w:val="24"/>
+        </w:rPr>
+        <w:t xml:space="preserve"> This diagram shows how a lab test progresses from being ordered by a doctor to being viewed by the patient.</w:t>
+      </w:r>
+    </w:p>
+    <w:p>
+      <w:pPr>
+        <w:keepNext/>
+        <w:jc w:val="center"/>
+      </w:pPr>
+      <w:r>
+        <w:rPr>
+          <w:noProof/>
+        </w:rPr>
+        <w:lastRenderedPageBreak/>
+        <w:drawing>
+          <wp:inline distT="0" distB="0" distL="0" distR="0" wp14:anchorId="06170847" wp14:editId="1E350F3F">
+            <wp:extent cx="1470660" cy="3672840"/>
+            <wp:effectExtent l="0" t="0" r="0" b="3810"/>
+            <wp:docPr id="25772018" name="Picture 9"/>
+            <wp:cNvGraphicFramePr>
+              <a:graphicFrameLocks xmlns:a="http://schemas.openxmlformats.org/drawingml/2006/main" noChangeAspect="1"/>
+            </wp:cNvGraphicFramePr>
+            <a:graphic xmlns:a="http://schemas.openxmlformats.org/drawingml/2006/main">
+              <a:graphicData uri="http://schemas.openxmlformats.org/drawingml/2006/picture">
+                <pic:pic xmlns:pic="http://schemas.openxmlformats.org/drawingml/2006/picture">
+                  <pic:nvPicPr>
+                    <pic:cNvPr id="0" name="Picture 5"/>
+                    <pic:cNvPicPr>
+                      <a:picLocks noChangeAspect="1" noChangeArrowheads="1"/>
+                    </pic:cNvPicPr>
+                  </pic:nvPicPr>
+                  <pic:blipFill rotWithShape="1">
+                    <a:blip r:embed="rId73">
+                      <a:extLst>
+                        <a:ext uri="{28A0092B-C50C-407E-A947-70E740481C1C}">
+                          <a14:useLocalDpi xmlns:a14="http://schemas.microsoft.com/office/drawing/2010/main" val="0"/>
+                        </a:ext>
+                      </a:extLst>
+                    </a:blip>
+                    <a:srcRect t="2323" r="22490" b="23064"/>
+                    <a:stretch>
+                      <a:fillRect/>
+                    </a:stretch>
+                  </pic:blipFill>
+                  <pic:spPr bwMode="auto">
+                    <a:xfrm>
+                      <a:off x="0" y="0"/>
+                      <a:ext cx="1470660" cy="3672840"/>
+                    </a:xfrm>
+                    <a:prstGeom prst="rect">
+                      <a:avLst/>
+                    </a:prstGeom>
+                    <a:noFill/>
+                    <a:ln>
+                      <a:noFill/>
+                    </a:ln>
+                    <a:extLst>
+                      <a:ext uri="{53640926-AAD7-44D8-BBD7-CCE9431645EC}">
+                        <a14:shadowObscured xmlns:a14="http://schemas.microsoft.com/office/drawing/2010/main"/>
+                      </a:ext>
+                    </a:extLst>
+                  </pic:spPr>
+                </pic:pic>
+              </a:graphicData>
+            </a:graphic>
+          </wp:inline>
+        </w:drawing>
+      </w:r>
+    </w:p>
+    <w:p>
+      <w:pPr>
+        <w:pStyle w:val="Caption"/>
+        <w:jc w:val="center"/>
+      </w:pPr>
+      <w:r>
+        <w:t xml:space="preserve">Figure </w:t>
+      </w:r>
+      <w:fldSimple w:instr=" SEQ Figure \* ARABIC ">
+        <w:r>
+          <w:rPr>
+            <w:noProof/>
+          </w:rPr>
+          <w:t>63</w:t>
+        </w:r>
+      </w:fldSimple>
+      <w:r>
+        <w:t xml:space="preserve"> </w:t>
+      </w:r>
+      <w:r>
+        <w:t>Lab Test STD</w:t>
+      </w:r>
+    </w:p>
+    <w:p>
+      <w:pPr>
+        <w:spacing w:before="100" w:beforeAutospacing="1" w:after="100" w:afterAutospacing="1" w:line="240" w:lineRule="auto"/>
+        <w:outlineLvl w:val="1"/>
+        <w:rPr>
+          <w:rFonts w:ascii="Arial" w:eastAsia="Times New Roman" w:hAnsi="Arial" w:cs="Times New Roman"/>
+          <w:b/>
+          <w:sz w:val="24"/>
+          <w:szCs w:val="20"/>
+        </w:rPr>
+      </w:pPr>
+      <w:r>
+        <w:rPr>
+          <w:rFonts w:ascii="Arial" w:eastAsia="Times New Roman" w:hAnsi="Arial" w:cs="Times New Roman"/>
+          <w:b/>
+          <w:sz w:val="24"/>
+          <w:szCs w:val="20"/>
+        </w:rPr>
+        <w:t>4.4.5 Invoice STD</w:t>
+      </w:r>
+    </w:p>
+    <w:p>
+      <w:pPr>
+        <w:spacing w:before="100" w:beforeAutospacing="1" w:after="100" w:afterAutospacing="1" w:line="240" w:lineRule="auto"/>
+        <w:rPr>
+          <w:rFonts w:ascii="Times New Roman" w:eastAsia="Times New Roman" w:hAnsi="Times New Roman" w:cs="Times New Roman"/>
+          <w:sz w:val="24"/>
+          <w:szCs w:val="24"/>
+        </w:rPr>
+      </w:pPr>
+      <w:r>
+        <w:rPr>
+          <w:rFonts w:ascii="Times New Roman" w:eastAsia="Times New Roman" w:hAnsi="Times New Roman" w:cs="Times New Roman"/>
+          <w:b/>
+          <w:bCs/>
+          <w:sz w:val="24"/>
+          <w:szCs w:val="24"/>
+        </w:rPr>
+        <w:t>Description:</w:t>
+      </w:r>
+      <w:r>
+        <w:rPr>
+          <w:rFonts w:ascii="Times New Roman" w:eastAsia="Times New Roman" w:hAnsi="Times New Roman" w:cs="Times New Roman"/>
+          <w:sz w:val="24"/>
+          <w:szCs w:val="24"/>
+        </w:rPr>
+        <w:t xml:space="preserve"> This diagram shows how an invoice moves from draft through payment or dispute to closure.</w:t>
+      </w:r>
+    </w:p>
+    <w:p>
+      <w:pPr>
+        <w:keepNext/>
+        <w:jc w:val="center"/>
+      </w:pPr>
+      <w:r>
+        <w:rPr>
+          <w:noProof/>
+        </w:rPr>
+        <w:lastRenderedPageBreak/>
+        <w:drawing>
+          <wp:inline distT="0" distB="0" distL="0" distR="0" wp14:anchorId="565EC373" wp14:editId="3F029345">
+            <wp:extent cx="1554480" cy="3474720"/>
+            <wp:effectExtent l="0" t="0" r="0" b="0"/>
+            <wp:docPr id="118177382" name="Picture 10"/>
+            <wp:cNvGraphicFramePr>
+              <a:graphicFrameLocks xmlns:a="http://schemas.openxmlformats.org/drawingml/2006/main" noChangeAspect="1"/>
+            </wp:cNvGraphicFramePr>
+            <a:graphic xmlns:a="http://schemas.openxmlformats.org/drawingml/2006/main">
+              <a:graphicData uri="http://schemas.openxmlformats.org/drawingml/2006/picture">
+                <pic:pic xmlns:pic="http://schemas.openxmlformats.org/drawingml/2006/picture">
+                  <pic:nvPicPr>
+                    <pic:cNvPr id="0" name="Picture 6"/>
+                    <pic:cNvPicPr>
+                      <a:picLocks noChangeAspect="1" noChangeArrowheads="1"/>
+                    </pic:cNvPicPr>
+                  </pic:nvPicPr>
+                  <pic:blipFill rotWithShape="1">
+                    <a:blip r:embed="rId74">
+                      <a:extLst>
+                        <a:ext uri="{28A0092B-C50C-407E-A947-70E740481C1C}">
+                          <a14:useLocalDpi xmlns:a14="http://schemas.microsoft.com/office/drawing/2010/main" val="0"/>
+                        </a:ext>
+                      </a:extLst>
+                    </a:blip>
+                    <a:srcRect t="1964" r="19368" b="23405"/>
+                    <a:stretch>
+                      <a:fillRect/>
+                    </a:stretch>
+                  </pic:blipFill>
+                  <pic:spPr bwMode="auto">
+                    <a:xfrm>
+                      <a:off x="0" y="0"/>
+                      <a:ext cx="1554480" cy="3474720"/>
+                    </a:xfrm>
+                    <a:prstGeom prst="rect">
+                      <a:avLst/>
+                    </a:prstGeom>
+                    <a:noFill/>
+                    <a:ln>
+                      <a:noFill/>
+                    </a:ln>
+                    <a:extLst>
+                      <a:ext uri="{53640926-AAD7-44D8-BBD7-CCE9431645EC}">
+                        <a14:shadowObscured xmlns:a14="http://schemas.microsoft.com/office/drawing/2010/main"/>
+                      </a:ext>
+                    </a:extLst>
+                  </pic:spPr>
+                </pic:pic>
+              </a:graphicData>
+            </a:graphic>
+          </wp:inline>
+        </w:drawing>
+      </w:r>
+    </w:p>
+    <w:p>
+      <w:pPr>
+        <w:pStyle w:val="Caption"/>
+        <w:jc w:val="center"/>
+      </w:pPr>
+      <w:r>
+        <w:t xml:space="preserve">Figure </w:t>
+      </w:r>
+      <w:fldSimple w:instr=" SEQ Figure \* ARABIC ">
+        <w:r>
+          <w:rPr>
+            <w:noProof/>
+          </w:rPr>
+          <w:t>64</w:t>
+        </w:r>
+      </w:fldSimple>
+      <w:r>
+        <w:t xml:space="preserve"> </w:t>
+      </w:r>
+      <w:r>
+        <w:t>Invoice STD</w:t>
+      </w:r>
     </w:p>
     <w:p>
       <w:pPr>
@@ -26485,19 +26559,7 @@
         <w:rPr>
           <w:rStyle w:val="Strong"/>
         </w:rPr>
-        <w:t xml:space="preserve">Topic 1 </w:t>
-      </w:r>
-      <w:r>
-        <w:rPr>
-          <w:rStyle w:val="Strong"/>
-        </w:rPr>
-        <w:t>-</w:t>
-      </w:r>
-      <w:r>
-        <w:rPr>
-          <w:rStyle w:val="Strong"/>
-        </w:rPr>
-        <w:t xml:space="preserve"> Existing Hospital Management Systems</w:t>
+        <w:t>Topic 1 - Existing Hospital Management Systems</w:t>
       </w:r>
       <w:r>
         <w:t xml:space="preserve"> A review of existing HMS solutions such as OpenMRS, Meditech, and Epic revealed common functional gaps including poor usability for non-technical staff, lack of integrated billing with clinical records, and limited patient-facing portals. HMS is designed to address these gaps with a unified and role-specific interface.</w:t>
@@ -26512,19 +26574,7 @@
         <w:rPr>
           <w:rStyle w:val="Strong"/>
         </w:rPr>
-        <w:t xml:space="preserve">Topic 2 </w:t>
-      </w:r>
-      <w:r>
-        <w:rPr>
-          <w:rStyle w:val="Strong"/>
-        </w:rPr>
-        <w:t xml:space="preserve">- </w:t>
-      </w:r>
-      <w:r>
-        <w:rPr>
-          <w:rStyle w:val="Strong"/>
-        </w:rPr>
-        <w:t>Healthcare Data Privacy Regulations</w:t>
+        <w:t>Topic 2 - Healthcare Data Privacy Regulations</w:t>
       </w:r>
       <w:r>
         <w:t xml:space="preserve"> Patient data in digital systems is governed by strict privacy regulations. Depending on the region of deployment, the system must comply with laws such as GDPR in Europe or HIPAA in the United States. These regulations mandate encrypted storage, access control, audit logs, and the right of patients to request data deletion.</w:t>
@@ -26539,26 +26589,10 @@
         <w:rPr>
           <w:rStyle w:val="Strong"/>
         </w:rPr>
-        <w:t xml:space="preserve">Topic 3 </w:t>
-      </w:r>
-      <w:r>
-        <w:rPr>
-          <w:rStyle w:val="Strong"/>
-        </w:rPr>
-        <w:t>-</w:t>
-      </w:r>
-      <w:r>
-        <w:rPr>
-          <w:rStyle w:val="Strong"/>
-        </w:rPr>
-        <w:t xml:space="preserve"> Electronic Medical Record Design Best Practices</w:t>
-      </w:r>
-      <w:r>
-        <w:t xml:space="preserve"> Research into EMR design highlights the importance of structured data entry, chronological record display, and fast </w:t>
-      </w:r>
-      <w:r>
-        <w:lastRenderedPageBreak/>
-        <w:t>retrieval. Records must be immutable once finalized to maintain clinical integrity, with only authorized amendments permitted through a tracked update mechanism.</w:t>
+        <w:t>Topic 3 - Electronic Medical Record Design Best Practices</w:t>
+      </w:r>
+      <w:r>
+        <w:t xml:space="preserve"> Research into EMR design highlights the importance of structured data entry, chronological record display, and fast retrieval. Records must be immutable once finalized to maintain clinical integrity, with only authorized amendments permitted through a tracked update mechanism.</w:t>
       </w:r>
     </w:p>
     <w:p>
@@ -26570,19 +26604,8 @@
         <w:rPr>
           <w:rStyle w:val="Strong"/>
         </w:rPr>
-        <w:t xml:space="preserve">Topic 4 </w:t>
-      </w:r>
-      <w:r>
-        <w:rPr>
-          <w:rStyle w:val="Strong"/>
-        </w:rPr>
-        <w:t>-</w:t>
-      </w:r>
-      <w:r>
-        <w:rPr>
-          <w:rStyle w:val="Strong"/>
-        </w:rPr>
-        <w:t xml:space="preserve"> Relational Database Design for Healthcare</w:t>
+        <w:lastRenderedPageBreak/>
+        <w:t>Topic 4 - Relational Database Design for Healthcare</w:t>
       </w:r>
       <w:r>
         <w:t xml:space="preserve"> Healthcare databases require careful normalization to avoid redundancy while maintaining fast query performance. Key design patterns include separating user identity from role-specific data, using foreign keys to maintain referential integrity, and indexing frequently queried fields such as patientID and appointmentDate.</w:t>
@@ -26911,7 +26934,6 @@
         <w:rPr>
           <w:rStyle w:val="Strong"/>
         </w:rPr>
-        <w:lastRenderedPageBreak/>
         <w:t>Appointments Table</w:t>
       </w:r>
     </w:p>
@@ -26924,6 +26946,7 @@
         </w:numPr>
       </w:pPr>
       <w:r>
+        <w:lastRenderedPageBreak/>
         <w:t>appointmentID: UUID, Primary Key</w:t>
       </w:r>
     </w:p>
@@ -27328,7 +27351,6 @@
         </w:numPr>
       </w:pPr>
       <w:r>
-        <w:lastRenderedPageBreak/>
         <w:t>invoiceID: UUID, Primary Key</w:t>
       </w:r>
     </w:p>
@@ -27353,6 +27375,7 @@
         </w:numPr>
       </w:pPr>
       <w:r>
+        <w:lastRenderedPageBreak/>
         <w:t>consultationFee: DECIMAL(10,2)</w:t>
       </w:r>
     </w:p>
@@ -27602,7 +27625,7 @@
       </w:pPr>
     </w:p>
     <w:sectPr>
-      <w:footerReference w:type="default" r:id="rId70"/>
+      <w:footerReference w:type="default" r:id="rId75"/>
       <w:pgSz w:w="12240" w:h="15840"/>
       <w:pgMar w:top="1440" w:right="1440" w:bottom="1440" w:left="1440" w:header="720" w:footer="720" w:gutter="0"/>
       <w:pgNumType w:start="1"/>

</xml_diff>

<commit_message>
fixed use cases and updated diagrams in SRS & SDD
</commit_message>
<xml_diff>
--- a/adil/#48 SRS Hospital System Adil Arshad.docx
+++ b/adil/#48 SRS Hospital System Adil Arshad.docx
@@ -9318,10 +9318,10 @@
           <w:noProof/>
         </w:rPr>
         <w:drawing>
-          <wp:inline distT="0" distB="0" distL="0" distR="0" wp14:anchorId="48B1C5D5" wp14:editId="5D045542">
-            <wp:extent cx="2072640" cy="1021080"/>
-            <wp:effectExtent l="0" t="0" r="3810" b="7620"/>
-            <wp:docPr id="67968770" name="Picture 31"/>
+          <wp:inline distT="0" distB="0" distL="0" distR="0" wp14:anchorId="0FD264A0" wp14:editId="0794A420">
+            <wp:extent cx="2849880" cy="1562100"/>
+            <wp:effectExtent l="0" t="0" r="0" b="0"/>
+            <wp:docPr id="1383994923" name="Picture 7"/>
             <wp:cNvGraphicFramePr>
               <a:graphicFrameLocks xmlns:a="http://schemas.openxmlformats.org/drawingml/2006/main" noChangeAspect="1"/>
             </wp:cNvGraphicFramePr>
@@ -9329,12 +9329,12 @@
               <a:graphicData uri="http://schemas.openxmlformats.org/drawingml/2006/picture">
                 <pic:pic xmlns:pic="http://schemas.openxmlformats.org/drawingml/2006/picture">
                   <pic:nvPicPr>
-                    <pic:cNvPr id="0" name="Picture 57"/>
+                    <pic:cNvPr id="0" name="Picture 3"/>
                     <pic:cNvPicPr>
                       <a:picLocks noChangeAspect="1" noChangeArrowheads="1"/>
                     </pic:cNvPicPr>
                   </pic:nvPicPr>
-                  <pic:blipFill rotWithShape="1">
+                  <pic:blipFill>
                     <a:blip r:embed="rId11">
                       <a:extLst>
                         <a:ext uri="{28A0092B-C50C-407E-A947-70E740481C1C}">
@@ -9342,7 +9342,7 @@
                         </a:ext>
                       </a:extLst>
                     </a:blip>
-                    <a:srcRect l="3958" t="6829" r="24275" b="27805"/>
+                    <a:srcRect/>
                     <a:stretch>
                       <a:fillRect/>
                     </a:stretch>
@@ -9350,7 +9350,441 @@
                   <pic:spPr bwMode="auto">
                     <a:xfrm>
                       <a:off x="0" y="0"/>
-                      <a:ext cx="2072640" cy="1021080"/>
+                      <a:ext cx="2849880" cy="1562100"/>
+                    </a:xfrm>
+                    <a:prstGeom prst="rect">
+                      <a:avLst/>
+                    </a:prstGeom>
+                    <a:noFill/>
+                    <a:ln>
+                      <a:noFill/>
+                    </a:ln>
+                  </pic:spPr>
+                </pic:pic>
+              </a:graphicData>
+            </a:graphic>
+          </wp:inline>
+        </w:drawing>
+      </w:r>
+    </w:p>
+    <w:p>
+      <w:pPr>
+        <w:pStyle w:val="Caption"/>
+        <w:jc w:val="center"/>
+      </w:pPr>
+      <w:r>
+        <w:t xml:space="preserve">Figure </w:t>
+      </w:r>
+      <w:fldSimple w:instr=" SEQ Figure \* ARABIC ">
+        <w:r>
+          <w:rPr>
+            <w:noProof/>
+          </w:rPr>
+          <w:t>1</w:t>
+        </w:r>
+      </w:fldSimple>
+      <w:r>
+        <w:t xml:space="preserve"> </w:t>
+      </w:r>
+      <w:r>
+        <w:t>User Registration</w:t>
+      </w:r>
+      <w:r>
+        <w:t xml:space="preserve"> Use Case Diagram</w:t>
+      </w:r>
+    </w:p>
+    <w:p>
+      <w:pPr>
+        <w:pStyle w:val="NormalWeb"/>
+      </w:pPr>
+      <w:r>
+        <w:rPr>
+          <w:b/>
+          <w:bCs/>
+        </w:rPr>
+        <w:t>UC-102: Login and Logout</w:t>
+      </w:r>
+      <w:r>
+        <w:br/>
+      </w:r>
+    </w:p>
+    <w:tbl>
+      <w:tblPr>
+        <w:tblStyle w:val="TableGrid"/>
+        <w:tblW w:w="0" w:type="auto"/>
+        <w:tblLook w:val="04A0" w:firstRow="1" w:lastRow="0" w:firstColumn="1" w:lastColumn="0" w:noHBand="0" w:noVBand="1"/>
+      </w:tblPr>
+      <w:tblGrid>
+        <w:gridCol w:w="4675"/>
+        <w:gridCol w:w="4675"/>
+      </w:tblGrid>
+      <w:tr>
+        <w:tc>
+          <w:tcPr>
+            <w:tcW w:w="4675" w:type="dxa"/>
+            <w:vAlign w:val="center"/>
+          </w:tcPr>
+          <w:p>
+            <w:pPr>
+              <w:pStyle w:val="NormalWeb"/>
+            </w:pPr>
+            <w:r>
+              <w:rPr>
+                <w:b/>
+                <w:bCs/>
+              </w:rPr>
+              <w:t>Field</w:t>
+            </w:r>
+          </w:p>
+        </w:tc>
+        <w:tc>
+          <w:tcPr>
+            <w:tcW w:w="4675" w:type="dxa"/>
+            <w:vAlign w:val="center"/>
+          </w:tcPr>
+          <w:p>
+            <w:pPr>
+              <w:pStyle w:val="NormalWeb"/>
+            </w:pPr>
+            <w:r>
+              <w:rPr>
+                <w:b/>
+                <w:bCs/>
+              </w:rPr>
+              <w:t>Details</w:t>
+            </w:r>
+          </w:p>
+        </w:tc>
+      </w:tr>
+      <w:tr>
+        <w:tc>
+          <w:tcPr>
+            <w:tcW w:w="4675" w:type="dxa"/>
+            <w:vAlign w:val="center"/>
+          </w:tcPr>
+          <w:p>
+            <w:pPr>
+              <w:pStyle w:val="NormalWeb"/>
+            </w:pPr>
+            <w:r>
+              <w:t>Use Case ID</w:t>
+            </w:r>
+          </w:p>
+        </w:tc>
+        <w:tc>
+          <w:tcPr>
+            <w:tcW w:w="4675" w:type="dxa"/>
+            <w:vAlign w:val="center"/>
+          </w:tcPr>
+          <w:p>
+            <w:pPr>
+              <w:pStyle w:val="NormalWeb"/>
+            </w:pPr>
+            <w:r>
+              <w:t>UC-102</w:t>
+            </w:r>
+          </w:p>
+        </w:tc>
+      </w:tr>
+      <w:tr>
+        <w:tc>
+          <w:tcPr>
+            <w:tcW w:w="4675" w:type="dxa"/>
+            <w:vAlign w:val="center"/>
+          </w:tcPr>
+          <w:p>
+            <w:pPr>
+              <w:pStyle w:val="NormalWeb"/>
+            </w:pPr>
+            <w:r>
+              <w:t>Use Case Name</w:t>
+            </w:r>
+          </w:p>
+        </w:tc>
+        <w:tc>
+          <w:tcPr>
+            <w:tcW w:w="4675" w:type="dxa"/>
+            <w:vAlign w:val="center"/>
+          </w:tcPr>
+          <w:p>
+            <w:pPr>
+              <w:pStyle w:val="NormalWeb"/>
+            </w:pPr>
+            <w:r>
+              <w:t>Login and Logout</w:t>
+            </w:r>
+          </w:p>
+        </w:tc>
+      </w:tr>
+      <w:tr>
+        <w:tc>
+          <w:tcPr>
+            <w:tcW w:w="4675" w:type="dxa"/>
+            <w:vAlign w:val="center"/>
+          </w:tcPr>
+          <w:p>
+            <w:pPr>
+              <w:pStyle w:val="NormalWeb"/>
+            </w:pPr>
+            <w:r>
+              <w:t>Actors</w:t>
+            </w:r>
+          </w:p>
+        </w:tc>
+        <w:tc>
+          <w:tcPr>
+            <w:tcW w:w="4675" w:type="dxa"/>
+            <w:vAlign w:val="center"/>
+          </w:tcPr>
+          <w:p>
+            <w:pPr>
+              <w:pStyle w:val="NormalWeb"/>
+            </w:pPr>
+            <w:r>
+              <w:t>Patient, Doctor, Nurse, Admin</w:t>
+            </w:r>
+          </w:p>
+        </w:tc>
+      </w:tr>
+      <w:tr>
+        <w:tc>
+          <w:tcPr>
+            <w:tcW w:w="4675" w:type="dxa"/>
+            <w:vAlign w:val="center"/>
+          </w:tcPr>
+          <w:p>
+            <w:pPr>
+              <w:pStyle w:val="NormalWeb"/>
+            </w:pPr>
+            <w:r>
+              <w:t>Description</w:t>
+            </w:r>
+          </w:p>
+        </w:tc>
+        <w:tc>
+          <w:tcPr>
+            <w:tcW w:w="4675" w:type="dxa"/>
+            <w:vAlign w:val="center"/>
+          </w:tcPr>
+          <w:p>
+            <w:pPr>
+              <w:pStyle w:val="NormalWeb"/>
+            </w:pPr>
+            <w:r>
+              <w:t>Allows registered users to securely access and exit their dashboards.</w:t>
+            </w:r>
+          </w:p>
+        </w:tc>
+      </w:tr>
+      <w:tr>
+        <w:tc>
+          <w:tcPr>
+            <w:tcW w:w="4675" w:type="dxa"/>
+            <w:vAlign w:val="center"/>
+          </w:tcPr>
+          <w:p>
+            <w:pPr>
+              <w:pStyle w:val="NormalWeb"/>
+            </w:pPr>
+            <w:r>
+              <w:t>Preconditions</w:t>
+            </w:r>
+          </w:p>
+        </w:tc>
+        <w:tc>
+          <w:tcPr>
+            <w:tcW w:w="4675" w:type="dxa"/>
+            <w:vAlign w:val="center"/>
+          </w:tcPr>
+          <w:p>
+            <w:pPr>
+              <w:pStyle w:val="NormalWeb"/>
+            </w:pPr>
+            <w:r>
+              <w:t>User must be registered and verified.</w:t>
+            </w:r>
+          </w:p>
+        </w:tc>
+      </w:tr>
+      <w:tr>
+        <w:tc>
+          <w:tcPr>
+            <w:tcW w:w="4675" w:type="dxa"/>
+            <w:vAlign w:val="center"/>
+          </w:tcPr>
+          <w:p>
+            <w:pPr>
+              <w:pStyle w:val="NormalWeb"/>
+            </w:pPr>
+            <w:r>
+              <w:t>Basic Flow</w:t>
+            </w:r>
+          </w:p>
+        </w:tc>
+        <w:tc>
+          <w:tcPr>
+            <w:tcW w:w="4675" w:type="dxa"/>
+            <w:vAlign w:val="center"/>
+          </w:tcPr>
+          <w:p>
+            <w:pPr>
+              <w:pStyle w:val="NormalWeb"/>
+            </w:pPr>
+            <w:r>
+              <w:t xml:space="preserve">1. User enters credentials. </w:t>
+            </w:r>
+            <w:r>
+              <w:br/>
+              <w:t xml:space="preserve">2. System validates. </w:t>
+            </w:r>
+            <w:r>
+              <w:br/>
+            </w:r>
+            <w:r>
+              <w:lastRenderedPageBreak/>
+              <w:t xml:space="preserve">3. Redirects to role-specific dashboard. </w:t>
+            </w:r>
+            <w:r>
+              <w:br/>
+              <w:t>4. Logout ends session.</w:t>
+            </w:r>
+          </w:p>
+        </w:tc>
+      </w:tr>
+      <w:tr>
+        <w:tc>
+          <w:tcPr>
+            <w:tcW w:w="4675" w:type="dxa"/>
+            <w:vAlign w:val="center"/>
+          </w:tcPr>
+          <w:p>
+            <w:pPr>
+              <w:pStyle w:val="NormalWeb"/>
+            </w:pPr>
+            <w:r>
+              <w:lastRenderedPageBreak/>
+              <w:t>Alternate Flow</w:t>
+            </w:r>
+          </w:p>
+        </w:tc>
+        <w:tc>
+          <w:tcPr>
+            <w:tcW w:w="4675" w:type="dxa"/>
+            <w:vAlign w:val="center"/>
+          </w:tcPr>
+          <w:p>
+            <w:pPr>
+              <w:pStyle w:val="NormalWeb"/>
+            </w:pPr>
+            <w:r>
+              <w:t>Invalid credentials → Error message displayed.</w:t>
+            </w:r>
+          </w:p>
+        </w:tc>
+      </w:tr>
+      <w:tr>
+        <w:tc>
+          <w:tcPr>
+            <w:tcW w:w="4675" w:type="dxa"/>
+            <w:vAlign w:val="center"/>
+          </w:tcPr>
+          <w:p>
+            <w:pPr>
+              <w:pStyle w:val="NormalWeb"/>
+            </w:pPr>
+            <w:r>
+              <w:t>Postconditions</w:t>
+            </w:r>
+          </w:p>
+        </w:tc>
+        <w:tc>
+          <w:tcPr>
+            <w:tcW w:w="4675" w:type="dxa"/>
+            <w:vAlign w:val="center"/>
+          </w:tcPr>
+          <w:p>
+            <w:pPr>
+              <w:pStyle w:val="NormalWeb"/>
+            </w:pPr>
+            <w:r>
+              <w:t>Session created or terminated.</w:t>
+            </w:r>
+          </w:p>
+        </w:tc>
+      </w:tr>
+    </w:tbl>
+    <w:p>
+      <w:pPr>
+        <w:pStyle w:val="NormalWeb"/>
+        <w:rPr>
+          <w:b/>
+          <w:bCs/>
+        </w:rPr>
+      </w:pPr>
+    </w:p>
+    <w:p>
+      <w:pPr>
+        <w:rPr>
+          <w:rFonts w:ascii="Times New Roman" w:eastAsia="Times New Roman" w:hAnsi="Times New Roman" w:cs="Times New Roman"/>
+          <w:b/>
+          <w:bCs/>
+          <w:sz w:val="24"/>
+          <w:szCs w:val="24"/>
+        </w:rPr>
+      </w:pPr>
+      <w:r>
+        <w:rPr>
+          <w:b/>
+          <w:bCs/>
+        </w:rPr>
+        <w:br w:type="page"/>
+      </w:r>
+    </w:p>
+    <w:p>
+      <w:pPr>
+        <w:pStyle w:val="NormalWeb"/>
+        <w:keepNext/>
+        <w:jc w:val="center"/>
+      </w:pPr>
+      <w:r>
+        <w:rPr>
+          <w:noProof/>
+        </w:rPr>
+        <w:lastRenderedPageBreak/>
+        <w:drawing>
+          <wp:inline distT="0" distB="0" distL="0" distR="0" wp14:anchorId="17D8007C" wp14:editId="502D4312">
+            <wp:extent cx="3855720" cy="2499360"/>
+            <wp:effectExtent l="0" t="0" r="0" b="0"/>
+            <wp:docPr id="728067042" name="Picture 9"/>
+            <wp:cNvGraphicFramePr>
+              <a:graphicFrameLocks xmlns:a="http://schemas.openxmlformats.org/drawingml/2006/main" noChangeAspect="1"/>
+            </wp:cNvGraphicFramePr>
+            <a:graphic xmlns:a="http://schemas.openxmlformats.org/drawingml/2006/main">
+              <a:graphicData uri="http://schemas.openxmlformats.org/drawingml/2006/picture">
+                <pic:pic xmlns:pic="http://schemas.openxmlformats.org/drawingml/2006/picture">
+                  <pic:nvPicPr>
+                    <pic:cNvPr id="0" name="Picture 5"/>
+                    <pic:cNvPicPr>
+                      <a:picLocks noChangeAspect="1" noChangeArrowheads="1"/>
+                    </pic:cNvPicPr>
+                  </pic:nvPicPr>
+                  <pic:blipFill rotWithShape="1">
+                    <a:blip r:embed="rId12">
+                      <a:extLst>
+                        <a:ext uri="{28A0092B-C50C-407E-A947-70E740481C1C}">
+                          <a14:useLocalDpi xmlns:a14="http://schemas.microsoft.com/office/drawing/2010/main" val="0"/>
+                        </a:ext>
+                      </a:extLst>
+                    </a:blip>
+                    <a:srcRect r="22748" b="22641"/>
+                    <a:stretch>
+                      <a:fillRect/>
+                    </a:stretch>
+                  </pic:blipFill>
+                  <pic:spPr bwMode="auto">
+                    <a:xfrm>
+                      <a:off x="0" y="0"/>
+                      <a:ext cx="3855720" cy="2499360"/>
                     </a:xfrm>
                     <a:prstGeom prst="rect">
                       <a:avLst/>
@@ -9376,6 +9810,10 @@
       <w:pPr>
         <w:pStyle w:val="Caption"/>
         <w:jc w:val="center"/>
+        <w:rPr>
+          <w:b/>
+          <w:bCs/>
+        </w:rPr>
       </w:pPr>
       <w:r>
         <w:t xml:space="preserve">Figure </w:t>
@@ -9385,17 +9823,11 @@
           <w:rPr>
             <w:noProof/>
           </w:rPr>
-          <w:t>1</w:t>
+          <w:t>2</w:t>
         </w:r>
       </w:fldSimple>
       <w:r>
-        <w:t xml:space="preserve"> </w:t>
-      </w:r>
-      <w:r>
-        <w:t>User Registration</w:t>
-      </w:r>
-      <w:r>
-        <w:t xml:space="preserve"> Use Case Diagram</w:t>
+        <w:t xml:space="preserve"> User Login, Logout Use Case Diagram</w:t>
       </w:r>
     </w:p>
     <w:p>
@@ -9407,10 +9839,7 @@
           <w:b/>
           <w:bCs/>
         </w:rPr>
-        <w:t>UC-102: Login and Logout</w:t>
-      </w:r>
-      <w:r>
-        <w:br/>
+        <w:t>UC-103: Reset Password</w:t>
       </w:r>
     </w:p>
     <w:tbl>
@@ -9486,7 +9915,7 @@
               <w:pStyle w:val="NormalWeb"/>
             </w:pPr>
             <w:r>
-              <w:t>UC-102</w:t>
+              <w:t>UC-103</w:t>
             </w:r>
           </w:p>
         </w:tc>
@@ -9516,7 +9945,7 @@
               <w:pStyle w:val="NormalWeb"/>
             </w:pPr>
             <w:r>
-              <w:t>Login and Logout</w:t>
+              <w:t>Reset Password</w:t>
             </w:r>
           </w:p>
         </w:tc>
@@ -9576,7 +10005,7 @@
               <w:pStyle w:val="NormalWeb"/>
             </w:pPr>
             <w:r>
-              <w:t>Allows registered users to securely access and exit their dashboards.</w:t>
+              <w:t>Allows a user to reset their password using a valid reset link.</w:t>
             </w:r>
           </w:p>
         </w:tc>
@@ -9606,7 +10035,7 @@
               <w:pStyle w:val="NormalWeb"/>
             </w:pPr>
             <w:r>
-              <w:t>User must be registered and verified.</w:t>
+              <w:t>User has received a valid password reset email.</w:t>
             </w:r>
           </w:p>
         </w:tc>
@@ -9636,19 +10065,23 @@
               <w:pStyle w:val="NormalWeb"/>
             </w:pPr>
             <w:r>
-              <w:t xml:space="preserve">1. User enters credentials. </w:t>
+              <w:t>1. User opens reset link.</w:t>
             </w:r>
             <w:r>
               <w:br/>
-              <w:t xml:space="preserve">2. System validates. </w:t>
+              <w:t xml:space="preserve">2. Enters new password. </w:t>
             </w:r>
             <w:r>
               <w:br/>
-              <w:t xml:space="preserve">3. Redirects to role-specific dashboard. </w:t>
+            </w:r>
+            <w:r>
+              <w:t xml:space="preserve">3. System validates strength. </w:t>
             </w:r>
             <w:r>
               <w:br/>
-              <w:t>4. Logout ends session.</w:t>
+            </w:r>
+            <w:r>
+              <w:t>4. Password updated.</w:t>
             </w:r>
           </w:p>
         </w:tc>
@@ -9664,7 +10097,6 @@
               <w:pStyle w:val="NormalWeb"/>
             </w:pPr>
             <w:r>
-              <w:lastRenderedPageBreak/>
               <w:t>Alternate Flow</w:t>
             </w:r>
           </w:p>
@@ -9679,7 +10111,7 @@
               <w:pStyle w:val="NormalWeb"/>
             </w:pPr>
             <w:r>
-              <w:t>Invalid credentials → Error message displayed.</w:t>
+              <w:t>Link expired → Error displayed.</w:t>
             </w:r>
           </w:p>
         </w:tc>
@@ -9709,39 +10141,12 @@
               <w:pStyle w:val="NormalWeb"/>
             </w:pPr>
             <w:r>
-              <w:t>Session created or terminated.</w:t>
+              <w:t>Password successfully updated.</w:t>
             </w:r>
           </w:p>
         </w:tc>
       </w:tr>
     </w:tbl>
-    <w:p>
-      <w:pPr>
-        <w:pStyle w:val="NormalWeb"/>
-        <w:rPr>
-          <w:b/>
-          <w:bCs/>
-        </w:rPr>
-      </w:pPr>
-    </w:p>
-    <w:p>
-      <w:pPr>
-        <w:rPr>
-          <w:rFonts w:ascii="Times New Roman" w:eastAsia="Times New Roman" w:hAnsi="Times New Roman" w:cs="Times New Roman"/>
-          <w:b/>
-          <w:bCs/>
-          <w:sz w:val="24"/>
-          <w:szCs w:val="24"/>
-        </w:rPr>
-      </w:pPr>
-      <w:r>
-        <w:rPr>
-          <w:b/>
-          <w:bCs/>
-        </w:rPr>
-        <w:br w:type="page"/>
-      </w:r>
-    </w:p>
     <w:p>
       <w:pPr>
         <w:pStyle w:val="NormalWeb"/>
@@ -9750,16 +10155,13 @@
       </w:pPr>
       <w:r>
         <w:rPr>
-          <w:b/>
-          <w:bCs/>
-          <w:noProof/>
-        </w:rPr>
-        <w:lastRenderedPageBreak/>
+          <w:noProof/>
+        </w:rPr>
         <w:drawing>
-          <wp:inline distT="0" distB="0" distL="0" distR="0" wp14:anchorId="72538FA9" wp14:editId="4F65FC38">
-            <wp:extent cx="3832860" cy="2415540"/>
+          <wp:inline distT="0" distB="0" distL="0" distR="0" wp14:anchorId="4BF003BD" wp14:editId="7A8BA4A6">
+            <wp:extent cx="2651760" cy="1135380"/>
             <wp:effectExtent l="0" t="0" r="0" b="0"/>
-            <wp:docPr id="694747323" name="Picture 30"/>
+            <wp:docPr id="1181951628" name="Picture 11"/>
             <wp:cNvGraphicFramePr>
               <a:graphicFrameLocks xmlns:a="http://schemas.openxmlformats.org/drawingml/2006/main" noChangeAspect="1"/>
             </wp:cNvGraphicFramePr>
@@ -9767,20 +10169,20 @@
               <a:graphicData uri="http://schemas.openxmlformats.org/drawingml/2006/picture">
                 <pic:pic xmlns:pic="http://schemas.openxmlformats.org/drawingml/2006/picture">
                   <pic:nvPicPr>
-                    <pic:cNvPr id="0" name="Picture 56"/>
+                    <pic:cNvPr id="0" name="Picture 7"/>
                     <pic:cNvPicPr>
                       <a:picLocks noChangeAspect="1" noChangeArrowheads="1"/>
                     </pic:cNvPicPr>
                   </pic:nvPicPr>
                   <pic:blipFill rotWithShape="1">
-                    <a:blip r:embed="rId12">
+                    <a:blip r:embed="rId13">
                       <a:extLst>
                         <a:ext uri="{28A0092B-C50C-407E-A947-70E740481C1C}">
                           <a14:useLocalDpi xmlns:a14="http://schemas.microsoft.com/office/drawing/2010/main" val="0"/>
                         </a:ext>
                       </a:extLst>
                     </a:blip>
-                    <a:srcRect l="1374" t="3065" r="21832" b="22171"/>
+                    <a:srcRect r="20729" b="25500"/>
                     <a:stretch>
                       <a:fillRect/>
                     </a:stretch>
@@ -9788,7 +10190,7 @@
                   <pic:spPr bwMode="auto">
                     <a:xfrm>
                       <a:off x="0" y="0"/>
-                      <a:ext cx="3832860" cy="2415540"/>
+                      <a:ext cx="2651760" cy="1135380"/>
                     </a:xfrm>
                     <a:prstGeom prst="rect">
                       <a:avLst/>
@@ -9827,11 +10229,17 @@
           <w:rPr>
             <w:noProof/>
           </w:rPr>
-          <w:t>2</w:t>
+          <w:t>3</w:t>
         </w:r>
       </w:fldSimple>
       <w:r>
-        <w:t xml:space="preserve"> User Login, Logout Use Case Diagram</w:t>
+        <w:t xml:space="preserve"> User </w:t>
+      </w:r>
+      <w:r>
+        <w:t>Reset Password</w:t>
+      </w:r>
+      <w:r>
+        <w:t xml:space="preserve"> Use Case Diagram</w:t>
       </w:r>
     </w:p>
     <w:p>
@@ -9843,7 +10251,8 @@
           <w:b/>
           <w:bCs/>
         </w:rPr>
-        <w:t>UC-103: Reset Password</w:t>
+        <w:lastRenderedPageBreak/>
+        <w:t>UC-104: Forgot Password</w:t>
       </w:r>
     </w:p>
     <w:tbl>
@@ -9919,7 +10328,7 @@
               <w:pStyle w:val="NormalWeb"/>
             </w:pPr>
             <w:r>
-              <w:t>UC-103</w:t>
+              <w:t>UC-104</w:t>
             </w:r>
           </w:p>
         </w:tc>
@@ -9949,7 +10358,7 @@
               <w:pStyle w:val="NormalWeb"/>
             </w:pPr>
             <w:r>
-              <w:t>Reset Password</w:t>
+              <w:t>Forgot Password</w:t>
             </w:r>
           </w:p>
         </w:tc>
@@ -10009,7 +10418,7 @@
               <w:pStyle w:val="NormalWeb"/>
             </w:pPr>
             <w:r>
-              <w:t>Allows a user to reset their password using a valid reset link.</w:t>
+              <w:t>Allows users to request a password reset link via their registered email.</w:t>
             </w:r>
           </w:p>
         </w:tc>
@@ -10039,7 +10448,7 @@
               <w:pStyle w:val="NormalWeb"/>
             </w:pPr>
             <w:r>
-              <w:t>User has received a valid password reset email.</w:t>
+              <w:t>User has a registered and verified email address.</w:t>
             </w:r>
           </w:p>
         </w:tc>
@@ -10069,23 +10478,19 @@
               <w:pStyle w:val="NormalWeb"/>
             </w:pPr>
             <w:r>
-              <w:t>1. User opens reset link.</w:t>
+              <w:t xml:space="preserve">1. User selects "Forgot Password". </w:t>
             </w:r>
             <w:r>
               <w:br/>
-              <w:t xml:space="preserve">2. Enters new password. </w:t>
+              <w:t xml:space="preserve">2. Enters registered email. </w:t>
             </w:r>
             <w:r>
               <w:br/>
-            </w:r>
-            <w:r>
-              <w:t xml:space="preserve">3. System validates strength. </w:t>
+              <w:t xml:space="preserve">3. System verifies account. </w:t>
             </w:r>
             <w:r>
               <w:br/>
-            </w:r>
-            <w:r>
-              <w:t>4. Password updated.</w:t>
+              <w:t>4. Reset link sent to email.</w:t>
             </w:r>
           </w:p>
         </w:tc>
@@ -10115,7 +10520,7 @@
               <w:pStyle w:val="NormalWeb"/>
             </w:pPr>
             <w:r>
-              <w:t>Link expired → Error displayed.</w:t>
+              <w:t>Email not found → Error message displayed.</w:t>
             </w:r>
           </w:p>
         </w:tc>
@@ -10145,7 +10550,7 @@
               <w:pStyle w:val="NormalWeb"/>
             </w:pPr>
             <w:r>
-              <w:t>Password successfully updated.</w:t>
+              <w:t>Password reset email sent.</w:t>
             </w:r>
           </w:p>
         </w:tc>
@@ -10159,15 +10564,13 @@
       </w:pPr>
       <w:r>
         <w:rPr>
-          <w:b/>
-          <w:bCs/>
           <w:noProof/>
         </w:rPr>
         <w:drawing>
-          <wp:inline distT="0" distB="0" distL="0" distR="0" wp14:anchorId="227896BF" wp14:editId="027E59BA">
-            <wp:extent cx="2590800" cy="990600"/>
-            <wp:effectExtent l="0" t="0" r="0" b="0"/>
-            <wp:docPr id="732309634" name="Picture 29"/>
+          <wp:inline distT="0" distB="0" distL="0" distR="0" wp14:anchorId="564863DE" wp14:editId="71BAB717">
+            <wp:extent cx="2468880" cy="1242060"/>
+            <wp:effectExtent l="0" t="0" r="7620" b="0"/>
+            <wp:docPr id="427160358" name="Picture 12"/>
             <wp:cNvGraphicFramePr>
               <a:graphicFrameLocks xmlns:a="http://schemas.openxmlformats.org/drawingml/2006/main" noChangeAspect="1"/>
             </wp:cNvGraphicFramePr>
@@ -10175,20 +10578,20 @@
               <a:graphicData uri="http://schemas.openxmlformats.org/drawingml/2006/picture">
                 <pic:pic xmlns:pic="http://schemas.openxmlformats.org/drawingml/2006/picture">
                   <pic:nvPicPr>
-                    <pic:cNvPr id="0" name="Picture 55"/>
+                    <pic:cNvPr id="0" name="Picture 8"/>
                     <pic:cNvPicPr>
                       <a:picLocks noChangeAspect="1" noChangeArrowheads="1"/>
                     </pic:cNvPicPr>
                   </pic:nvPicPr>
                   <pic:blipFill rotWithShape="1">
-                    <a:blip r:embed="rId13">
+                    <a:blip r:embed="rId14">
                       <a:extLst>
                         <a:ext uri="{28A0092B-C50C-407E-A947-70E740481C1C}">
                           <a14:useLocalDpi xmlns:a14="http://schemas.microsoft.com/office/drawing/2010/main" val="0"/>
                         </a:ext>
                       </a:extLst>
                     </a:blip>
-                    <a:srcRect l="3050" t="8000" r="22876" b="27000"/>
+                    <a:srcRect l="3595" r="23595" b="22381"/>
                     <a:stretch>
                       <a:fillRect/>
                     </a:stretch>
@@ -10196,7 +10599,7 @@
                   <pic:spPr bwMode="auto">
                     <a:xfrm>
                       <a:off x="0" y="0"/>
-                      <a:ext cx="2590800" cy="990600"/>
+                      <a:ext cx="2468880" cy="1242060"/>
                     </a:xfrm>
                     <a:prstGeom prst="rect">
                       <a:avLst/>
@@ -10235,14 +10638,14 @@
           <w:rPr>
             <w:noProof/>
           </w:rPr>
-          <w:t>3</w:t>
+          <w:t>4</w:t>
         </w:r>
       </w:fldSimple>
       <w:r>
         <w:t xml:space="preserve"> User </w:t>
       </w:r>
       <w:r>
-        <w:t>Reset Password</w:t>
+        <w:t>Forgot Password</w:t>
       </w:r>
       <w:r>
         <w:t xml:space="preserve"> Use Case Diagram</w:t>
@@ -10257,7 +10660,7 @@
           <w:b/>
           <w:bCs/>
         </w:rPr>
-        <w:t>UC-104: Forgot Password</w:t>
+        <w:t>UC-105: Delete Account</w:t>
       </w:r>
     </w:p>
     <w:tbl>
@@ -10285,7 +10688,6 @@
                 <w:b/>
                 <w:bCs/>
               </w:rPr>
-              <w:lastRenderedPageBreak/>
               <w:t>Field</w:t>
             </w:r>
           </w:p>
@@ -10334,7 +10736,7 @@
               <w:pStyle w:val="NormalWeb"/>
             </w:pPr>
             <w:r>
-              <w:t>UC-104</w:t>
+              <w:t>UC-105</w:t>
             </w:r>
           </w:p>
         </w:tc>
@@ -10364,7 +10766,7 @@
               <w:pStyle w:val="NormalWeb"/>
             </w:pPr>
             <w:r>
-              <w:t>Forgot Password</w:t>
+              <w:t>Delete Account</w:t>
             </w:r>
           </w:p>
         </w:tc>
@@ -10394,7 +10796,7 @@
               <w:pStyle w:val="NormalWeb"/>
             </w:pPr>
             <w:r>
-              <w:t>Patient, Doctor, Nurse, Admin</w:t>
+              <w:t>Patient</w:t>
             </w:r>
           </w:p>
         </w:tc>
@@ -10424,7 +10826,7 @@
               <w:pStyle w:val="NormalWeb"/>
             </w:pPr>
             <w:r>
-              <w:t>Allows users to request a password reset link via their registered email.</w:t>
+              <w:t>Allows a patient to permanently delete their account.</w:t>
             </w:r>
           </w:p>
         </w:tc>
@@ -10454,7 +10856,7 @@
               <w:pStyle w:val="NormalWeb"/>
             </w:pPr>
             <w:r>
-              <w:t>User has a registered and verified email address.</w:t>
+              <w:t>User must be logged in.</w:t>
             </w:r>
           </w:p>
         </w:tc>
@@ -10484,19 +10886,19 @@
               <w:pStyle w:val="NormalWeb"/>
             </w:pPr>
             <w:r>
-              <w:t xml:space="preserve">1. User selects "Forgot Password". </w:t>
+              <w:t xml:space="preserve">1. User selects "Delete Account". </w:t>
             </w:r>
             <w:r>
               <w:br/>
-              <w:t xml:space="preserve">2. Enters registered email. </w:t>
+              <w:t xml:space="preserve">2. System requests confirmation. </w:t>
             </w:r>
             <w:r>
               <w:br/>
-              <w:t xml:space="preserve">3. System verifies account. </w:t>
+              <w:t xml:space="preserve">3. Account is deleted or deactivated. </w:t>
             </w:r>
             <w:r>
               <w:br/>
-              <w:t>4. Reset link sent to email.</w:t>
+              <w:t>4. User is logged out.</w:t>
             </w:r>
           </w:p>
         </w:tc>
@@ -10526,7 +10928,7 @@
               <w:pStyle w:val="NormalWeb"/>
             </w:pPr>
             <w:r>
-              <w:t>Email not found → Error message displayed.</w:t>
+              <w:t>User cancels deletion.</w:t>
             </w:r>
           </w:p>
         </w:tc>
@@ -10556,7 +10958,7 @@
               <w:pStyle w:val="NormalWeb"/>
             </w:pPr>
             <w:r>
-              <w:t>Password reset email sent.</w:t>
+              <w:t>Account removed or marked inactive.</w:t>
             </w:r>
           </w:p>
         </w:tc>
@@ -10570,15 +10972,14 @@
       </w:pPr>
       <w:r>
         <w:rPr>
-          <w:b/>
-          <w:bCs/>
-          <w:noProof/>
-        </w:rPr>
+          <w:noProof/>
+        </w:rPr>
+        <w:lastRenderedPageBreak/>
         <w:drawing>
-          <wp:inline distT="0" distB="0" distL="0" distR="0" wp14:anchorId="2490FEF6" wp14:editId="1F0AB98B">
-            <wp:extent cx="2491740" cy="1089660"/>
+          <wp:inline distT="0" distB="0" distL="0" distR="0" wp14:anchorId="47FE169D" wp14:editId="08EB8B78">
+            <wp:extent cx="2103120" cy="1981200"/>
             <wp:effectExtent l="0" t="0" r="0" b="0"/>
-            <wp:docPr id="1931459038" name="Picture 27"/>
+            <wp:docPr id="1451859895" name="Picture 13"/>
             <wp:cNvGraphicFramePr>
               <a:graphicFrameLocks xmlns:a="http://schemas.openxmlformats.org/drawingml/2006/main" noChangeAspect="1"/>
             </wp:cNvGraphicFramePr>
@@ -10586,20 +10987,20 @@
               <a:graphicData uri="http://schemas.openxmlformats.org/drawingml/2006/picture">
                 <pic:pic xmlns:pic="http://schemas.openxmlformats.org/drawingml/2006/picture">
                   <pic:nvPicPr>
-                    <pic:cNvPr id="0" name="Picture 53"/>
+                    <pic:cNvPr id="0" name="Picture 9"/>
                     <pic:cNvPicPr>
                       <a:picLocks noChangeAspect="1" noChangeArrowheads="1"/>
                     </pic:cNvPicPr>
                   </pic:nvPicPr>
                   <pic:blipFill rotWithShape="1">
-                    <a:blip r:embed="rId14">
+                    <a:blip r:embed="rId15">
                       <a:extLst>
                         <a:ext uri="{28A0092B-C50C-407E-A947-70E740481C1C}">
                           <a14:useLocalDpi xmlns:a14="http://schemas.microsoft.com/office/drawing/2010/main" val="0"/>
                         </a:ext>
                       </a:extLst>
                     </a:blip>
-                    <a:srcRect l="3596" t="6666" r="22922" b="25238"/>
+                    <a:srcRect l="4533" r="21866" b="24638"/>
                     <a:stretch>
                       <a:fillRect/>
                     </a:stretch>
@@ -10607,7 +11008,7 @@
                   <pic:spPr bwMode="auto">
                     <a:xfrm>
                       <a:off x="0" y="0"/>
-                      <a:ext cx="2491740" cy="1089660"/>
+                      <a:ext cx="2103120" cy="1981200"/>
                     </a:xfrm>
                     <a:prstGeom prst="rect">
                       <a:avLst/>
@@ -10634,8 +11035,10 @@
         <w:pStyle w:val="Caption"/>
         <w:jc w:val="center"/>
         <w:rPr>
-          <w:b/>
-          <w:bCs/>
+          <w:rStyle w:val="Strong"/>
+          <w:rFonts w:ascii="Arial" w:hAnsi="Arial"/>
+          <w:iCs w:val="0"/>
+          <w:szCs w:val="20"/>
         </w:rPr>
       </w:pPr>
       <w:r>
@@ -10646,17 +11049,31 @@
           <w:rPr>
             <w:noProof/>
           </w:rPr>
-          <w:t>4</w:t>
+          <w:t>5</w:t>
         </w:r>
       </w:fldSimple>
       <w:r>
-        <w:t xml:space="preserve"> User </w:t>
-      </w:r>
-      <w:r>
-        <w:t>Forgot Password</w:t>
-      </w:r>
-      <w:r>
-        <w:t xml:space="preserve"> Use Case Diagram</w:t>
+        <w:t xml:space="preserve"> User Delete Account Use Case Diagram</w:t>
+      </w:r>
+    </w:p>
+    <w:p>
+      <w:pPr>
+        <w:pStyle w:val="NormalWeb"/>
+        <w:rPr>
+          <w:rStyle w:val="Strong"/>
+          <w:rFonts w:ascii="Arial" w:eastAsiaTheme="minorHAnsi" w:hAnsi="Arial" w:cstheme="minorBidi"/>
+          <w:iCs/>
+          <w:szCs w:val="20"/>
+        </w:rPr>
+      </w:pPr>
+      <w:r>
+        <w:rPr>
+          <w:rStyle w:val="Strong"/>
+          <w:rFonts w:ascii="Arial" w:eastAsiaTheme="minorHAnsi" w:hAnsi="Arial" w:cstheme="minorBidi"/>
+          <w:iCs/>
+          <w:szCs w:val="20"/>
+        </w:rPr>
+        <w:t>3.3.2 Patient Use Cases</w:t>
       </w:r>
     </w:p>
     <w:p>
@@ -10668,7 +11085,7 @@
           <w:b/>
           <w:bCs/>
         </w:rPr>
-        <w:t>UC-105: Delete Account</w:t>
+        <w:t>UC-201: Setup Patient Profile</w:t>
       </w:r>
     </w:p>
     <w:tbl>
@@ -10744,7 +11161,7 @@
               <w:pStyle w:val="NormalWeb"/>
             </w:pPr>
             <w:r>
-              <w:t>UC-105</w:t>
+              <w:t>UC-201</w:t>
             </w:r>
           </w:p>
         </w:tc>
@@ -10774,7 +11191,7 @@
               <w:pStyle w:val="NormalWeb"/>
             </w:pPr>
             <w:r>
-              <w:t>Delete Account</w:t>
+              <w:t>Setup Patient Profile</w:t>
             </w:r>
           </w:p>
         </w:tc>
@@ -10834,7 +11251,7 @@
               <w:pStyle w:val="NormalWeb"/>
             </w:pPr>
             <w:r>
-              <w:t>Allows a patient to permanently delete their account.</w:t>
+              <w:t>Allows patients to create or update their personal and medical profile.</w:t>
             </w:r>
           </w:p>
         </w:tc>
@@ -10864,7 +11281,7 @@
               <w:pStyle w:val="NormalWeb"/>
             </w:pPr>
             <w:r>
-              <w:t>User must be logged in.</w:t>
+              <w:t>Patient must be logged in.</w:t>
             </w:r>
           </w:p>
         </w:tc>
@@ -10894,19 +11311,19 @@
               <w:pStyle w:val="NormalWeb"/>
             </w:pPr>
             <w:r>
-              <w:t xml:space="preserve">1. User selects "Delete Account". </w:t>
+              <w:t xml:space="preserve">1. Patient opens profile page. </w:t>
             </w:r>
             <w:r>
               <w:br/>
-              <w:t xml:space="preserve">2. System requests confirmation. </w:t>
+              <w:t xml:space="preserve">2. Enters name, DOB, gender, contact, address. </w:t>
             </w:r>
             <w:r>
               <w:br/>
-              <w:t xml:space="preserve">3. Account is deleted or deactivated. </w:t>
+              <w:t xml:space="preserve">3. Saves profile. </w:t>
             </w:r>
             <w:r>
               <w:br/>
-              <w:t>4. User is logged out.</w:t>
+              <w:t>4. System updates stored information.</w:t>
             </w:r>
           </w:p>
         </w:tc>
@@ -10936,7 +11353,7 @@
               <w:pStyle w:val="NormalWeb"/>
             </w:pPr>
             <w:r>
-              <w:t>User cancels deletion.</w:t>
+              <w:t>Missing required fields → Error displayed.</w:t>
             </w:r>
           </w:p>
         </w:tc>
@@ -10966,7 +11383,7 @@
               <w:pStyle w:val="NormalWeb"/>
             </w:pPr>
             <w:r>
-              <w:t>Account removed or marked inactive.</w:t>
+              <w:t>Patient profile created or updated.</w:t>
             </w:r>
           </w:p>
         </w:tc>
@@ -10980,18 +11397,14 @@
       </w:pPr>
       <w:r>
         <w:rPr>
-          <w:rStyle w:val="Strong"/>
-          <w:rFonts w:ascii="Arial" w:eastAsiaTheme="minorHAnsi" w:hAnsi="Arial" w:cstheme="minorBidi"/>
-          <w:iCs/>
-          <w:noProof/>
-          <w:szCs w:val="20"/>
+          <w:noProof/>
         </w:rPr>
         <w:lastRenderedPageBreak/>
         <w:drawing>
-          <wp:inline distT="0" distB="0" distL="0" distR="0" wp14:anchorId="7428EF89" wp14:editId="466E12C8">
-            <wp:extent cx="2057400" cy="1897380"/>
+          <wp:inline distT="0" distB="0" distL="0" distR="0" wp14:anchorId="0D2AE1F4" wp14:editId="779EACEA">
+            <wp:extent cx="2590800" cy="2560320"/>
             <wp:effectExtent l="0" t="0" r="0" b="0"/>
-            <wp:docPr id="1322691900" name="Picture 26"/>
+            <wp:docPr id="1477385494" name="Picture 14"/>
             <wp:cNvGraphicFramePr>
               <a:graphicFrameLocks xmlns:a="http://schemas.openxmlformats.org/drawingml/2006/main" noChangeAspect="1"/>
             </wp:cNvGraphicFramePr>
@@ -10999,20 +11412,20 @@
               <a:graphicData uri="http://schemas.openxmlformats.org/drawingml/2006/picture">
                 <pic:pic xmlns:pic="http://schemas.openxmlformats.org/drawingml/2006/picture">
                   <pic:nvPicPr>
-                    <pic:cNvPr id="0" name="Picture 52"/>
+                    <pic:cNvPr id="0" name="Picture 10"/>
                     <pic:cNvPicPr>
                       <a:picLocks noChangeAspect="1" noChangeArrowheads="1"/>
                     </pic:cNvPicPr>
                   </pic:nvPicPr>
                   <pic:blipFill rotWithShape="1">
-                    <a:blip r:embed="rId15">
+                    <a:blip r:embed="rId16">
                       <a:extLst>
                         <a:ext uri="{28A0092B-C50C-407E-A947-70E740481C1C}">
                           <a14:useLocalDpi xmlns:a14="http://schemas.microsoft.com/office/drawing/2010/main" val="0"/>
                         </a:ext>
                       </a:extLst>
                     </a:blip>
-                    <a:srcRect l="4000" t="4638" r="24001" b="23188"/>
+                    <a:srcRect l="4094" r="22630" b="23462"/>
                     <a:stretch>
                       <a:fillRect/>
                     </a:stretch>
@@ -11020,7 +11433,7 @@
                   <pic:spPr bwMode="auto">
                     <a:xfrm>
                       <a:off x="0" y="0"/>
-                      <a:ext cx="2057400" cy="1897380"/>
+                      <a:ext cx="2590800" cy="2560320"/>
                     </a:xfrm>
                     <a:prstGeom prst="rect">
                       <a:avLst/>
@@ -11047,10 +11460,8 @@
         <w:pStyle w:val="Caption"/>
         <w:jc w:val="center"/>
         <w:rPr>
-          <w:rStyle w:val="Strong"/>
-          <w:rFonts w:ascii="Arial" w:hAnsi="Arial"/>
-          <w:iCs w:val="0"/>
-          <w:szCs w:val="20"/>
+          <w:b/>
+          <w:bCs/>
         </w:rPr>
       </w:pPr>
       <w:r>
@@ -11061,31 +11472,23 @@
           <w:rPr>
             <w:noProof/>
           </w:rPr>
-          <w:t>5</w:t>
+          <w:t>6</w:t>
         </w:r>
       </w:fldSimple>
       <w:r>
-        <w:t xml:space="preserve"> User Delete Account Use Case Diagram</w:t>
-      </w:r>
-    </w:p>
-    <w:p>
-      <w:pPr>
-        <w:pStyle w:val="NormalWeb"/>
-        <w:rPr>
-          <w:rStyle w:val="Strong"/>
-          <w:rFonts w:ascii="Arial" w:eastAsiaTheme="minorHAnsi" w:hAnsi="Arial" w:cstheme="minorBidi"/>
-          <w:iCs/>
-          <w:szCs w:val="20"/>
-        </w:rPr>
-      </w:pPr>
-      <w:r>
-        <w:rPr>
-          <w:rStyle w:val="Strong"/>
-          <w:rFonts w:ascii="Arial" w:eastAsiaTheme="minorHAnsi" w:hAnsi="Arial" w:cstheme="minorBidi"/>
-          <w:iCs/>
-          <w:szCs w:val="20"/>
-        </w:rPr>
-        <w:t>3.3.2 Patient Use Cases</w:t>
+        <w:t xml:space="preserve"> </w:t>
+      </w:r>
+      <w:r>
+        <w:t>Patient</w:t>
+      </w:r>
+      <w:r>
+        <w:t xml:space="preserve"> Set Profile</w:t>
+      </w:r>
+      <w:r>
+        <w:rPr>
+          <w:noProof/>
+        </w:rPr>
+        <w:t xml:space="preserve"> Use Case Diagram</w:t>
       </w:r>
     </w:p>
     <w:p>
@@ -11097,7 +11500,7 @@
           <w:b/>
           <w:bCs/>
         </w:rPr>
-        <w:t>UC-201: Setup Patient Profile</w:t>
+        <w:t>UC-202: Book Appointment</w:t>
       </w:r>
     </w:p>
     <w:tbl>
@@ -11173,7 +11576,7 @@
               <w:pStyle w:val="NormalWeb"/>
             </w:pPr>
             <w:r>
-              <w:t>UC-201</w:t>
+              <w:t>UC-202</w:t>
             </w:r>
           </w:p>
         </w:tc>
@@ -11203,7 +11606,7 @@
               <w:pStyle w:val="NormalWeb"/>
             </w:pPr>
             <w:r>
-              <w:t>Setup Patient Profile</w:t>
+              <w:t>Book Appointment</w:t>
             </w:r>
           </w:p>
         </w:tc>
@@ -11263,7 +11666,7 @@
               <w:pStyle w:val="NormalWeb"/>
             </w:pPr>
             <w:r>
-              <w:t>Allows patients to create or update their personal and medical profile.</w:t>
+              <w:t>Allows a patient to schedule an appointment with a doctor.</w:t>
             </w:r>
           </w:p>
         </w:tc>
@@ -11293,7 +11696,7 @@
               <w:pStyle w:val="NormalWeb"/>
             </w:pPr>
             <w:r>
-              <w:t>Patient must be logged in.</w:t>
+              <w:t>Patient must be logged in and have a completed profile.</w:t>
             </w:r>
           </w:p>
         </w:tc>
@@ -11323,19 +11726,19 @@
               <w:pStyle w:val="NormalWeb"/>
             </w:pPr>
             <w:r>
-              <w:t xml:space="preserve">1. Patient opens profile page. </w:t>
+              <w:t xml:space="preserve">1. Patient selects department and doctor. </w:t>
             </w:r>
             <w:r>
               <w:br/>
-              <w:t xml:space="preserve">2. Enters name, DOB, gender, contact, address. </w:t>
+              <w:t xml:space="preserve">2. Views available time slots. </w:t>
             </w:r>
             <w:r>
               <w:br/>
-              <w:t xml:space="preserve">3. Saves profile. </w:t>
+              <w:t xml:space="preserve">3. Selects a slot and confirms booking. </w:t>
             </w:r>
             <w:r>
               <w:br/>
-              <w:t>4. System updates stored information.</w:t>
+              <w:t>4. System records appointment and sends confirmation email.</w:t>
             </w:r>
           </w:p>
         </w:tc>
@@ -11365,7 +11768,7 @@
               <w:pStyle w:val="NormalWeb"/>
             </w:pPr>
             <w:r>
-              <w:t>Missing required fields → Error displayed.</w:t>
+              <w:t>Slot already taken → System prompts to choose another.</w:t>
             </w:r>
           </w:p>
         </w:tc>
@@ -11395,7 +11798,7 @@
               <w:pStyle w:val="NormalWeb"/>
             </w:pPr>
             <w:r>
-              <w:t>Patient profile created or updated.</w:t>
+              <w:t>Appointment recorded and confirmation sent.</w:t>
             </w:r>
           </w:p>
         </w:tc>
@@ -11409,16 +11812,14 @@
       </w:pPr>
       <w:r>
         <w:rPr>
-          <w:b/>
-          <w:bCs/>
           <w:noProof/>
         </w:rPr>
         <w:lastRenderedPageBreak/>
         <w:drawing>
-          <wp:inline distT="0" distB="0" distL="0" distR="0" wp14:anchorId="2585B88A" wp14:editId="7DD6DBC7">
-            <wp:extent cx="2628900" cy="2453640"/>
-            <wp:effectExtent l="0" t="0" r="0" b="3810"/>
-            <wp:docPr id="158205279" name="Picture 25"/>
+          <wp:inline distT="0" distB="0" distL="0" distR="0" wp14:anchorId="690EBC57" wp14:editId="48E68EAC">
+            <wp:extent cx="2377440" cy="2004060"/>
+            <wp:effectExtent l="0" t="0" r="0" b="0"/>
+            <wp:docPr id="362715669" name="Picture 15"/>
             <wp:cNvGraphicFramePr>
               <a:graphicFrameLocks xmlns:a="http://schemas.openxmlformats.org/drawingml/2006/main" noChangeAspect="1"/>
             </wp:cNvGraphicFramePr>
@@ -11426,20 +11827,20 @@
               <a:graphicData uri="http://schemas.openxmlformats.org/drawingml/2006/picture">
                 <pic:pic xmlns:pic="http://schemas.openxmlformats.org/drawingml/2006/picture">
                   <pic:nvPicPr>
-                    <pic:cNvPr id="0" name="Picture 51"/>
+                    <pic:cNvPr id="0" name="Picture 11"/>
                     <pic:cNvPicPr>
                       <a:picLocks noChangeAspect="1" noChangeArrowheads="1"/>
                     </pic:cNvPicPr>
                   </pic:nvPicPr>
                   <pic:blipFill rotWithShape="1">
-                    <a:blip r:embed="rId16">
+                    <a:blip r:embed="rId17">
                       <a:extLst>
                         <a:ext uri="{28A0092B-C50C-407E-A947-70E740481C1C}">
                           <a14:useLocalDpi xmlns:a14="http://schemas.microsoft.com/office/drawing/2010/main" val="0"/>
                         </a:ext>
                       </a:extLst>
                     </a:blip>
-                    <a:srcRect l="2802" t="2734" r="22844" b="23918"/>
+                    <a:srcRect l="3954" r="23488" b="23768"/>
                     <a:stretch>
                       <a:fillRect/>
                     </a:stretch>
@@ -11447,7 +11848,7 @@
                   <pic:spPr bwMode="auto">
                     <a:xfrm>
                       <a:off x="0" y="0"/>
-                      <a:ext cx="2628900" cy="2453640"/>
+                      <a:ext cx="2377440" cy="2004060"/>
                     </a:xfrm>
                     <a:prstGeom prst="rect">
                       <a:avLst/>
@@ -11486,23 +11887,17 @@
           <w:rPr>
             <w:noProof/>
           </w:rPr>
-          <w:t>6</w:t>
+          <w:t>7</w:t>
         </w:r>
       </w:fldSimple>
       <w:r>
-        <w:t xml:space="preserve"> </w:t>
-      </w:r>
-      <w:r>
-        <w:t>Patient</w:t>
-      </w:r>
-      <w:r>
-        <w:t xml:space="preserve"> Set Profile</w:t>
-      </w:r>
-      <w:r>
-        <w:rPr>
-          <w:noProof/>
-        </w:rPr>
-        <w:t xml:space="preserve"> Use Case Diagram</w:t>
+        <w:t xml:space="preserve"> Patient </w:t>
+      </w:r>
+      <w:r>
+        <w:t>Book Appointment</w:t>
+      </w:r>
+      <w:r>
+        <w:t xml:space="preserve"> Use Case DIagram</w:t>
       </w:r>
     </w:p>
     <w:p>
@@ -11514,7 +11909,7 @@
           <w:b/>
           <w:bCs/>
         </w:rPr>
-        <w:t>UC-202: Book Appointment</w:t>
+        <w:t>UC-203: View Appointment History</w:t>
       </w:r>
     </w:p>
     <w:tbl>
@@ -11590,7 +11985,7 @@
               <w:pStyle w:val="NormalWeb"/>
             </w:pPr>
             <w:r>
-              <w:t>UC-202</w:t>
+              <w:t>UC-203</w:t>
             </w:r>
           </w:p>
         </w:tc>
@@ -11620,7 +12015,7 @@
               <w:pStyle w:val="NormalWeb"/>
             </w:pPr>
             <w:r>
-              <w:t>Book Appointment</w:t>
+              <w:t>View Appointment History</w:t>
             </w:r>
           </w:p>
         </w:tc>
@@ -11680,7 +12075,7 @@
               <w:pStyle w:val="NormalWeb"/>
             </w:pPr>
             <w:r>
-              <w:t>Allows a patient to schedule an appointment with a doctor.</w:t>
+              <w:t>Allows patients to view a list of all past and upcoming appointments.</w:t>
             </w:r>
           </w:p>
         </w:tc>
@@ -11710,7 +12105,7 @@
               <w:pStyle w:val="NormalWeb"/>
             </w:pPr>
             <w:r>
-              <w:t>Patient must be logged in and have a completed profile.</w:t>
+              <w:t>Patient must be logged in.</w:t>
             </w:r>
           </w:p>
         </w:tc>
@@ -11740,19 +12135,19 @@
               <w:pStyle w:val="NormalWeb"/>
             </w:pPr>
             <w:r>
-              <w:t xml:space="preserve">1. Patient selects department and doctor. </w:t>
+              <w:t xml:space="preserve">1. Patient opens "My Appointments". </w:t>
             </w:r>
             <w:r>
               <w:br/>
-              <w:t xml:space="preserve">2. Views available time slots. </w:t>
+            </w:r>
+            <w:r>
+              <w:t xml:space="preserve">2. System retrieves appointment records. </w:t>
             </w:r>
             <w:r>
               <w:br/>
-              <w:t xml:space="preserve">3. Selects a slot and confirms booking. </w:t>
-            </w:r>
-            <w:r>
-              <w:br/>
-              <w:t>4. System records appointment and sends confirmation email.</w:t>
+            </w:r>
+            <w:r>
+              <w:t>3. List displayed with date, doctor, status.</w:t>
             </w:r>
           </w:p>
         </w:tc>
@@ -11782,7 +12177,7 @@
               <w:pStyle w:val="NormalWeb"/>
             </w:pPr>
             <w:r>
-              <w:t>Slot already taken → System prompts to choose another.</w:t>
+              <w:t>No appointments found → Message displayed.</w:t>
             </w:r>
           </w:p>
         </w:tc>
@@ -11812,7 +12207,7 @@
               <w:pStyle w:val="NormalWeb"/>
             </w:pPr>
             <w:r>
-              <w:t>Appointment recorded and confirmation sent.</w:t>
+              <w:t>Appointment history displayed.</w:t>
             </w:r>
           </w:p>
         </w:tc>
@@ -11826,16 +12221,13 @@
       </w:pPr>
       <w:r>
         <w:rPr>
-          <w:b/>
-          <w:bCs/>
-          <w:noProof/>
-        </w:rPr>
-        <w:lastRenderedPageBreak/>
+          <w:noProof/>
+        </w:rPr>
         <w:drawing>
-          <wp:inline distT="0" distB="0" distL="0" distR="0" wp14:anchorId="6E1525CB" wp14:editId="277D8DF7">
-            <wp:extent cx="2499360" cy="1897380"/>
-            <wp:effectExtent l="0" t="0" r="0" b="0"/>
-            <wp:docPr id="1382970929" name="Picture 24"/>
+          <wp:inline distT="0" distB="0" distL="0" distR="0" wp14:anchorId="20D1E530" wp14:editId="7E036EB4">
+            <wp:extent cx="2910840" cy="1508760"/>
+            <wp:effectExtent l="0" t="0" r="3810" b="0"/>
+            <wp:docPr id="883757389" name="Picture 16"/>
             <wp:cNvGraphicFramePr>
               <a:graphicFrameLocks xmlns:a="http://schemas.openxmlformats.org/drawingml/2006/main" noChangeAspect="1"/>
             </wp:cNvGraphicFramePr>
@@ -11843,20 +12235,20 @@
               <a:graphicData uri="http://schemas.openxmlformats.org/drawingml/2006/picture">
                 <pic:pic xmlns:pic="http://schemas.openxmlformats.org/drawingml/2006/picture">
                   <pic:nvPicPr>
-                    <pic:cNvPr id="0" name="Picture 50"/>
+                    <pic:cNvPr id="0" name="Picture 12"/>
                     <pic:cNvPicPr>
                       <a:picLocks noChangeAspect="1" noChangeArrowheads="1"/>
                     </pic:cNvPicPr>
                   </pic:nvPicPr>
                   <pic:blipFill rotWithShape="1">
-                    <a:blip r:embed="rId17">
+                    <a:blip r:embed="rId18">
                       <a:extLst>
                         <a:ext uri="{28A0092B-C50C-407E-A947-70E740481C1C}">
                           <a14:useLocalDpi xmlns:a14="http://schemas.microsoft.com/office/drawing/2010/main" val="0"/>
                         </a:ext>
                       </a:extLst>
                     </a:blip>
-                    <a:srcRect l="1395" t="4057" r="22326" b="23768"/>
+                    <a:srcRect l="3276" r="23122" b="25283"/>
                     <a:stretch>
                       <a:fillRect/>
                     </a:stretch>
@@ -11864,7 +12256,7 @@
                   <pic:spPr bwMode="auto">
                     <a:xfrm>
                       <a:off x="0" y="0"/>
-                      <a:ext cx="2499360" cy="1897380"/>
+                      <a:ext cx="2910840" cy="1508760"/>
                     </a:xfrm>
                     <a:prstGeom prst="rect">
                       <a:avLst/>
@@ -11903,17 +12295,20 @@
           <w:rPr>
             <w:noProof/>
           </w:rPr>
-          <w:t>7</w:t>
+          <w:t>8</w:t>
         </w:r>
       </w:fldSimple>
       <w:r>
         <w:t xml:space="preserve"> Patient </w:t>
       </w:r>
       <w:r>
-        <w:t>Book Appointment</w:t>
-      </w:r>
-      <w:r>
-        <w:t xml:space="preserve"> Use Case DIagram</w:t>
+        <w:t>View Appointment History</w:t>
+      </w:r>
+      <w:r>
+        <w:t xml:space="preserve"> Use Case Dia</w:t>
+      </w:r>
+      <w:r>
+        <w:t>gram</w:t>
       </w:r>
     </w:p>
     <w:p>
@@ -11925,7 +12320,7 @@
           <w:b/>
           <w:bCs/>
         </w:rPr>
-        <w:t>UC-203: View Appointment History</w:t>
+        <w:t>UC-204: Cancel or Reschedule Appointment</w:t>
       </w:r>
     </w:p>
     <w:tbl>
@@ -11953,6 +12348,7 @@
                 <w:b/>
                 <w:bCs/>
               </w:rPr>
+              <w:lastRenderedPageBreak/>
               <w:t>Field</w:t>
             </w:r>
           </w:p>
@@ -12001,7 +12397,7 @@
               <w:pStyle w:val="NormalWeb"/>
             </w:pPr>
             <w:r>
-              <w:t>UC-203</w:t>
+              <w:t>UC-204</w:t>
             </w:r>
           </w:p>
         </w:tc>
@@ -12031,7 +12427,7 @@
               <w:pStyle w:val="NormalWeb"/>
             </w:pPr>
             <w:r>
-              <w:t>View Appointment History</w:t>
+              <w:t>Cancel or Reschedule Appointment</w:t>
             </w:r>
           </w:p>
         </w:tc>
@@ -12091,7 +12487,7 @@
               <w:pStyle w:val="NormalWeb"/>
             </w:pPr>
             <w:r>
-              <w:t>Allows patients to view a list of all past and upcoming appointments.</w:t>
+              <w:t>Allows patients to cancel or reschedule an existing appointment.</w:t>
             </w:r>
           </w:p>
         </w:tc>
@@ -12121,7 +12517,7 @@
               <w:pStyle w:val="NormalWeb"/>
             </w:pPr>
             <w:r>
-              <w:t>Patient must be logged in.</w:t>
+              <w:t>Appointment must exist and not have already passed.</w:t>
             </w:r>
           </w:p>
         </w:tc>
@@ -12151,19 +12547,19 @@
               <w:pStyle w:val="NormalWeb"/>
             </w:pPr>
             <w:r>
-              <w:t xml:space="preserve">1. Patient opens "My Appointments". </w:t>
+              <w:t xml:space="preserve">1. Patient selects appointment. </w:t>
             </w:r>
             <w:r>
               <w:br/>
-            </w:r>
-            <w:r>
-              <w:t xml:space="preserve">2. System retrieves appointment records. </w:t>
+              <w:t xml:space="preserve">2. Chooses cancel or reschedule. </w:t>
             </w:r>
             <w:r>
               <w:br/>
-            </w:r>
-            <w:r>
-              <w:t>3. List displayed with date, doctor, status.</w:t>
+              <w:t xml:space="preserve">3. Selects new slot if rescheduling. </w:t>
+            </w:r>
+            <w:r>
+              <w:br/>
+              <w:t>4. System updates record and notifies doctor.</w:t>
             </w:r>
           </w:p>
         </w:tc>
@@ -12193,7 +12589,7 @@
               <w:pStyle w:val="NormalWeb"/>
             </w:pPr>
             <w:r>
-              <w:t>No appointments found → Message displayed.</w:t>
+              <w:t>Appointment already completed → Cannot modify.</w:t>
             </w:r>
           </w:p>
         </w:tc>
@@ -12223,7 +12619,7 @@
               <w:pStyle w:val="NormalWeb"/>
             </w:pPr>
             <w:r>
-              <w:t>Appointment history displayed.</w:t>
+              <w:t>Appointment updated or removed.</w:t>
             </w:r>
           </w:p>
         </w:tc>
@@ -12237,15 +12633,13 @@
       </w:pPr>
       <w:r>
         <w:rPr>
-          <w:b/>
-          <w:bCs/>
           <w:noProof/>
         </w:rPr>
         <w:drawing>
-          <wp:inline distT="0" distB="0" distL="0" distR="0" wp14:anchorId="7DB9C5A5" wp14:editId="1BB8C86D">
-            <wp:extent cx="2971800" cy="1424940"/>
-            <wp:effectExtent l="0" t="0" r="0" b="3810"/>
-            <wp:docPr id="1242992986" name="Picture 23"/>
+          <wp:inline distT="0" distB="0" distL="0" distR="0" wp14:anchorId="043B2E25" wp14:editId="615B2017">
+            <wp:extent cx="4107180" cy="1592580"/>
+            <wp:effectExtent l="0" t="0" r="7620" b="7620"/>
+            <wp:docPr id="1102540594" name="Picture 17"/>
             <wp:cNvGraphicFramePr>
               <a:graphicFrameLocks xmlns:a="http://schemas.openxmlformats.org/drawingml/2006/main" noChangeAspect="1"/>
             </wp:cNvGraphicFramePr>
@@ -12253,20 +12647,20 @@
               <a:graphicData uri="http://schemas.openxmlformats.org/drawingml/2006/picture">
                 <pic:pic xmlns:pic="http://schemas.openxmlformats.org/drawingml/2006/picture">
                   <pic:nvPicPr>
-                    <pic:cNvPr id="0" name="Picture 49"/>
+                    <pic:cNvPr id="0" name="Picture 13"/>
                     <pic:cNvPicPr>
                       <a:picLocks noChangeAspect="1" noChangeArrowheads="1"/>
                     </pic:cNvPicPr>
                   </pic:nvPicPr>
                   <pic:blipFill rotWithShape="1">
-                    <a:blip r:embed="rId18">
+                    <a:blip r:embed="rId19">
                       <a:extLst>
                         <a:ext uri="{28A0092B-C50C-407E-A947-70E740481C1C}">
                           <a14:useLocalDpi xmlns:a14="http://schemas.microsoft.com/office/drawing/2010/main" val="0"/>
                         </a:ext>
                       </a:extLst>
                     </a:blip>
-                    <a:srcRect l="2697" t="4151" r="22158" b="25283"/>
+                    <a:srcRect l="2241" r="22269" b="25357"/>
                     <a:stretch>
                       <a:fillRect/>
                     </a:stretch>
@@ -12274,7 +12668,7 @@
                   <pic:spPr bwMode="auto">
                     <a:xfrm>
                       <a:off x="0" y="0"/>
-                      <a:ext cx="2971800" cy="1424940"/>
+                      <a:ext cx="4107180" cy="1592580"/>
                     </a:xfrm>
                     <a:prstGeom prst="rect">
                       <a:avLst/>
@@ -12313,14 +12707,14 @@
           <w:rPr>
             <w:noProof/>
           </w:rPr>
-          <w:t>8</w:t>
+          <w:t>9</w:t>
         </w:r>
       </w:fldSimple>
       <w:r>
         <w:t xml:space="preserve"> Patient </w:t>
       </w:r>
       <w:r>
-        <w:t>View Appointment History</w:t>
+        <w:t>Cancel or Reschedule Appointment</w:t>
       </w:r>
       <w:r>
         <w:t xml:space="preserve"> Use Case Diagram</w:t>
@@ -12335,7 +12729,7 @@
           <w:b/>
           <w:bCs/>
         </w:rPr>
-        <w:t>UC-204: Cancel or Reschedule Appointment</w:t>
+        <w:t>UC-205: View Medical History</w:t>
       </w:r>
     </w:p>
     <w:tbl>
@@ -12397,7 +12791,6 @@
               <w:pStyle w:val="NormalWeb"/>
             </w:pPr>
             <w:r>
-              <w:lastRenderedPageBreak/>
               <w:t>Use Case ID</w:t>
             </w:r>
           </w:p>
@@ -12412,7 +12805,7 @@
               <w:pStyle w:val="NormalWeb"/>
             </w:pPr>
             <w:r>
-              <w:t>UC-204</w:t>
+              <w:t>UC-205</w:t>
             </w:r>
           </w:p>
         </w:tc>
@@ -12442,7 +12835,7 @@
               <w:pStyle w:val="NormalWeb"/>
             </w:pPr>
             <w:r>
-              <w:t>Cancel or Reschedule Appointment</w:t>
+              <w:t>View Medical History</w:t>
             </w:r>
           </w:p>
         </w:tc>
@@ -12502,7 +12895,7 @@
               <w:pStyle w:val="NormalWeb"/>
             </w:pPr>
             <w:r>
-              <w:t>Allows patients to cancel or reschedule an existing appointment.</w:t>
+              <w:t>Allows patients to view their full medical history including diagnoses and prescriptions.</w:t>
             </w:r>
           </w:p>
         </w:tc>
@@ -12532,7 +12925,7 @@
               <w:pStyle w:val="NormalWeb"/>
             </w:pPr>
             <w:r>
-              <w:t>Appointment must exist and not have already passed.</w:t>
+              <w:t>Patient must be logged in.</w:t>
             </w:r>
           </w:p>
         </w:tc>
@@ -12562,19 +12955,15 @@
               <w:pStyle w:val="NormalWeb"/>
             </w:pPr>
             <w:r>
-              <w:t xml:space="preserve">1. Patient selects appointment. </w:t>
+              <w:t xml:space="preserve">1. Patient opens "Medical History". </w:t>
             </w:r>
             <w:r>
               <w:br/>
-              <w:t xml:space="preserve">2. Chooses cancel or reschedule. </w:t>
+              <w:t xml:space="preserve">2. System retrieves all past visit records. </w:t>
             </w:r>
             <w:r>
               <w:br/>
-              <w:t xml:space="preserve">3. Selects new slot if rescheduling. </w:t>
-            </w:r>
-            <w:r>
-              <w:br/>
-              <w:t>4. System updates record and notifies doctor.</w:t>
+              <w:t>3. Visits displayed chronologically with details.</w:t>
             </w:r>
           </w:p>
         </w:tc>
@@ -12604,7 +12993,7 @@
               <w:pStyle w:val="NormalWeb"/>
             </w:pPr>
             <w:r>
-              <w:t>Appointment already completed → Cannot modify.</w:t>
+              <w:t>No records found → Message displayed.</w:t>
             </w:r>
           </w:p>
         </w:tc>
@@ -12634,7 +13023,7 @@
               <w:pStyle w:val="NormalWeb"/>
             </w:pPr>
             <w:r>
-              <w:t>Appointment updated or removed.</w:t>
+              <w:t>Medical history shown to patient.</w:t>
             </w:r>
           </w:p>
         </w:tc>
@@ -12648,15 +13037,14 @@
       </w:pPr>
       <w:r>
         <w:rPr>
-          <w:b/>
-          <w:bCs/>
-          <w:noProof/>
-        </w:rPr>
+          <w:noProof/>
+        </w:rPr>
+        <w:lastRenderedPageBreak/>
         <w:drawing>
-          <wp:inline distT="0" distB="0" distL="0" distR="0" wp14:anchorId="4B2546A9" wp14:editId="69F4B89A">
-            <wp:extent cx="4191000" cy="1516380"/>
-            <wp:effectExtent l="0" t="0" r="0" b="0"/>
-            <wp:docPr id="1353820748" name="Picture 22"/>
+          <wp:inline distT="0" distB="0" distL="0" distR="0" wp14:anchorId="375B7155" wp14:editId="3FC772A5">
+            <wp:extent cx="2811780" cy="1737360"/>
+            <wp:effectExtent l="0" t="0" r="7620" b="0"/>
+            <wp:docPr id="639606434" name="Picture 18"/>
             <wp:cNvGraphicFramePr>
               <a:graphicFrameLocks xmlns:a="http://schemas.openxmlformats.org/drawingml/2006/main" noChangeAspect="1"/>
             </wp:cNvGraphicFramePr>
@@ -12664,20 +13052,20 @@
               <a:graphicData uri="http://schemas.openxmlformats.org/drawingml/2006/picture">
                 <pic:pic xmlns:pic="http://schemas.openxmlformats.org/drawingml/2006/picture">
                   <pic:nvPicPr>
-                    <pic:cNvPr id="0" name="Picture 48"/>
+                    <pic:cNvPr id="0" name="Picture 14"/>
                     <pic:cNvPicPr>
                       <a:picLocks noChangeAspect="1" noChangeArrowheads="1"/>
                     </pic:cNvPicPr>
                   </pic:nvPicPr>
                   <pic:blipFill rotWithShape="1">
-                    <a:blip r:embed="rId19">
+                    <a:blip r:embed="rId20">
                       <a:extLst>
                         <a:ext uri="{28A0092B-C50C-407E-A947-70E740481C1C}">
                           <a14:useLocalDpi xmlns:a14="http://schemas.microsoft.com/office/drawing/2010/main" val="0"/>
                         </a:ext>
                       </a:extLst>
                     </a:blip>
-                    <a:srcRect l="1808" t="5000" r="21697" b="23929"/>
+                    <a:srcRect l="3206" r="22845" b="25246"/>
                     <a:stretch>
                       <a:fillRect/>
                     </a:stretch>
@@ -12685,7 +13073,7 @@
                   <pic:spPr bwMode="auto">
                     <a:xfrm>
                       <a:off x="0" y="0"/>
-                      <a:ext cx="4191000" cy="1516380"/>
+                      <a:ext cx="2811780" cy="1737360"/>
                     </a:xfrm>
                     <a:prstGeom prst="rect">
                       <a:avLst/>
@@ -12724,14 +13112,14 @@
           <w:rPr>
             <w:noProof/>
           </w:rPr>
-          <w:t>9</w:t>
+          <w:t>10</w:t>
         </w:r>
       </w:fldSimple>
       <w:r>
         <w:t xml:space="preserve"> Patient </w:t>
       </w:r>
       <w:r>
-        <w:t>Cancel or Reschedule Appointment</w:t>
+        <w:t>View Medical History</w:t>
       </w:r>
       <w:r>
         <w:t xml:space="preserve"> Use Case Diagram</w:t>
@@ -12746,7 +13134,7 @@
           <w:b/>
           <w:bCs/>
         </w:rPr>
-        <w:t>UC-205: View Medical History</w:t>
+        <w:t>UC-206: View Lab Reports</w:t>
       </w:r>
     </w:p>
     <w:tbl>
@@ -12822,7 +13210,7 @@
               <w:pStyle w:val="NormalWeb"/>
             </w:pPr>
             <w:r>
-              <w:t>UC-205</w:t>
+              <w:t>UC-206</w:t>
             </w:r>
           </w:p>
         </w:tc>
@@ -12852,7 +13240,7 @@
               <w:pStyle w:val="NormalWeb"/>
             </w:pPr>
             <w:r>
-              <w:t>View Medical History</w:t>
+              <w:t>View Lab Reports</w:t>
             </w:r>
           </w:p>
         </w:tc>
@@ -12912,7 +13300,7 @@
               <w:pStyle w:val="NormalWeb"/>
             </w:pPr>
             <w:r>
-              <w:t>Allows patients to view their full medical history including diagnoses and prescriptions.</w:t>
+              <w:t>Allows patients to view laboratory test results linked to their account.</w:t>
             </w:r>
           </w:p>
         </w:tc>
@@ -12942,7 +13330,7 @@
               <w:pStyle w:val="NormalWeb"/>
             </w:pPr>
             <w:r>
-              <w:t>Patient must be logged in.</w:t>
+              <w:t>Lab results must be uploaded by lab staff.</w:t>
             </w:r>
           </w:p>
         </w:tc>
@@ -12972,15 +13360,15 @@
               <w:pStyle w:val="NormalWeb"/>
             </w:pPr>
             <w:r>
-              <w:t xml:space="preserve">1. Patient opens "Medical History". </w:t>
+              <w:t>1. Patient opens "Lab Reports".</w:t>
             </w:r>
             <w:r>
               <w:br/>
-              <w:t xml:space="preserve">2. System retrieves all past visit records. </w:t>
+              <w:t xml:space="preserve">2. System retrieves test results. </w:t>
             </w:r>
             <w:r>
               <w:br/>
-              <w:t>3. Visits displayed chronologically with details.</w:t>
+              <w:t>3. Results displayed with status (Pending/Available).</w:t>
             </w:r>
           </w:p>
         </w:tc>
@@ -13010,7 +13398,7 @@
               <w:pStyle w:val="NormalWeb"/>
             </w:pPr>
             <w:r>
-              <w:t>No records found → Message displayed.</w:t>
+              <w:t>No reports found → Message displayed.</w:t>
             </w:r>
           </w:p>
         </w:tc>
@@ -13040,7 +13428,7 @@
               <w:pStyle w:val="NormalWeb"/>
             </w:pPr>
             <w:r>
-              <w:t>Medical history shown to patient.</w:t>
+              <w:t>Lab results displayed to patient.</w:t>
             </w:r>
           </w:p>
         </w:tc>
@@ -13054,16 +13442,13 @@
       </w:pPr>
       <w:r>
         <w:rPr>
-          <w:b/>
-          <w:bCs/>
-          <w:noProof/>
-        </w:rPr>
-        <w:lastRenderedPageBreak/>
+          <w:noProof/>
+        </w:rPr>
         <w:drawing>
-          <wp:inline distT="0" distB="0" distL="0" distR="0" wp14:anchorId="793BAA5D" wp14:editId="0DFEEC3D">
-            <wp:extent cx="2948940" cy="1798320"/>
+          <wp:inline distT="0" distB="0" distL="0" distR="0" wp14:anchorId="03828375" wp14:editId="2A68EA2C">
+            <wp:extent cx="2552700" cy="1447800"/>
             <wp:effectExtent l="0" t="0" r="0" b="0"/>
-            <wp:docPr id="1069251031" name="Picture 21"/>
+            <wp:docPr id="1036516245" name="Picture 19"/>
             <wp:cNvGraphicFramePr>
               <a:graphicFrameLocks xmlns:a="http://schemas.openxmlformats.org/drawingml/2006/main" noChangeAspect="1"/>
             </wp:cNvGraphicFramePr>
@@ -13071,20 +13456,20 @@
               <a:graphicData uri="http://schemas.openxmlformats.org/drawingml/2006/picture">
                 <pic:pic xmlns:pic="http://schemas.openxmlformats.org/drawingml/2006/picture">
                   <pic:nvPicPr>
-                    <pic:cNvPr id="0" name="Picture 47"/>
+                    <pic:cNvPr id="0" name="Picture 15"/>
                     <pic:cNvPicPr>
                       <a:picLocks noChangeAspect="1" noChangeArrowheads="1"/>
                     </pic:cNvPicPr>
                   </pic:nvPicPr>
                   <pic:blipFill rotWithShape="1">
-                    <a:blip r:embed="rId20">
+                    <a:blip r:embed="rId21">
                       <a:extLst>
                         <a:ext uri="{28A0092B-C50C-407E-A947-70E740481C1C}">
                           <a14:useLocalDpi xmlns:a14="http://schemas.microsoft.com/office/drawing/2010/main" val="0"/>
                         </a:ext>
                       </a:extLst>
                     </a:blip>
-                    <a:srcRect l="2140" t="4262" r="22568" b="18361"/>
+                    <a:srcRect r="22811" b="26923"/>
                     <a:stretch>
                       <a:fillRect/>
                     </a:stretch>
@@ -13092,7 +13477,7 @@
                   <pic:spPr bwMode="auto">
                     <a:xfrm>
                       <a:off x="0" y="0"/>
-                      <a:ext cx="2948940" cy="1798320"/>
+                      <a:ext cx="2552700" cy="1447800"/>
                     </a:xfrm>
                     <a:prstGeom prst="rect">
                       <a:avLst/>
@@ -13131,14 +13516,14 @@
           <w:rPr>
             <w:noProof/>
           </w:rPr>
-          <w:t>10</w:t>
+          <w:t>11</w:t>
         </w:r>
       </w:fldSimple>
       <w:r>
         <w:t xml:space="preserve"> Patient </w:t>
       </w:r>
       <w:r>
-        <w:t>View Medical History</w:t>
+        <w:t>View Lab Reports</w:t>
       </w:r>
       <w:r>
         <w:t xml:space="preserve"> Use Case Diagram</w:t>
@@ -13153,7 +13538,7 @@
           <w:b/>
           <w:bCs/>
         </w:rPr>
-        <w:t>UC-206: View Lab Reports</w:t>
+        <w:t>UC-207: View Billing and Invoices</w:t>
       </w:r>
     </w:p>
     <w:tbl>
@@ -13215,6 +13600,7 @@
               <w:pStyle w:val="NormalWeb"/>
             </w:pPr>
             <w:r>
+              <w:lastRenderedPageBreak/>
               <w:t>Use Case ID</w:t>
             </w:r>
           </w:p>
@@ -13229,7 +13615,7 @@
               <w:pStyle w:val="NormalWeb"/>
             </w:pPr>
             <w:r>
-              <w:t>UC-206</w:t>
+              <w:t>UC-207</w:t>
             </w:r>
           </w:p>
         </w:tc>
@@ -13259,7 +13645,7 @@
               <w:pStyle w:val="NormalWeb"/>
             </w:pPr>
             <w:r>
-              <w:t>View Lab Reports</w:t>
+              <w:t>View Billing and Invoices</w:t>
             </w:r>
           </w:p>
         </w:tc>
@@ -13319,7 +13705,7 @@
               <w:pStyle w:val="NormalWeb"/>
             </w:pPr>
             <w:r>
-              <w:t>Allows patients to view laboratory test results linked to their account.</w:t>
+              <w:t>Allows patients to view invoices generated for their hospital visits.</w:t>
             </w:r>
           </w:p>
         </w:tc>
@@ -13349,7 +13735,7 @@
               <w:pStyle w:val="NormalWeb"/>
             </w:pPr>
             <w:r>
-              <w:t>Lab results must be uploaded by lab staff.</w:t>
+              <w:t>Invoice must have been generated by admin.</w:t>
             </w:r>
           </w:p>
         </w:tc>
@@ -13379,15 +13765,15 @@
               <w:pStyle w:val="NormalWeb"/>
             </w:pPr>
             <w:r>
-              <w:t>1. Patient opens "Lab Reports".</w:t>
+              <w:t xml:space="preserve">1. Patient opens "Billing". </w:t>
             </w:r>
             <w:r>
               <w:br/>
-              <w:t xml:space="preserve">2. System retrieves test results. </w:t>
+              <w:t xml:space="preserve">2. System retrieves invoices. </w:t>
             </w:r>
             <w:r>
               <w:br/>
-              <w:t>3. Results displayed with status (Pending/Available).</w:t>
+              <w:t>3. Invoice details displayed with payment status.</w:t>
             </w:r>
           </w:p>
         </w:tc>
@@ -13417,7 +13803,7 @@
               <w:pStyle w:val="NormalWeb"/>
             </w:pPr>
             <w:r>
-              <w:t>No reports found → Message displayed.</w:t>
+              <w:t>No invoices found → Message displayed.</w:t>
             </w:r>
           </w:p>
         </w:tc>
@@ -13447,7 +13833,7 @@
               <w:pStyle w:val="NormalWeb"/>
             </w:pPr>
             <w:r>
-              <w:t>Lab results displayed to patient.</w:t>
+              <w:t>Invoice shown to patient.</w:t>
             </w:r>
           </w:p>
         </w:tc>
@@ -13461,15 +13847,13 @@
       </w:pPr>
       <w:r>
         <w:rPr>
-          <w:b/>
-          <w:bCs/>
           <w:noProof/>
         </w:rPr>
         <w:drawing>
-          <wp:inline distT="0" distB="0" distL="0" distR="0" wp14:anchorId="0B922DE5" wp14:editId="438BB37D">
-            <wp:extent cx="2720340" cy="1440180"/>
-            <wp:effectExtent l="0" t="0" r="3810" b="0"/>
-            <wp:docPr id="2014828845" name="Picture 20"/>
+          <wp:inline distT="0" distB="0" distL="0" distR="0" wp14:anchorId="69DF2246" wp14:editId="7C8AF89B">
+            <wp:extent cx="3329940" cy="1516380"/>
+            <wp:effectExtent l="0" t="0" r="0" b="0"/>
+            <wp:docPr id="1641233396" name="Picture 20"/>
             <wp:cNvGraphicFramePr>
               <a:graphicFrameLocks xmlns:a="http://schemas.openxmlformats.org/drawingml/2006/main" noChangeAspect="1"/>
             </wp:cNvGraphicFramePr>
@@ -13477,20 +13861,20 @@
               <a:graphicData uri="http://schemas.openxmlformats.org/drawingml/2006/picture">
                 <pic:pic xmlns:pic="http://schemas.openxmlformats.org/drawingml/2006/picture">
                   <pic:nvPicPr>
-                    <pic:cNvPr id="0" name="Picture 46"/>
+                    <pic:cNvPr id="0" name="Picture 16"/>
                     <pic:cNvPicPr>
                       <a:picLocks noChangeAspect="1" noChangeArrowheads="1"/>
                     </pic:cNvPicPr>
                   </pic:nvPicPr>
                   <pic:blipFill rotWithShape="1">
-                    <a:blip r:embed="rId21">
+                    <a:blip r:embed="rId22">
                       <a:extLst>
                         <a:ext uri="{28A0092B-C50C-407E-A947-70E740481C1C}">
                           <a14:useLocalDpi xmlns:a14="http://schemas.microsoft.com/office/drawing/2010/main" val="0"/>
                         </a:ext>
                       </a:extLst>
                     </a:blip>
-                    <a:srcRect l="2894" t="4231" r="23346" b="23077"/>
+                    <a:srcRect l="3735" r="22071" b="24906"/>
                     <a:stretch>
                       <a:fillRect/>
                     </a:stretch>
@@ -13498,7 +13882,7 @@
                   <pic:spPr bwMode="auto">
                     <a:xfrm>
                       <a:off x="0" y="0"/>
-                      <a:ext cx="2720340" cy="1440180"/>
+                      <a:ext cx="3329940" cy="1516380"/>
                     </a:xfrm>
                     <a:prstGeom prst="rect">
                       <a:avLst/>
@@ -13525,8 +13909,10 @@
         <w:pStyle w:val="Caption"/>
         <w:jc w:val="center"/>
         <w:rPr>
-          <w:b/>
-          <w:bCs/>
+          <w:rStyle w:val="Strong"/>
+          <w:rFonts w:ascii="Arial" w:hAnsi="Arial"/>
+          <w:iCs w:val="0"/>
+          <w:szCs w:val="20"/>
         </w:rPr>
       </w:pPr>
       <w:r>
@@ -13537,17 +13923,37 @@
           <w:rPr>
             <w:noProof/>
           </w:rPr>
-          <w:t>11</w:t>
+          <w:t>12</w:t>
         </w:r>
       </w:fldSimple>
       <w:r>
         <w:t xml:space="preserve"> Patient </w:t>
       </w:r>
       <w:r>
-        <w:t>View Lab Reports</w:t>
+        <w:t>View Billing and Invoices</w:t>
       </w:r>
       <w:r>
         <w:t xml:space="preserve"> Use Case Diagram</w:t>
+      </w:r>
+    </w:p>
+    <w:p>
+      <w:pPr>
+        <w:pStyle w:val="NormalWeb"/>
+        <w:rPr>
+          <w:rStyle w:val="Strong"/>
+          <w:rFonts w:ascii="Arial" w:eastAsiaTheme="minorHAnsi" w:hAnsi="Arial" w:cstheme="minorBidi"/>
+          <w:iCs/>
+          <w:szCs w:val="20"/>
+        </w:rPr>
+      </w:pPr>
+      <w:r>
+        <w:rPr>
+          <w:rStyle w:val="Strong"/>
+          <w:rFonts w:ascii="Arial" w:eastAsiaTheme="minorHAnsi" w:hAnsi="Arial" w:cstheme="minorBidi"/>
+          <w:iCs/>
+          <w:szCs w:val="20"/>
+        </w:rPr>
+        <w:t>3.3.3 Doctor Use Cases</w:t>
       </w:r>
     </w:p>
     <w:p>
@@ -13559,7 +13965,7 @@
           <w:b/>
           <w:bCs/>
         </w:rPr>
-        <w:t>UC-207: View Billing and Invoices</w:t>
+        <w:t>UC-301: Doctor Dashboard</w:t>
       </w:r>
     </w:p>
     <w:tbl>
@@ -13621,7 +14027,6 @@
               <w:pStyle w:val="NormalWeb"/>
             </w:pPr>
             <w:r>
-              <w:lastRenderedPageBreak/>
               <w:t>Use Case ID</w:t>
             </w:r>
           </w:p>
@@ -13636,7 +14041,7 @@
               <w:pStyle w:val="NormalWeb"/>
             </w:pPr>
             <w:r>
-              <w:t>UC-207</w:t>
+              <w:t>UC-301</w:t>
             </w:r>
           </w:p>
         </w:tc>
@@ -13666,7 +14071,7 @@
               <w:pStyle w:val="NormalWeb"/>
             </w:pPr>
             <w:r>
-              <w:t>View Billing and Invoices</w:t>
+              <w:t>Doctor Dashboard</w:t>
             </w:r>
           </w:p>
         </w:tc>
@@ -13696,7 +14101,7 @@
               <w:pStyle w:val="NormalWeb"/>
             </w:pPr>
             <w:r>
-              <w:t>Patient</w:t>
+              <w:t>Doctor</w:t>
             </w:r>
           </w:p>
         </w:tc>
@@ -13726,7 +14131,7 @@
               <w:pStyle w:val="NormalWeb"/>
             </w:pPr>
             <w:r>
-              <w:t>Allows patients to view invoices generated for their hospital visits.</w:t>
+              <w:t>Provides the doctor with a summary of today's appointments and pending tasks.</w:t>
             </w:r>
           </w:p>
         </w:tc>
@@ -13756,7 +14161,7 @@
               <w:pStyle w:val="NormalWeb"/>
             </w:pPr>
             <w:r>
-              <w:t>Invoice must have been generated by admin.</w:t>
+              <w:t>Doctor must be logged in.</w:t>
             </w:r>
           </w:p>
         </w:tc>
@@ -13786,15 +14191,15 @@
               <w:pStyle w:val="NormalWeb"/>
             </w:pPr>
             <w:r>
-              <w:t xml:space="preserve">1. Patient opens "Billing". </w:t>
+              <w:t xml:space="preserve">1. Doctor logs in. </w:t>
             </w:r>
             <w:r>
               <w:br/>
-              <w:t xml:space="preserve">2. System retrieves invoices. </w:t>
+              <w:t xml:space="preserve">2. System loads dashboard. </w:t>
             </w:r>
             <w:r>
               <w:br/>
-              <w:t>3. Invoice details displayed with payment status.</w:t>
+              <w:t>3. Appointments, patient alerts, and pending prescriptions displayed.</w:t>
             </w:r>
           </w:p>
         </w:tc>
@@ -13824,7 +14229,7 @@
               <w:pStyle w:val="NormalWeb"/>
             </w:pPr>
             <w:r>
-              <w:t>No invoices found → Message displayed.</w:t>
+              <w:t>No appointments today → Message displayed.</w:t>
             </w:r>
           </w:p>
         </w:tc>
@@ -13854,7 +14259,7 @@
               <w:pStyle w:val="NormalWeb"/>
             </w:pPr>
             <w:r>
-              <w:t>Invoice shown to patient.</w:t>
+              <w:t>Dashboard loaded successfully.</w:t>
             </w:r>
           </w:p>
         </w:tc>
@@ -13868,17 +14273,14 @@
       </w:pPr>
       <w:r>
         <w:rPr>
-          <w:rStyle w:val="Strong"/>
-          <w:rFonts w:ascii="Arial" w:eastAsiaTheme="minorHAnsi" w:hAnsi="Arial" w:cstheme="minorBidi"/>
-          <w:iCs/>
-          <w:noProof/>
-          <w:szCs w:val="20"/>
-        </w:rPr>
+          <w:noProof/>
+        </w:rPr>
+        <w:lastRenderedPageBreak/>
         <w:drawing>
-          <wp:inline distT="0" distB="0" distL="0" distR="0" wp14:anchorId="6AC23407" wp14:editId="406459B7">
-            <wp:extent cx="3505200" cy="1379220"/>
-            <wp:effectExtent l="0" t="0" r="0" b="0"/>
-            <wp:docPr id="438205191" name="Picture 19"/>
+          <wp:inline distT="0" distB="0" distL="0" distR="0" wp14:anchorId="1A08B7B7" wp14:editId="1C55F04C">
+            <wp:extent cx="2583180" cy="1790700"/>
+            <wp:effectExtent l="0" t="0" r="7620" b="0"/>
+            <wp:docPr id="2054144289" name="Picture 21"/>
             <wp:cNvGraphicFramePr>
               <a:graphicFrameLocks xmlns:a="http://schemas.openxmlformats.org/drawingml/2006/main" noChangeAspect="1"/>
             </wp:cNvGraphicFramePr>
@@ -13886,20 +14288,20 @@
               <a:graphicData uri="http://schemas.openxmlformats.org/drawingml/2006/picture">
                 <pic:pic xmlns:pic="http://schemas.openxmlformats.org/drawingml/2006/picture">
                   <pic:nvPicPr>
-                    <pic:cNvPr id="0" name="Picture 45"/>
+                    <pic:cNvPr id="0" name="Picture 17"/>
                     <pic:cNvPicPr>
                       <a:picLocks noChangeAspect="1" noChangeArrowheads="1"/>
                     </pic:cNvPicPr>
                   </pic:nvPicPr>
                   <pic:blipFill rotWithShape="1">
-                    <a:blip r:embed="rId22">
+                    <a:blip r:embed="rId23">
                       <a:extLst>
                         <a:ext uri="{28A0092B-C50C-407E-A947-70E740481C1C}">
                           <a14:useLocalDpi xmlns:a14="http://schemas.microsoft.com/office/drawing/2010/main" val="0"/>
                         </a:ext>
                       </a:extLst>
                     </a:blip>
-                    <a:srcRect l="2606" t="5283" r="22476" b="26415"/>
+                    <a:srcRect l="3233" r="23707" b="24193"/>
                     <a:stretch>
                       <a:fillRect/>
                     </a:stretch>
@@ -13907,7 +14309,7 @@
                   <pic:spPr bwMode="auto">
                     <a:xfrm>
                       <a:off x="0" y="0"/>
-                      <a:ext cx="3505200" cy="1379220"/>
+                      <a:ext cx="2583180" cy="1790700"/>
                     </a:xfrm>
                     <a:prstGeom prst="rect">
                       <a:avLst/>
@@ -13934,10 +14336,8 @@
         <w:pStyle w:val="Caption"/>
         <w:jc w:val="center"/>
         <w:rPr>
-          <w:rStyle w:val="Strong"/>
-          <w:rFonts w:ascii="Arial" w:hAnsi="Arial"/>
-          <w:iCs w:val="0"/>
-          <w:szCs w:val="20"/>
+          <w:b/>
+          <w:bCs/>
         </w:rPr>
       </w:pPr>
       <w:r>
@@ -13948,37 +14348,11 @@
           <w:rPr>
             <w:noProof/>
           </w:rPr>
-          <w:t>12</w:t>
+          <w:t>13</w:t>
         </w:r>
       </w:fldSimple>
       <w:r>
-        <w:t xml:space="preserve"> Patient </w:t>
-      </w:r>
-      <w:r>
-        <w:t>View Billing and Invoices</w:t>
-      </w:r>
-      <w:r>
-        <w:t xml:space="preserve"> Use Case Diagram</w:t>
-      </w:r>
-    </w:p>
-    <w:p>
-      <w:pPr>
-        <w:pStyle w:val="NormalWeb"/>
-        <w:rPr>
-          <w:rStyle w:val="Strong"/>
-          <w:rFonts w:ascii="Arial" w:eastAsiaTheme="minorHAnsi" w:hAnsi="Arial" w:cstheme="minorBidi"/>
-          <w:iCs/>
-          <w:szCs w:val="20"/>
-        </w:rPr>
-      </w:pPr>
-      <w:r>
-        <w:rPr>
-          <w:rStyle w:val="Strong"/>
-          <w:rFonts w:ascii="Arial" w:eastAsiaTheme="minorHAnsi" w:hAnsi="Arial" w:cstheme="minorBidi"/>
-          <w:iCs/>
-          <w:szCs w:val="20"/>
-        </w:rPr>
-        <w:t>3.3.3 Doctor Use Cases</w:t>
+        <w:t xml:space="preserve"> Doctor Dashboard Use Case Diagram</w:t>
       </w:r>
     </w:p>
     <w:p>
@@ -13990,7 +14364,7 @@
           <w:b/>
           <w:bCs/>
         </w:rPr>
-        <w:t>UC-301: Doctor Dashboard</w:t>
+        <w:t>UC-302: View and Manage Appointments</w:t>
       </w:r>
     </w:p>
     <w:tbl>
@@ -14066,7 +14440,7 @@
               <w:pStyle w:val="NormalWeb"/>
             </w:pPr>
             <w:r>
-              <w:t>UC-301</w:t>
+              <w:t>UC-302</w:t>
             </w:r>
           </w:p>
         </w:tc>
@@ -14096,7 +14470,7 @@
               <w:pStyle w:val="NormalWeb"/>
             </w:pPr>
             <w:r>
-              <w:t>Doctor Dashboard</w:t>
+              <w:t>View and Manage Appointments</w:t>
             </w:r>
           </w:p>
         </w:tc>
@@ -14156,7 +14530,7 @@
               <w:pStyle w:val="NormalWeb"/>
             </w:pPr>
             <w:r>
-              <w:t>Provides the doctor with a summary of today's appointments and pending tasks.</w:t>
+              <w:t>Allows doctors to view their appointment schedule and manage availability.</w:t>
             </w:r>
           </w:p>
         </w:tc>
@@ -14216,15 +14590,15 @@
               <w:pStyle w:val="NormalWeb"/>
             </w:pPr>
             <w:r>
-              <w:t xml:space="preserve">1. Doctor logs in. </w:t>
+              <w:t xml:space="preserve">1. Doctor opens schedule. </w:t>
             </w:r>
             <w:r>
               <w:br/>
-              <w:t xml:space="preserve">2. System loads dashboard. </w:t>
+              <w:t xml:space="preserve">2. Views appointments by day or week. </w:t>
             </w:r>
             <w:r>
               <w:br/>
-              <w:t>3. Appointments, patient alerts, and pending prescriptions displayed.</w:t>
+              <w:t>3. Marks unavailable slots or reviews upcoming bookings.</w:t>
             </w:r>
           </w:p>
         </w:tc>
@@ -14254,7 +14628,7 @@
               <w:pStyle w:val="NormalWeb"/>
             </w:pPr>
             <w:r>
-              <w:t>No appointments today → Message displayed.</w:t>
+              <w:t>No appointments found.</w:t>
             </w:r>
           </w:p>
         </w:tc>
@@ -14284,7 +14658,7 @@
               <w:pStyle w:val="NormalWeb"/>
             </w:pPr>
             <w:r>
-              <w:t>Dashboard loaded successfully.</w:t>
+              <w:t>Schedule displayed and updated.</w:t>
             </w:r>
           </w:p>
         </w:tc>
@@ -14298,16 +14672,13 @@
       </w:pPr>
       <w:r>
         <w:rPr>
-          <w:b/>
-          <w:bCs/>
-          <w:noProof/>
-        </w:rPr>
-        <w:lastRenderedPageBreak/>
+          <w:noProof/>
+        </w:rPr>
         <w:drawing>
-          <wp:inline distT="0" distB="0" distL="0" distR="0" wp14:anchorId="11B44F0A" wp14:editId="5EADACDF">
-            <wp:extent cx="2811780" cy="1691640"/>
+          <wp:inline distT="0" distB="0" distL="0" distR="0" wp14:anchorId="19339116" wp14:editId="521AF124">
+            <wp:extent cx="3474720" cy="1478280"/>
             <wp:effectExtent l="0" t="0" r="0" b="0"/>
-            <wp:docPr id="1775719199" name="Picture 18"/>
+            <wp:docPr id="515036719" name="Picture 22"/>
             <wp:cNvGraphicFramePr>
               <a:graphicFrameLocks xmlns:a="http://schemas.openxmlformats.org/drawingml/2006/main" noChangeAspect="1"/>
             </wp:cNvGraphicFramePr>
@@ -14315,20 +14686,20 @@
               <a:graphicData uri="http://schemas.openxmlformats.org/drawingml/2006/picture">
                 <pic:pic xmlns:pic="http://schemas.openxmlformats.org/drawingml/2006/picture">
                   <pic:nvPicPr>
-                    <pic:cNvPr id="0" name="Picture 44"/>
+                    <pic:cNvPr id="0" name="Picture 18"/>
                     <pic:cNvPicPr>
                       <a:picLocks noChangeAspect="1" noChangeArrowheads="1"/>
                     </pic:cNvPicPr>
                   </pic:nvPicPr>
                   <pic:blipFill rotWithShape="1">
-                    <a:blip r:embed="rId23">
+                    <a:blip r:embed="rId24">
                       <a:extLst>
                         <a:ext uri="{28A0092B-C50C-407E-A947-70E740481C1C}">
                           <a14:useLocalDpi xmlns:a14="http://schemas.microsoft.com/office/drawing/2010/main" val="0"/>
                         </a:ext>
                       </a:extLst>
                     </a:blip>
-                    <a:srcRect l="2249" t="4517" r="22290" b="23871"/>
+                    <a:srcRect l="2791" r="22332" b="23922"/>
                     <a:stretch>
                       <a:fillRect/>
                     </a:stretch>
@@ -14336,7 +14707,7 @@
                   <pic:spPr bwMode="auto">
                     <a:xfrm>
                       <a:off x="0" y="0"/>
-                      <a:ext cx="2811780" cy="1691640"/>
+                      <a:ext cx="3474720" cy="1478280"/>
                     </a:xfrm>
                     <a:prstGeom prst="rect">
                       <a:avLst/>
@@ -14375,11 +14746,17 @@
           <w:rPr>
             <w:noProof/>
           </w:rPr>
-          <w:t>13</w:t>
+          <w:t>14</w:t>
         </w:r>
       </w:fldSimple>
       <w:r>
-        <w:t xml:space="preserve"> Doctor Dashboard Use Case Diagram</w:t>
+        <w:t xml:space="preserve"> Doctor </w:t>
+      </w:r>
+      <w:r>
+        <w:t>View and Manage Appointments</w:t>
+      </w:r>
+      <w:r>
+        <w:t xml:space="preserve"> Use Case Diagram</w:t>
       </w:r>
     </w:p>
     <w:p>
@@ -14391,7 +14768,7 @@
           <w:b/>
           <w:bCs/>
         </w:rPr>
-        <w:t>UC-302: View and Manage Appointments</w:t>
+        <w:t>UC-303: View Patient Record</w:t>
       </w:r>
     </w:p>
     <w:tbl>
@@ -14453,6 +14830,7 @@
               <w:pStyle w:val="NormalWeb"/>
             </w:pPr>
             <w:r>
+              <w:lastRenderedPageBreak/>
               <w:t>Use Case ID</w:t>
             </w:r>
           </w:p>
@@ -14467,7 +14845,7 @@
               <w:pStyle w:val="NormalWeb"/>
             </w:pPr>
             <w:r>
-              <w:t>UC-302</w:t>
+              <w:t>UC-303</w:t>
             </w:r>
           </w:p>
         </w:tc>
@@ -14497,7 +14875,7 @@
               <w:pStyle w:val="NormalWeb"/>
             </w:pPr>
             <w:r>
-              <w:t>View and Manage Appointments</w:t>
+              <w:t>View Patient Record</w:t>
             </w:r>
           </w:p>
         </w:tc>
@@ -14557,7 +14935,7 @@
               <w:pStyle w:val="NormalWeb"/>
             </w:pPr>
             <w:r>
-              <w:t>Allows doctors to view their appointment schedule and manage availability.</w:t>
+              <w:t>Allows the doctor to view a patient's complete medical history during consultation.</w:t>
             </w:r>
           </w:p>
         </w:tc>
@@ -14587,7 +14965,7 @@
               <w:pStyle w:val="NormalWeb"/>
             </w:pPr>
             <w:r>
-              <w:t>Doctor must be logged in.</w:t>
+              <w:t>Patient must have a registered profile.</w:t>
             </w:r>
           </w:p>
         </w:tc>
@@ -14617,15 +14995,15 @@
               <w:pStyle w:val="NormalWeb"/>
             </w:pPr>
             <w:r>
-              <w:t xml:space="preserve">1. Doctor opens schedule. </w:t>
+              <w:t xml:space="preserve">1. Doctor selects a patient. </w:t>
             </w:r>
             <w:r>
               <w:br/>
-              <w:t xml:space="preserve">2. Views appointments by day or week. </w:t>
+              <w:t xml:space="preserve">2. System retrieves medical history. </w:t>
             </w:r>
             <w:r>
               <w:br/>
-              <w:t>3. Marks unavailable slots or reviews upcoming bookings.</w:t>
+              <w:t>3. Diagnoses, prescriptions, allergies, and lab results displayed.</w:t>
             </w:r>
           </w:p>
         </w:tc>
@@ -14655,7 +15033,7 @@
               <w:pStyle w:val="NormalWeb"/>
             </w:pPr>
             <w:r>
-              <w:t>No appointments found.</w:t>
+              <w:t>No records found → Message shown.</w:t>
             </w:r>
           </w:p>
         </w:tc>
@@ -14685,7 +15063,7 @@
               <w:pStyle w:val="NormalWeb"/>
             </w:pPr>
             <w:r>
-              <w:t>Schedule displayed and updated.</w:t>
+              <w:t>Patient records accessed by doctor.</w:t>
             </w:r>
           </w:p>
         </w:tc>
@@ -14699,15 +15077,13 @@
       </w:pPr>
       <w:r>
         <w:rPr>
-          <w:b/>
-          <w:bCs/>
           <w:noProof/>
         </w:rPr>
         <w:drawing>
-          <wp:inline distT="0" distB="0" distL="0" distR="0" wp14:anchorId="645ACD4B" wp14:editId="4824A65B">
-            <wp:extent cx="3764280" cy="1379220"/>
-            <wp:effectExtent l="0" t="0" r="0" b="0"/>
-            <wp:docPr id="1072809110" name="Picture 17"/>
+          <wp:inline distT="0" distB="0" distL="0" distR="0" wp14:anchorId="3F081A3C" wp14:editId="16781681">
+            <wp:extent cx="2567940" cy="1455420"/>
+            <wp:effectExtent l="0" t="0" r="3810" b="0"/>
+            <wp:docPr id="115240556" name="Picture 23"/>
             <wp:cNvGraphicFramePr>
               <a:graphicFrameLocks xmlns:a="http://schemas.openxmlformats.org/drawingml/2006/main" noChangeAspect="1"/>
             </wp:cNvGraphicFramePr>
@@ -14715,20 +15091,20 @@
               <a:graphicData uri="http://schemas.openxmlformats.org/drawingml/2006/picture">
                 <pic:pic xmlns:pic="http://schemas.openxmlformats.org/drawingml/2006/picture">
                   <pic:nvPicPr>
-                    <pic:cNvPr id="0" name="Picture 43"/>
+                    <pic:cNvPr id="0" name="Picture 19"/>
                     <pic:cNvPicPr>
                       <a:picLocks noChangeAspect="1" noChangeArrowheads="1"/>
                     </pic:cNvPicPr>
                   </pic:nvPicPr>
                   <pic:blipFill rotWithShape="1">
-                    <a:blip r:embed="rId24">
+                    <a:blip r:embed="rId25">
                       <a:extLst>
                         <a:ext uri="{28A0092B-C50C-407E-A947-70E740481C1C}">
                           <a14:useLocalDpi xmlns:a14="http://schemas.microsoft.com/office/drawing/2010/main" val="0"/>
                         </a:ext>
                       </a:extLst>
                     </a:blip>
-                    <a:srcRect l="2141" t="5098" r="22324" b="23922"/>
+                    <a:srcRect l="3665" t="4444" r="23706" b="24814"/>
                     <a:stretch>
                       <a:fillRect/>
                     </a:stretch>
@@ -14736,7 +15112,7 @@
                   <pic:spPr bwMode="auto">
                     <a:xfrm>
                       <a:off x="0" y="0"/>
-                      <a:ext cx="3764280" cy="1379220"/>
+                      <a:ext cx="2567940" cy="1455420"/>
                     </a:xfrm>
                     <a:prstGeom prst="rect">
                       <a:avLst/>
@@ -14775,14 +15151,14 @@
           <w:rPr>
             <w:noProof/>
           </w:rPr>
-          <w:t>14</w:t>
+          <w:t>15</w:t>
         </w:r>
       </w:fldSimple>
       <w:r>
         <w:t xml:space="preserve"> Doctor </w:t>
       </w:r>
       <w:r>
-        <w:t>View and Manage Appointments</w:t>
+        <w:t>View Patient Record</w:t>
       </w:r>
       <w:r>
         <w:t xml:space="preserve"> Use Case Diagram</w:t>
@@ -14797,7 +15173,7 @@
           <w:b/>
           <w:bCs/>
         </w:rPr>
-        <w:t>UC-303: View Patient Record</w:t>
+        <w:t>UC-304: Write Prescription</w:t>
       </w:r>
     </w:p>
     <w:tbl>
@@ -14873,7 +15249,7 @@
               <w:pStyle w:val="NormalWeb"/>
             </w:pPr>
             <w:r>
-              <w:t>UC-303</w:t>
+              <w:t>UC-304</w:t>
             </w:r>
           </w:p>
         </w:tc>
@@ -14889,7 +15265,6 @@
               <w:pStyle w:val="NormalWeb"/>
             </w:pPr>
             <w:r>
-              <w:lastRenderedPageBreak/>
               <w:t>Use Case Name</w:t>
             </w:r>
           </w:p>
@@ -14904,7 +15279,7 @@
               <w:pStyle w:val="NormalWeb"/>
             </w:pPr>
             <w:r>
-              <w:t>View Patient Record</w:t>
+              <w:t>Write Prescription</w:t>
             </w:r>
           </w:p>
         </w:tc>
@@ -14964,7 +15339,7 @@
               <w:pStyle w:val="NormalWeb"/>
             </w:pPr>
             <w:r>
-              <w:t>Allows the doctor to view a patient's complete medical history during consultation.</w:t>
+              <w:t>Allows the doctor to create a digital prescription for a patient.</w:t>
             </w:r>
           </w:p>
         </w:tc>
@@ -14994,7 +15369,7 @@
               <w:pStyle w:val="NormalWeb"/>
             </w:pPr>
             <w:r>
-              <w:t>Patient must have a registered profile.</w:t>
+              <w:t>Doctor must be in an active consultation with the patient.</w:t>
             </w:r>
           </w:p>
         </w:tc>
@@ -15024,15 +15399,19 @@
               <w:pStyle w:val="NormalWeb"/>
             </w:pPr>
             <w:r>
-              <w:t xml:space="preserve">1. Doctor selects a patient. </w:t>
+              <w:t xml:space="preserve">1. Doctor opens prescription form. </w:t>
             </w:r>
             <w:r>
               <w:br/>
-              <w:t xml:space="preserve">2. System retrieves medical history. </w:t>
+              <w:t xml:space="preserve">2. Enters medication, dosage, and duration. </w:t>
             </w:r>
             <w:r>
               <w:br/>
-              <w:t>3. Diagnoses, prescriptions, allergies, and lab results displayed.</w:t>
+              <w:t xml:space="preserve">3. Saves prescription. </w:t>
+            </w:r>
+            <w:r>
+              <w:br/>
+              <w:t>4. System links to patient record and notifies pharmacy.</w:t>
             </w:r>
           </w:p>
         </w:tc>
@@ -15062,7 +15441,7 @@
               <w:pStyle w:val="NormalWeb"/>
             </w:pPr>
             <w:r>
-              <w:t>No records found → Message shown.</w:t>
+              <w:t>Incomplete prescription data → Error displayed.</w:t>
             </w:r>
           </w:p>
         </w:tc>
@@ -15092,7 +15471,7 @@
               <w:pStyle w:val="NormalWeb"/>
             </w:pPr>
             <w:r>
-              <w:t>Patient records accessed by doctor.</w:t>
+              <w:t>Prescription saved and forwarded to pharmacy.</w:t>
             </w:r>
           </w:p>
         </w:tc>
@@ -15106,15 +15485,14 @@
       </w:pPr>
       <w:r>
         <w:rPr>
-          <w:b/>
-          <w:bCs/>
-          <w:noProof/>
-        </w:rPr>
+          <w:noProof/>
+        </w:rPr>
+        <w:lastRenderedPageBreak/>
         <w:drawing>
-          <wp:inline distT="0" distB="0" distL="0" distR="0" wp14:anchorId="1A4CEF01" wp14:editId="42501332">
-            <wp:extent cx="2827020" cy="1402080"/>
-            <wp:effectExtent l="0" t="0" r="0" b="7620"/>
-            <wp:docPr id="1066247785" name="Picture 16"/>
+          <wp:inline distT="0" distB="0" distL="0" distR="0" wp14:anchorId="33A1A36F" wp14:editId="241210D5">
+            <wp:extent cx="2575560" cy="1463040"/>
+            <wp:effectExtent l="0" t="0" r="0" b="0"/>
+            <wp:docPr id="547254254" name="Picture 24"/>
             <wp:cNvGraphicFramePr>
               <a:graphicFrameLocks xmlns:a="http://schemas.openxmlformats.org/drawingml/2006/main" noChangeAspect="1"/>
             </wp:cNvGraphicFramePr>
@@ -15122,20 +15500,20 @@
               <a:graphicData uri="http://schemas.openxmlformats.org/drawingml/2006/picture">
                 <pic:pic xmlns:pic="http://schemas.openxmlformats.org/drawingml/2006/picture">
                   <pic:nvPicPr>
-                    <pic:cNvPr id="0" name="Picture 42"/>
+                    <pic:cNvPr id="0" name="Picture 20"/>
                     <pic:cNvPicPr>
                       <a:picLocks noChangeAspect="1" noChangeArrowheads="1"/>
                     </pic:cNvPicPr>
                   </pic:nvPicPr>
                   <pic:blipFill rotWithShape="1">
-                    <a:blip r:embed="rId25">
+                    <a:blip r:embed="rId26">
                       <a:extLst>
                         <a:ext uri="{28A0092B-C50C-407E-A947-70E740481C1C}">
                           <a14:useLocalDpi xmlns:a14="http://schemas.microsoft.com/office/drawing/2010/main" val="0"/>
                         </a:ext>
                       </a:extLst>
                     </a:blip>
-                    <a:srcRect l="2024" t="4816" r="22874" b="27036"/>
+                    <a:srcRect l="4265" r="23668" b="24706"/>
                     <a:stretch>
                       <a:fillRect/>
                     </a:stretch>
@@ -15143,7 +15521,7 @@
                   <pic:spPr bwMode="auto">
                     <a:xfrm>
                       <a:off x="0" y="0"/>
-                      <a:ext cx="2827020" cy="1402080"/>
+                      <a:ext cx="2575560" cy="1463040"/>
                     </a:xfrm>
                     <a:prstGeom prst="rect">
                       <a:avLst/>
@@ -15182,14 +15560,14 @@
           <w:rPr>
             <w:noProof/>
           </w:rPr>
-          <w:t>15</w:t>
+          <w:t>16</w:t>
         </w:r>
       </w:fldSimple>
       <w:r>
         <w:t xml:space="preserve"> Doctor </w:t>
       </w:r>
       <w:r>
-        <w:t>View Patient Record</w:t>
+        <w:t>Write Prescription</w:t>
       </w:r>
       <w:r>
         <w:t xml:space="preserve"> Use Case Diagram</w:t>
@@ -15204,7 +15582,7 @@
           <w:b/>
           <w:bCs/>
         </w:rPr>
-        <w:t>UC-304: Write Prescription</w:t>
+        <w:t>UC-305: Order Lab Test</w:t>
       </w:r>
     </w:p>
     <w:tbl>
@@ -15280,7 +15658,7 @@
               <w:pStyle w:val="NormalWeb"/>
             </w:pPr>
             <w:r>
-              <w:t>UC-304</w:t>
+              <w:t>UC-305</w:t>
             </w:r>
           </w:p>
         </w:tc>
@@ -15310,7 +15688,7 @@
               <w:pStyle w:val="NormalWeb"/>
             </w:pPr>
             <w:r>
-              <w:t>Write Prescription</w:t>
+              <w:t>Order Lab Test</w:t>
             </w:r>
           </w:p>
         </w:tc>
@@ -15370,7 +15748,7 @@
               <w:pStyle w:val="NormalWeb"/>
             </w:pPr>
             <w:r>
-              <w:t>Allows the doctor to create a digital prescription for a patient.</w:t>
+              <w:t>Allows doctors to request laboratory tests for a patient.</w:t>
             </w:r>
           </w:p>
         </w:tc>
@@ -15400,7 +15778,7 @@
               <w:pStyle w:val="NormalWeb"/>
             </w:pPr>
             <w:r>
-              <w:t>Doctor must be in an active consultation with the patient.</w:t>
+              <w:t>Patient must be registered and doctor must be logged in.</w:t>
             </w:r>
           </w:p>
         </w:tc>
@@ -15430,19 +15808,15 @@
               <w:pStyle w:val="NormalWeb"/>
             </w:pPr>
             <w:r>
-              <w:t xml:space="preserve">1. Doctor opens prescription form. </w:t>
+              <w:t xml:space="preserve">1. Doctor selects test type. </w:t>
             </w:r>
             <w:r>
               <w:br/>
-              <w:t xml:space="preserve">2. Enters medication, dosage, and duration. </w:t>
+              <w:t xml:space="preserve">2. Enters patient ID and notes. </w:t>
             </w:r>
             <w:r>
               <w:br/>
-              <w:t xml:space="preserve">3. Saves prescription. </w:t>
-            </w:r>
-            <w:r>
-              <w:br/>
-              <w:t>4. System links to patient record and notifies pharmacy.</w:t>
+              <w:t>3. System creates test order. 4. Lab staff notified.</w:t>
             </w:r>
           </w:p>
         </w:tc>
@@ -15472,7 +15846,7 @@
               <w:pStyle w:val="NormalWeb"/>
             </w:pPr>
             <w:r>
-              <w:t>Incomplete prescription data → Error displayed.</w:t>
+              <w:t>Invalid test type or patient ID → Error.</w:t>
             </w:r>
           </w:p>
         </w:tc>
@@ -15502,7 +15876,7 @@
               <w:pStyle w:val="NormalWeb"/>
             </w:pPr>
             <w:r>
-              <w:t>Prescription saved and forwarded to pharmacy.</w:t>
+              <w:t>Lab test order created.</w:t>
             </w:r>
           </w:p>
         </w:tc>
@@ -15516,16 +15890,13 @@
       </w:pPr>
       <w:r>
         <w:rPr>
-          <w:b/>
-          <w:bCs/>
-          <w:noProof/>
-        </w:rPr>
-        <w:lastRenderedPageBreak/>
+          <w:noProof/>
+        </w:rPr>
         <w:drawing>
-          <wp:inline distT="0" distB="0" distL="0" distR="0" wp14:anchorId="31CDAED2" wp14:editId="69B39DF4">
-            <wp:extent cx="2735580" cy="1356360"/>
-            <wp:effectExtent l="0" t="0" r="7620" b="0"/>
-            <wp:docPr id="94016681" name="Picture 15"/>
+          <wp:inline distT="0" distB="0" distL="0" distR="0" wp14:anchorId="3A3BEFBE" wp14:editId="2C8FC547">
+            <wp:extent cx="2567940" cy="1485900"/>
+            <wp:effectExtent l="0" t="0" r="3810" b="0"/>
+            <wp:docPr id="737186191" name="Picture 25"/>
             <wp:cNvGraphicFramePr>
               <a:graphicFrameLocks xmlns:a="http://schemas.openxmlformats.org/drawingml/2006/main" noChangeAspect="1"/>
             </wp:cNvGraphicFramePr>
@@ -15533,20 +15904,20 @@
               <a:graphicData uri="http://schemas.openxmlformats.org/drawingml/2006/picture">
                 <pic:pic xmlns:pic="http://schemas.openxmlformats.org/drawingml/2006/picture">
                   <pic:nvPicPr>
-                    <pic:cNvPr id="0" name="Picture 41"/>
+                    <pic:cNvPr id="0" name="Picture 21"/>
                     <pic:cNvPicPr>
                       <a:picLocks noChangeAspect="1" noChangeArrowheads="1"/>
                     </pic:cNvPicPr>
                   </pic:nvPicPr>
                   <pic:blipFill rotWithShape="1">
-                    <a:blip r:embed="rId26">
+                    <a:blip r:embed="rId27">
                       <a:extLst>
                         <a:ext uri="{28A0092B-C50C-407E-A947-70E740481C1C}">
                           <a14:useLocalDpi xmlns:a14="http://schemas.microsoft.com/office/drawing/2010/main" val="0"/>
                         </a:ext>
                       </a:extLst>
                     </a:blip>
-                    <a:srcRect l="3068" t="4313" r="23517" b="25883"/>
+                    <a:srcRect l="2620" t="3333" r="23799" b="24444"/>
                     <a:stretch>
                       <a:fillRect/>
                     </a:stretch>
@@ -15554,7 +15925,7 @@
                   <pic:spPr bwMode="auto">
                     <a:xfrm>
                       <a:off x="0" y="0"/>
-                      <a:ext cx="2735580" cy="1356360"/>
+                      <a:ext cx="2567940" cy="1485900"/>
                     </a:xfrm>
                     <a:prstGeom prst="rect">
                       <a:avLst/>
@@ -15593,14 +15964,14 @@
           <w:rPr>
             <w:noProof/>
           </w:rPr>
-          <w:t>16</w:t>
+          <w:t>17</w:t>
         </w:r>
       </w:fldSimple>
       <w:r>
         <w:t xml:space="preserve"> Doctor </w:t>
       </w:r>
       <w:r>
-        <w:t>Write Prescription</w:t>
+        <w:t>Order Lab Test</w:t>
       </w:r>
       <w:r>
         <w:t xml:space="preserve"> Use Case Diagram</w:t>
@@ -15615,7 +15986,7 @@
           <w:b/>
           <w:bCs/>
         </w:rPr>
-        <w:t>UC-305: Order Lab Test</w:t>
+        <w:t>UC-306: Update Diagnosis Notes</w:t>
       </w:r>
     </w:p>
     <w:tbl>
@@ -15691,7 +16062,7 @@
               <w:pStyle w:val="NormalWeb"/>
             </w:pPr>
             <w:r>
-              <w:t>UC-305</w:t>
+              <w:t>UC-306</w:t>
             </w:r>
           </w:p>
         </w:tc>
@@ -15707,6 +16078,7 @@
               <w:pStyle w:val="NormalWeb"/>
             </w:pPr>
             <w:r>
+              <w:lastRenderedPageBreak/>
               <w:t>Use Case Name</w:t>
             </w:r>
           </w:p>
@@ -15721,7 +16093,7 @@
               <w:pStyle w:val="NormalWeb"/>
             </w:pPr>
             <w:r>
-              <w:t>Order Lab Test</w:t>
+              <w:t>Update Diagnosis Notes</w:t>
             </w:r>
           </w:p>
         </w:tc>
@@ -15781,7 +16153,7 @@
               <w:pStyle w:val="NormalWeb"/>
             </w:pPr>
             <w:r>
-              <w:t>Allows doctors to request laboratory tests for a patient.</w:t>
+              <w:t>Allows the doctor to add or update diagnosis notes for a patient visit.</w:t>
             </w:r>
           </w:p>
         </w:tc>
@@ -15811,7 +16183,7 @@
               <w:pStyle w:val="NormalWeb"/>
             </w:pPr>
             <w:r>
-              <w:t>Patient must be registered and doctor must be logged in.</w:t>
+              <w:t>Appointment or consultation must exist.</w:t>
             </w:r>
           </w:p>
         </w:tc>
@@ -15841,15 +16213,19 @@
               <w:pStyle w:val="NormalWeb"/>
             </w:pPr>
             <w:r>
-              <w:t xml:space="preserve">1. Doctor selects test type. </w:t>
+              <w:t xml:space="preserve">1. Doctor opens patient visit record. </w:t>
             </w:r>
             <w:r>
               <w:br/>
-              <w:t xml:space="preserve">2. Enters patient ID and notes. </w:t>
+              <w:t xml:space="preserve">2. Adds or edits diagnosis notes. </w:t>
             </w:r>
             <w:r>
               <w:br/>
-              <w:t>3. System creates test order. 4. Lab staff notified.</w:t>
+              <w:t xml:space="preserve">3. Saves updates. </w:t>
+            </w:r>
+            <w:r>
+              <w:br/>
+              <w:t>4. System timestamps and stores note.</w:t>
             </w:r>
           </w:p>
         </w:tc>
@@ -15879,7 +16255,7 @@
               <w:pStyle w:val="NormalWeb"/>
             </w:pPr>
             <w:r>
-              <w:t>Invalid test type or patient ID → Error.</w:t>
+              <w:t>Missing patient record → Error.</w:t>
             </w:r>
           </w:p>
         </w:tc>
@@ -15909,7 +16285,7 @@
               <w:pStyle w:val="NormalWeb"/>
             </w:pPr>
             <w:r>
-              <w:t>Lab test order created.</w:t>
+              <w:t>Diagnosis notes saved to patient record.</w:t>
             </w:r>
           </w:p>
         </w:tc>
@@ -15923,15 +16299,13 @@
       </w:pPr>
       <w:r>
         <w:rPr>
-          <w:b/>
-          <w:bCs/>
           <w:noProof/>
         </w:rPr>
         <w:drawing>
-          <wp:inline distT="0" distB="0" distL="0" distR="0" wp14:anchorId="5BB4F09A" wp14:editId="22C89790">
-            <wp:extent cx="2781300" cy="1463040"/>
-            <wp:effectExtent l="0" t="0" r="0" b="0"/>
-            <wp:docPr id="1822475406" name="Picture 14"/>
+          <wp:inline distT="0" distB="0" distL="0" distR="0" wp14:anchorId="1CAFD7A4" wp14:editId="3E840894">
+            <wp:extent cx="3329940" cy="1356360"/>
+            <wp:effectExtent l="0" t="0" r="3810" b="0"/>
+            <wp:docPr id="950406440" name="Picture 26"/>
             <wp:cNvGraphicFramePr>
               <a:graphicFrameLocks xmlns:a="http://schemas.openxmlformats.org/drawingml/2006/main" noChangeAspect="1"/>
             </wp:cNvGraphicFramePr>
@@ -15939,20 +16313,20 @@
               <a:graphicData uri="http://schemas.openxmlformats.org/drawingml/2006/picture">
                 <pic:pic xmlns:pic="http://schemas.openxmlformats.org/drawingml/2006/picture">
                   <pic:nvPicPr>
-                    <pic:cNvPr id="0" name="Picture 40"/>
+                    <pic:cNvPr id="0" name="Picture 22"/>
                     <pic:cNvPicPr>
                       <a:picLocks noChangeAspect="1" noChangeArrowheads="1"/>
                     </pic:cNvPicPr>
                   </pic:nvPicPr>
                   <pic:blipFill rotWithShape="1">
-                    <a:blip r:embed="rId27">
+                    <a:blip r:embed="rId28">
                       <a:extLst>
                         <a:ext uri="{28A0092B-C50C-407E-A947-70E740481C1C}">
                           <a14:useLocalDpi xmlns:a14="http://schemas.microsoft.com/office/drawing/2010/main" val="0"/>
                         </a:ext>
                       </a:extLst>
                     </a:blip>
-                    <a:srcRect l="3036" t="5555" r="23077" b="23333"/>
+                    <a:srcRect l="2401" r="22641" b="25833"/>
                     <a:stretch>
                       <a:fillRect/>
                     </a:stretch>
@@ -15960,7 +16334,7 @@
                   <pic:spPr bwMode="auto">
                     <a:xfrm>
                       <a:off x="0" y="0"/>
-                      <a:ext cx="2781300" cy="1463040"/>
+                      <a:ext cx="3329940" cy="1356360"/>
                     </a:xfrm>
                     <a:prstGeom prst="rect">
                       <a:avLst/>
@@ -15987,8 +16361,10 @@
         <w:pStyle w:val="Caption"/>
         <w:jc w:val="center"/>
         <w:rPr>
-          <w:b/>
-          <w:bCs/>
+          <w:rStyle w:val="Strong"/>
+          <w:rFonts w:ascii="Arial" w:hAnsi="Arial"/>
+          <w:iCs w:val="0"/>
+          <w:szCs w:val="20"/>
         </w:rPr>
       </w:pPr>
       <w:r>
@@ -15999,17 +16375,37 @@
           <w:rPr>
             <w:noProof/>
           </w:rPr>
-          <w:t>17</w:t>
+          <w:t>18</w:t>
         </w:r>
       </w:fldSimple>
       <w:r>
         <w:t xml:space="preserve"> Doctor </w:t>
       </w:r>
       <w:r>
-        <w:t>Order Lab Test</w:t>
+        <w:t>Update Diagnosis Notes</w:t>
       </w:r>
       <w:r>
         <w:t xml:space="preserve"> Use Case Diagram</w:t>
+      </w:r>
+    </w:p>
+    <w:p>
+      <w:pPr>
+        <w:pStyle w:val="NormalWeb"/>
+        <w:rPr>
+          <w:rStyle w:val="Strong"/>
+          <w:rFonts w:ascii="Arial" w:eastAsiaTheme="minorHAnsi" w:hAnsi="Arial" w:cstheme="minorBidi"/>
+          <w:iCs/>
+          <w:szCs w:val="20"/>
+        </w:rPr>
+      </w:pPr>
+      <w:r>
+        <w:rPr>
+          <w:rStyle w:val="Strong"/>
+          <w:rFonts w:ascii="Arial" w:eastAsiaTheme="minorHAnsi" w:hAnsi="Arial" w:cstheme="minorBidi"/>
+          <w:iCs/>
+          <w:szCs w:val="20"/>
+        </w:rPr>
+        <w:t>3.3.4 Administrator Use Cases</w:t>
       </w:r>
     </w:p>
     <w:p>
@@ -16021,7 +16417,7 @@
           <w:b/>
           <w:bCs/>
         </w:rPr>
-        <w:t>UC-306: Update Diagnosis Notes</w:t>
+        <w:t>UC-401: Manage User Accounts</w:t>
       </w:r>
     </w:p>
     <w:tbl>
@@ -16097,7 +16493,7 @@
               <w:pStyle w:val="NormalWeb"/>
             </w:pPr>
             <w:r>
-              <w:t>UC-306</w:t>
+              <w:t>UC-401</w:t>
             </w:r>
           </w:p>
         </w:tc>
@@ -16127,7 +16523,7 @@
               <w:pStyle w:val="NormalWeb"/>
             </w:pPr>
             <w:r>
-              <w:t>Update Diagnosis Notes</w:t>
+              <w:t>Manage User Accounts</w:t>
             </w:r>
           </w:p>
         </w:tc>
@@ -16143,7 +16539,6 @@
               <w:pStyle w:val="NormalWeb"/>
             </w:pPr>
             <w:r>
-              <w:lastRenderedPageBreak/>
               <w:t>Actors</w:t>
             </w:r>
           </w:p>
@@ -16158,7 +16553,7 @@
               <w:pStyle w:val="NormalWeb"/>
             </w:pPr>
             <w:r>
-              <w:t>Doctor</w:t>
+              <w:t>Administrator</w:t>
             </w:r>
           </w:p>
         </w:tc>
@@ -16188,7 +16583,7 @@
               <w:pStyle w:val="NormalWeb"/>
             </w:pPr>
             <w:r>
-              <w:t>Allows the doctor to add or update diagnosis notes for a patient visit.</w:t>
+              <w:t>Admin manages all user accounts including activation, editing, and deletion.</w:t>
             </w:r>
           </w:p>
         </w:tc>
@@ -16218,7 +16613,7 @@
               <w:pStyle w:val="NormalWeb"/>
             </w:pPr>
             <w:r>
-              <w:t>Appointment or consultation must exist.</w:t>
+              <w:t>Admin must be logged in.</w:t>
             </w:r>
           </w:p>
         </w:tc>
@@ -16248,19 +16643,19 @@
               <w:pStyle w:val="NormalWeb"/>
             </w:pPr>
             <w:r>
-              <w:t xml:space="preserve">1. Doctor opens patient visit record. </w:t>
+              <w:t xml:space="preserve">1. Admin opens user list. </w:t>
             </w:r>
             <w:r>
               <w:br/>
-              <w:t xml:space="preserve">2. Adds or edits diagnosis notes. </w:t>
+              <w:t xml:space="preserve">2. Selects a user. </w:t>
             </w:r>
             <w:r>
               <w:br/>
-              <w:t xml:space="preserve">3. Saves updates. </w:t>
+              <w:t xml:space="preserve">3. Performs update, suspend, or delete. </w:t>
             </w:r>
             <w:r>
               <w:br/>
-              <w:t>4. System timestamps and stores note.</w:t>
+              <w:t>4. System saves changes.</w:t>
             </w:r>
           </w:p>
         </w:tc>
@@ -16290,7 +16685,7 @@
               <w:pStyle w:val="NormalWeb"/>
             </w:pPr>
             <w:r>
-              <w:t>Missing patient record → Error.</w:t>
+              <w:t>Invalid user ID → Error.</w:t>
             </w:r>
           </w:p>
         </w:tc>
@@ -16320,7 +16715,7 @@
               <w:pStyle w:val="NormalWeb"/>
             </w:pPr>
             <w:r>
-              <w:t>Diagnosis notes saved to patient record.</w:t>
+              <w:t>User account updated.</w:t>
             </w:r>
           </w:p>
         </w:tc>
@@ -16334,17 +16729,14 @@
       </w:pPr>
       <w:r>
         <w:rPr>
-          <w:rStyle w:val="Strong"/>
-          <w:rFonts w:ascii="Arial" w:eastAsiaTheme="minorHAnsi" w:hAnsi="Arial" w:cstheme="minorBidi"/>
-          <w:iCs/>
-          <w:noProof/>
-          <w:szCs w:val="20"/>
-        </w:rPr>
+          <w:noProof/>
+        </w:rPr>
+        <w:lastRenderedPageBreak/>
         <w:drawing>
-          <wp:inline distT="0" distB="0" distL="0" distR="0" wp14:anchorId="48B42FBF" wp14:editId="36CDAD88">
-            <wp:extent cx="3634740" cy="1310640"/>
+          <wp:inline distT="0" distB="0" distL="0" distR="0" wp14:anchorId="1E66C33F" wp14:editId="5A52049E">
+            <wp:extent cx="2842260" cy="1600200"/>
             <wp:effectExtent l="0" t="0" r="0" b="0"/>
-            <wp:docPr id="719216503" name="Picture 13"/>
+            <wp:docPr id="612995162" name="Picture 27"/>
             <wp:cNvGraphicFramePr>
               <a:graphicFrameLocks xmlns:a="http://schemas.openxmlformats.org/drawingml/2006/main" noChangeAspect="1"/>
             </wp:cNvGraphicFramePr>
@@ -16352,20 +16744,20 @@
               <a:graphicData uri="http://schemas.openxmlformats.org/drawingml/2006/picture">
                 <pic:pic xmlns:pic="http://schemas.openxmlformats.org/drawingml/2006/picture">
                   <pic:nvPicPr>
-                    <pic:cNvPr id="0" name="Picture 39"/>
+                    <pic:cNvPr id="0" name="Picture 23"/>
                     <pic:cNvPicPr>
                       <a:picLocks noChangeAspect="1" noChangeArrowheads="1"/>
                     </pic:cNvPicPr>
                   </pic:nvPicPr>
                   <pic:blipFill rotWithShape="1">
-                    <a:blip r:embed="rId28">
+                    <a:blip r:embed="rId29">
                       <a:extLst>
                         <a:ext uri="{28A0092B-C50C-407E-A947-70E740481C1C}">
                           <a14:useLocalDpi xmlns:a14="http://schemas.microsoft.com/office/drawing/2010/main" val="0"/>
                         </a:ext>
                       </a:extLst>
                     </a:blip>
-                    <a:srcRect l="1908" t="4583" r="22258" b="23750"/>
+                    <a:srcRect l="2778" r="23214" b="23636"/>
                     <a:stretch>
                       <a:fillRect/>
                     </a:stretch>
@@ -16373,7 +16765,7 @@
                   <pic:spPr bwMode="auto">
                     <a:xfrm>
                       <a:off x="0" y="0"/>
-                      <a:ext cx="3634740" cy="1310640"/>
+                      <a:ext cx="2842260" cy="1600200"/>
                     </a:xfrm>
                     <a:prstGeom prst="rect">
                       <a:avLst/>
@@ -16400,10 +16792,8 @@
         <w:pStyle w:val="Caption"/>
         <w:jc w:val="center"/>
         <w:rPr>
-          <w:rStyle w:val="Strong"/>
-          <w:rFonts w:ascii="Arial" w:hAnsi="Arial"/>
-          <w:iCs w:val="0"/>
-          <w:szCs w:val="20"/>
+          <w:b/>
+          <w:bCs/>
         </w:rPr>
       </w:pPr>
       <w:r>
@@ -16414,37 +16804,17 @@
           <w:rPr>
             <w:noProof/>
           </w:rPr>
-          <w:t>18</w:t>
+          <w:t>19</w:t>
         </w:r>
       </w:fldSimple>
       <w:r>
-        <w:t xml:space="preserve"> Doctor </w:t>
-      </w:r>
-      <w:r>
-        <w:t>Update Diagnosis Notes</w:t>
+        <w:t xml:space="preserve"> Admin </w:t>
+      </w:r>
+      <w:r>
+        <w:t>Manage User Accounts</w:t>
       </w:r>
       <w:r>
         <w:t xml:space="preserve"> Use Case Diagram</w:t>
-      </w:r>
-    </w:p>
-    <w:p>
-      <w:pPr>
-        <w:pStyle w:val="NormalWeb"/>
-        <w:rPr>
-          <w:rStyle w:val="Strong"/>
-          <w:rFonts w:ascii="Arial" w:eastAsiaTheme="minorHAnsi" w:hAnsi="Arial" w:cstheme="minorBidi"/>
-          <w:iCs/>
-          <w:szCs w:val="20"/>
-        </w:rPr>
-      </w:pPr>
-      <w:r>
-        <w:rPr>
-          <w:rStyle w:val="Strong"/>
-          <w:rFonts w:ascii="Arial" w:eastAsiaTheme="minorHAnsi" w:hAnsi="Arial" w:cstheme="minorBidi"/>
-          <w:iCs/>
-          <w:szCs w:val="20"/>
-        </w:rPr>
-        <w:t>3.3.4 Administrator Use Cases</w:t>
       </w:r>
     </w:p>
     <w:p>
@@ -16456,7 +16826,7 @@
           <w:b/>
           <w:bCs/>
         </w:rPr>
-        <w:t>UC-401: Manage User Accounts</w:t>
+        <w:t>UC-402: Manage Appointments (Admin)</w:t>
       </w:r>
     </w:p>
     <w:tbl>
@@ -16532,7 +16902,7 @@
               <w:pStyle w:val="NormalWeb"/>
             </w:pPr>
             <w:r>
-              <w:t>UC-401</w:t>
+              <w:t>UC-402</w:t>
             </w:r>
           </w:p>
         </w:tc>
@@ -16562,7 +16932,7 @@
               <w:pStyle w:val="NormalWeb"/>
             </w:pPr>
             <w:r>
-              <w:t>Manage User Accounts</w:t>
+              <w:t>Manage Appointments</w:t>
             </w:r>
           </w:p>
         </w:tc>
@@ -16622,7 +16992,7 @@
               <w:pStyle w:val="NormalWeb"/>
             </w:pPr>
             <w:r>
-              <w:t>Admin manages all user accounts including activation, editing, and deletion.</w:t>
+              <w:t>Admin views and manages all hospital appointments.</w:t>
             </w:r>
           </w:p>
         </w:tc>
@@ -16682,19 +17052,15 @@
               <w:pStyle w:val="NormalWeb"/>
             </w:pPr>
             <w:r>
-              <w:t xml:space="preserve">1. Admin opens user list. </w:t>
+              <w:t xml:space="preserve">1. Admin opens appointments panel. </w:t>
             </w:r>
             <w:r>
               <w:br/>
-              <w:t xml:space="preserve">2. Selects a user. </w:t>
+              <w:t xml:space="preserve">2. Views all appointments. </w:t>
             </w:r>
             <w:r>
               <w:br/>
-              <w:t xml:space="preserve">3. Performs update, suspend, or delete. </w:t>
-            </w:r>
-            <w:r>
-              <w:br/>
-              <w:t>4. System saves changes.</w:t>
+              <w:t>3. Cancels, reassigns, or updates as needed.</w:t>
             </w:r>
           </w:p>
         </w:tc>
@@ -16724,7 +17090,7 @@
               <w:pStyle w:val="NormalWeb"/>
             </w:pPr>
             <w:r>
-              <w:t>Invalid user ID → Error.</w:t>
+              <w:t>No appointments found.</w:t>
             </w:r>
           </w:p>
         </w:tc>
@@ -16754,7 +17120,7 @@
               <w:pStyle w:val="NormalWeb"/>
             </w:pPr>
             <w:r>
-              <w:t>User account updated.</w:t>
+              <w:t>Appointment records updated.</w:t>
             </w:r>
           </w:p>
         </w:tc>
@@ -16768,16 +17134,13 @@
       </w:pPr>
       <w:r>
         <w:rPr>
-          <w:b/>
-          <w:bCs/>
-          <w:noProof/>
-        </w:rPr>
-        <w:lastRenderedPageBreak/>
+          <w:noProof/>
+        </w:rPr>
         <w:drawing>
-          <wp:inline distT="0" distB="0" distL="0" distR="0" wp14:anchorId="30070B9A" wp14:editId="64932D70">
-            <wp:extent cx="3070860" cy="1432560"/>
+          <wp:inline distT="0" distB="0" distL="0" distR="0" wp14:anchorId="5A3DEF32" wp14:editId="2D2473CB">
+            <wp:extent cx="2667000" cy="1501140"/>
             <wp:effectExtent l="0" t="0" r="0" b="0"/>
-            <wp:docPr id="1978696233" name="Picture 12"/>
+            <wp:docPr id="1606174537" name="Picture 28"/>
             <wp:cNvGraphicFramePr>
               <a:graphicFrameLocks xmlns:a="http://schemas.openxmlformats.org/drawingml/2006/main" noChangeAspect="1"/>
             </wp:cNvGraphicFramePr>
@@ -16785,20 +17148,20 @@
               <a:graphicData uri="http://schemas.openxmlformats.org/drawingml/2006/picture">
                 <pic:pic xmlns:pic="http://schemas.openxmlformats.org/drawingml/2006/picture">
                   <pic:nvPicPr>
-                    <pic:cNvPr id="0" name="Picture 38"/>
+                    <pic:cNvPr id="0" name="Picture 24"/>
                     <pic:cNvPicPr>
                       <a:picLocks noChangeAspect="1" noChangeArrowheads="1"/>
                     </pic:cNvPicPr>
                   </pic:nvPicPr>
                   <pic:blipFill rotWithShape="1">
-                    <a:blip r:embed="rId29">
+                    <a:blip r:embed="rId30">
                       <a:extLst>
                         <a:ext uri="{28A0092B-C50C-407E-A947-70E740481C1C}">
                           <a14:useLocalDpi xmlns:a14="http://schemas.microsoft.com/office/drawing/2010/main" val="0"/>
                         </a:ext>
                       </a:extLst>
                     </a:blip>
-                    <a:srcRect l="2597" t="5091" r="22634" b="26545"/>
+                    <a:srcRect l="2559" r="22814" b="22745"/>
                     <a:stretch>
                       <a:fillRect/>
                     </a:stretch>
@@ -16806,7 +17169,7 @@
                   <pic:spPr bwMode="auto">
                     <a:xfrm>
                       <a:off x="0" y="0"/>
-                      <a:ext cx="3070860" cy="1432560"/>
+                      <a:ext cx="2667000" cy="1501140"/>
                     </a:xfrm>
                     <a:prstGeom prst="rect">
                       <a:avLst/>
@@ -16845,14 +17208,14 @@
           <w:rPr>
             <w:noProof/>
           </w:rPr>
-          <w:t>19</w:t>
+          <w:t>20</w:t>
         </w:r>
       </w:fldSimple>
       <w:r>
         <w:t xml:space="preserve"> Admin </w:t>
       </w:r>
       <w:r>
-        <w:t>Manage User Accounts</w:t>
+        <w:t>Manage Appointments</w:t>
       </w:r>
       <w:r>
         <w:t xml:space="preserve"> Use Case Diagram</w:t>
@@ -16867,7 +17230,7 @@
           <w:b/>
           <w:bCs/>
         </w:rPr>
-        <w:t>UC-402: Manage Appointments (Admin)</w:t>
+        <w:t>UC-403: Manage Billing</w:t>
       </w:r>
     </w:p>
     <w:tbl>
@@ -16943,7 +17306,7 @@
               <w:pStyle w:val="NormalWeb"/>
             </w:pPr>
             <w:r>
-              <w:t>UC-402</w:t>
+              <w:t>UC-403</w:t>
             </w:r>
           </w:p>
         </w:tc>
@@ -16973,7 +17336,7 @@
               <w:pStyle w:val="NormalWeb"/>
             </w:pPr>
             <w:r>
-              <w:t>Manage Appointments</w:t>
+              <w:t>Manage Billing</w:t>
             </w:r>
           </w:p>
         </w:tc>
@@ -16989,6 +17352,7 @@
               <w:pStyle w:val="NormalWeb"/>
             </w:pPr>
             <w:r>
+              <w:lastRenderedPageBreak/>
               <w:t>Actors</w:t>
             </w:r>
           </w:p>
@@ -17033,7 +17397,7 @@
               <w:pStyle w:val="NormalWeb"/>
             </w:pPr>
             <w:r>
-              <w:t>Admin views and manages all hospital appointments.</w:t>
+              <w:t>Admin generates and manages patient invoices.</w:t>
             </w:r>
           </w:p>
         </w:tc>
@@ -17063,7 +17427,7 @@
               <w:pStyle w:val="NormalWeb"/>
             </w:pPr>
             <w:r>
-              <w:t>Admin must be logged in.</w:t>
+              <w:t>Patient visit or service record must exist.</w:t>
             </w:r>
           </w:p>
         </w:tc>
@@ -17093,15 +17457,19 @@
               <w:pStyle w:val="NormalWeb"/>
             </w:pPr>
             <w:r>
-              <w:t xml:space="preserve">1. Admin opens appointments panel. </w:t>
+              <w:t xml:space="preserve">1. Admin opens billing panel. </w:t>
             </w:r>
             <w:r>
               <w:br/>
-              <w:t xml:space="preserve">2. Views all appointments. </w:t>
+              <w:t xml:space="preserve">2. Selects patient. </w:t>
             </w:r>
             <w:r>
               <w:br/>
-              <w:t>3. Cancels, reassigns, or updates as needed.</w:t>
+              <w:t xml:space="preserve">3. Generates invoice with itemized charges. </w:t>
+            </w:r>
+            <w:r>
+              <w:br/>
+              <w:t>4. Invoice sent to patient.</w:t>
             </w:r>
           </w:p>
         </w:tc>
@@ -17131,7 +17499,7 @@
               <w:pStyle w:val="NormalWeb"/>
             </w:pPr>
             <w:r>
-              <w:t>No appointments found.</w:t>
+              <w:t>Incomplete service records → Error.</w:t>
             </w:r>
           </w:p>
         </w:tc>
@@ -17161,7 +17529,7 @@
               <w:pStyle w:val="NormalWeb"/>
             </w:pPr>
             <w:r>
-              <w:t>Appointment records updated.</w:t>
+              <w:t>Invoice created and stored.</w:t>
             </w:r>
           </w:p>
         </w:tc>
@@ -17175,15 +17543,13 @@
       </w:pPr>
       <w:r>
         <w:rPr>
-          <w:b/>
-          <w:bCs/>
           <w:noProof/>
         </w:rPr>
         <w:drawing>
-          <wp:inline distT="0" distB="0" distL="0" distR="0" wp14:anchorId="72FC5EE0" wp14:editId="594FA864">
-            <wp:extent cx="2766060" cy="1394460"/>
-            <wp:effectExtent l="0" t="0" r="0" b="0"/>
-            <wp:docPr id="1424240548" name="Picture 11"/>
+          <wp:inline distT="0" distB="0" distL="0" distR="0" wp14:anchorId="22B9CDCC" wp14:editId="3963A1EA">
+            <wp:extent cx="2567940" cy="1295400"/>
+            <wp:effectExtent l="0" t="0" r="3810" b="0"/>
+            <wp:docPr id="1252928286" name="Picture 29"/>
             <wp:cNvGraphicFramePr>
               <a:graphicFrameLocks xmlns:a="http://schemas.openxmlformats.org/drawingml/2006/main" noChangeAspect="1"/>
             </wp:cNvGraphicFramePr>
@@ -17191,20 +17557,20 @@
               <a:graphicData uri="http://schemas.openxmlformats.org/drawingml/2006/picture">
                 <pic:pic xmlns:pic="http://schemas.openxmlformats.org/drawingml/2006/picture">
                   <pic:nvPicPr>
-                    <pic:cNvPr id="0" name="Picture 37"/>
+                    <pic:cNvPr id="0" name="Picture 25"/>
                     <pic:cNvPicPr>
                       <a:picLocks noChangeAspect="1" noChangeArrowheads="1"/>
                     </pic:cNvPicPr>
                   </pic:nvPicPr>
                   <pic:blipFill rotWithShape="1">
-                    <a:blip r:embed="rId30">
+                    <a:blip r:embed="rId31">
                       <a:extLst>
                         <a:ext uri="{28A0092B-C50C-407E-A947-70E740481C1C}">
                           <a14:useLocalDpi xmlns:a14="http://schemas.microsoft.com/office/drawing/2010/main" val="0"/>
                         </a:ext>
                       </a:extLst>
                     </a:blip>
-                    <a:srcRect l="3239" t="4313" r="23280" b="23922"/>
+                    <a:srcRect l="3879" r="23491" b="26087"/>
                     <a:stretch>
                       <a:fillRect/>
                     </a:stretch>
@@ -17212,7 +17578,7 @@
                   <pic:spPr bwMode="auto">
                     <a:xfrm>
                       <a:off x="0" y="0"/>
-                      <a:ext cx="2766060" cy="1394460"/>
+                      <a:ext cx="2567940" cy="1295400"/>
                     </a:xfrm>
                     <a:prstGeom prst="rect">
                       <a:avLst/>
@@ -17251,14 +17617,14 @@
           <w:rPr>
             <w:noProof/>
           </w:rPr>
-          <w:t>20</w:t>
+          <w:t>21</w:t>
         </w:r>
       </w:fldSimple>
       <w:r>
         <w:t xml:space="preserve"> Admin </w:t>
       </w:r>
       <w:r>
-        <w:t>Manage Appointments</w:t>
+        <w:t>Manage Billing</w:t>
       </w:r>
       <w:r>
         <w:t xml:space="preserve"> Use Case Diagram</w:t>
@@ -17273,7 +17639,7 @@
           <w:b/>
           <w:bCs/>
         </w:rPr>
-        <w:t>UC-403: Manage Billing</w:t>
+        <w:t>UC-404: Manage Beds and Wards</w:t>
       </w:r>
     </w:p>
     <w:tbl>
@@ -17349,7 +17715,7 @@
               <w:pStyle w:val="NormalWeb"/>
             </w:pPr>
             <w:r>
-              <w:t>UC-403</w:t>
+              <w:t>UC-404</w:t>
             </w:r>
           </w:p>
         </w:tc>
@@ -17379,7 +17745,7 @@
               <w:pStyle w:val="NormalWeb"/>
             </w:pPr>
             <w:r>
-              <w:t>Manage Billing</w:t>
+              <w:t>Manage Beds and Wards</w:t>
             </w:r>
           </w:p>
         </w:tc>
@@ -17425,7 +17791,6 @@
               <w:pStyle w:val="NormalWeb"/>
             </w:pPr>
             <w:r>
-              <w:lastRenderedPageBreak/>
               <w:t>Description</w:t>
             </w:r>
           </w:p>
@@ -17440,7 +17805,7 @@
               <w:pStyle w:val="NormalWeb"/>
             </w:pPr>
             <w:r>
-              <w:t>Admin generates and manages patient invoices.</w:t>
+              <w:t>Admin allocates beds, manages ward capacity, and tracks admissions.</w:t>
             </w:r>
           </w:p>
         </w:tc>
@@ -17470,7 +17835,7 @@
               <w:pStyle w:val="NormalWeb"/>
             </w:pPr>
             <w:r>
-              <w:t>Patient visit or service record must exist.</w:t>
+              <w:t>Admin must be logged in.</w:t>
             </w:r>
           </w:p>
         </w:tc>
@@ -17500,19 +17865,15 @@
               <w:pStyle w:val="NormalWeb"/>
             </w:pPr>
             <w:r>
-              <w:t xml:space="preserve">1. Admin opens billing panel. </w:t>
+              <w:t xml:space="preserve">1. Admin opens bed management section. </w:t>
             </w:r>
             <w:r>
               <w:br/>
-              <w:t xml:space="preserve">2. Selects patient. </w:t>
+              <w:t xml:space="preserve">2. Views bed availability by ward. </w:t>
             </w:r>
             <w:r>
               <w:br/>
-              <w:t xml:space="preserve">3. Generates invoice with itemized charges. </w:t>
-            </w:r>
-            <w:r>
-              <w:br/>
-              <w:t>4. Invoice sent to patient.</w:t>
+              <w:t>3. Assigns bed to admitted patient or marks as available on discharge.</w:t>
             </w:r>
           </w:p>
         </w:tc>
@@ -17542,7 +17903,7 @@
               <w:pStyle w:val="NormalWeb"/>
             </w:pPr>
             <w:r>
-              <w:t>Incomplete service records → Error.</w:t>
+              <w:t>No beds available → Admin notified.</w:t>
             </w:r>
           </w:p>
         </w:tc>
@@ -17572,7 +17933,7 @@
               <w:pStyle w:val="NormalWeb"/>
             </w:pPr>
             <w:r>
-              <w:t>Invoice created and stored.</w:t>
+              <w:t>Bed allocation updated.</w:t>
             </w:r>
           </w:p>
         </w:tc>
@@ -17586,15 +17947,14 @@
       </w:pPr>
       <w:r>
         <w:rPr>
-          <w:b/>
-          <w:bCs/>
-          <w:noProof/>
-        </w:rPr>
+          <w:noProof/>
+        </w:rPr>
+        <w:lastRenderedPageBreak/>
         <w:drawing>
-          <wp:inline distT="0" distB="0" distL="0" distR="0" wp14:anchorId="60109164" wp14:editId="2132488A">
-            <wp:extent cx="2926080" cy="1341120"/>
+          <wp:inline distT="0" distB="0" distL="0" distR="0" wp14:anchorId="2011A319" wp14:editId="0B0ABCEA">
+            <wp:extent cx="2811780" cy="1402080"/>
             <wp:effectExtent l="0" t="0" r="0" b="0"/>
-            <wp:docPr id="1159849813" name="Picture 10"/>
+            <wp:docPr id="1848968849" name="Picture 30"/>
             <wp:cNvGraphicFramePr>
               <a:graphicFrameLocks xmlns:a="http://schemas.openxmlformats.org/drawingml/2006/main" noChangeAspect="1"/>
             </wp:cNvGraphicFramePr>
@@ -17602,20 +17962,20 @@
               <a:graphicData uri="http://schemas.openxmlformats.org/drawingml/2006/picture">
                 <pic:pic xmlns:pic="http://schemas.openxmlformats.org/drawingml/2006/picture">
                   <pic:nvPicPr>
-                    <pic:cNvPr id="0" name="Picture 36"/>
+                    <pic:cNvPr id="0" name="Picture 26"/>
                     <pic:cNvPicPr>
                       <a:picLocks noChangeAspect="1" noChangeArrowheads="1"/>
                     </pic:cNvPicPr>
                   </pic:nvPicPr>
                   <pic:blipFill rotWithShape="1">
-                    <a:blip r:embed="rId31">
+                    <a:blip r:embed="rId32">
                       <a:extLst>
                         <a:ext uri="{28A0092B-C50C-407E-A947-70E740481C1C}">
                           <a14:useLocalDpi xmlns:a14="http://schemas.microsoft.com/office/drawing/2010/main" val="0"/>
                         </a:ext>
                       </a:extLst>
                     </a:blip>
-                    <a:srcRect r="22267" b="23478"/>
+                    <a:srcRect l="3769" r="23016" b="24898"/>
                     <a:stretch>
                       <a:fillRect/>
                     </a:stretch>
@@ -17623,7 +17983,7 @@
                   <pic:spPr bwMode="auto">
                     <a:xfrm>
                       <a:off x="0" y="0"/>
-                      <a:ext cx="2926080" cy="1341120"/>
+                      <a:ext cx="2811780" cy="1402080"/>
                     </a:xfrm>
                     <a:prstGeom prst="rect">
                       <a:avLst/>
@@ -17662,14 +18022,14 @@
           <w:rPr>
             <w:noProof/>
           </w:rPr>
-          <w:t>21</w:t>
+          <w:t>22</w:t>
         </w:r>
       </w:fldSimple>
       <w:r>
         <w:t xml:space="preserve"> Admin </w:t>
       </w:r>
       <w:r>
-        <w:t>Manage Billing</w:t>
+        <w:t>Manage Beds and Wards</w:t>
       </w:r>
       <w:r>
         <w:t xml:space="preserve"> Use Case Diagram</w:t>
@@ -17684,7 +18044,7 @@
           <w:b/>
           <w:bCs/>
         </w:rPr>
-        <w:t>UC-404: Manage Beds and Wards</w:t>
+        <w:t>UC-405: Generate Reports</w:t>
       </w:r>
     </w:p>
     <w:tbl>
@@ -17760,7 +18120,7 @@
               <w:pStyle w:val="NormalWeb"/>
             </w:pPr>
             <w:r>
-              <w:t>UC-404</w:t>
+              <w:t>UC-405</w:t>
             </w:r>
           </w:p>
         </w:tc>
@@ -17790,7 +18150,7 @@
               <w:pStyle w:val="NormalWeb"/>
             </w:pPr>
             <w:r>
-              <w:t>Manage Beds and Wards</w:t>
+              <w:t>Generate Reports</w:t>
             </w:r>
           </w:p>
         </w:tc>
@@ -17850,7 +18210,7 @@
               <w:pStyle w:val="NormalWeb"/>
             </w:pPr>
             <w:r>
-              <w:t>Admin allocates beds, manages ward capacity, and tracks admissions.</w:t>
+              <w:t>Admin generates operational and financial reports for hospital management.</w:t>
             </w:r>
           </w:p>
         </w:tc>
@@ -17880,7 +18240,7 @@
               <w:pStyle w:val="NormalWeb"/>
             </w:pPr>
             <w:r>
-              <w:t>Admin must be logged in.</w:t>
+              <w:t>Sufficient data must exist in the system.</w:t>
             </w:r>
           </w:p>
         </w:tc>
@@ -17910,15 +18270,19 @@
               <w:pStyle w:val="NormalWeb"/>
             </w:pPr>
             <w:r>
-              <w:t xml:space="preserve">1. Admin opens bed management section. </w:t>
+              <w:t xml:space="preserve">1. Admin selects report type. </w:t>
             </w:r>
             <w:r>
               <w:br/>
-              <w:t xml:space="preserve">2. Views bed availability by ward. </w:t>
+              <w:t xml:space="preserve">2. Sets date range or filters. </w:t>
             </w:r>
             <w:r>
               <w:br/>
-              <w:t>3. Assigns bed to admitted patient or marks as available on discharge.</w:t>
+              <w:t xml:space="preserve">3. System generates report. </w:t>
+            </w:r>
+            <w:r>
+              <w:br/>
+              <w:t>4. Report displayed or exported.</w:t>
             </w:r>
           </w:p>
         </w:tc>
@@ -17948,7 +18312,7 @@
               <w:pStyle w:val="NormalWeb"/>
             </w:pPr>
             <w:r>
-              <w:t>No beds available → Admin notified.</w:t>
+              <w:t>No data for selected filters → Message displayed.</w:t>
             </w:r>
           </w:p>
         </w:tc>
@@ -17978,7 +18342,7 @@
               <w:pStyle w:val="NormalWeb"/>
             </w:pPr>
             <w:r>
-              <w:t>Bed allocation updated.</w:t>
+              <w:t>Report generated and available for review.</w:t>
             </w:r>
           </w:p>
         </w:tc>
@@ -17992,16 +18356,13 @@
       </w:pPr>
       <w:r>
         <w:rPr>
-          <w:b/>
-          <w:bCs/>
-          <w:noProof/>
-        </w:rPr>
-        <w:lastRenderedPageBreak/>
+          <w:noProof/>
+        </w:rPr>
         <w:drawing>
-          <wp:inline distT="0" distB="0" distL="0" distR="0" wp14:anchorId="4A169090" wp14:editId="7CF39D26">
-            <wp:extent cx="3070860" cy="1333500"/>
+          <wp:inline distT="0" distB="0" distL="0" distR="0" wp14:anchorId="0AC640C3" wp14:editId="5DB17B54">
+            <wp:extent cx="2590800" cy="1569720"/>
             <wp:effectExtent l="0" t="0" r="0" b="0"/>
-            <wp:docPr id="1108202209" name="Picture 9"/>
+            <wp:docPr id="2010550925" name="Picture 31"/>
             <wp:cNvGraphicFramePr>
               <a:graphicFrameLocks xmlns:a="http://schemas.openxmlformats.org/drawingml/2006/main" noChangeAspect="1"/>
             </wp:cNvGraphicFramePr>
@@ -18009,20 +18370,20 @@
               <a:graphicData uri="http://schemas.openxmlformats.org/drawingml/2006/picture">
                 <pic:pic xmlns:pic="http://schemas.openxmlformats.org/drawingml/2006/picture">
                   <pic:nvPicPr>
-                    <pic:cNvPr id="0" name="Picture 35"/>
+                    <pic:cNvPr id="0" name="Picture 27"/>
                     <pic:cNvPicPr>
                       <a:picLocks noChangeAspect="1" noChangeArrowheads="1"/>
                     </pic:cNvPicPr>
                   </pic:nvPicPr>
                   <pic:blipFill rotWithShape="1">
-                    <a:blip r:embed="rId32">
+                    <a:blip r:embed="rId33">
                       <a:extLst>
                         <a:ext uri="{28A0092B-C50C-407E-A947-70E740481C1C}">
                           <a14:useLocalDpi xmlns:a14="http://schemas.microsoft.com/office/drawing/2010/main" val="0"/>
                         </a:ext>
                       </a:extLst>
                     </a:blip>
-                    <a:srcRect l="2434" t="4898" r="22098" b="23673"/>
+                    <a:srcRect r="22551" b="25091"/>
                     <a:stretch>
                       <a:fillRect/>
                     </a:stretch>
@@ -18030,7 +18391,7 @@
                   <pic:spPr bwMode="auto">
                     <a:xfrm>
                       <a:off x="0" y="0"/>
-                      <a:ext cx="3070860" cy="1333500"/>
+                      <a:ext cx="2590800" cy="1569720"/>
                     </a:xfrm>
                     <a:prstGeom prst="rect">
                       <a:avLst/>
@@ -18069,17 +18430,11 @@
           <w:rPr>
             <w:noProof/>
           </w:rPr>
-          <w:t>22</w:t>
+          <w:t>23</w:t>
         </w:r>
       </w:fldSimple>
       <w:r>
-        <w:t xml:space="preserve"> Admin </w:t>
-      </w:r>
-      <w:r>
-        <w:t>Manage Beds and Wards</w:t>
-      </w:r>
-      <w:r>
-        <w:t xml:space="preserve"> Use Case Diagram</w:t>
+        <w:t xml:space="preserve"> Admin Generate Reports Use Case Diagram</w:t>
       </w:r>
     </w:p>
     <w:p>
@@ -18091,7 +18446,7 @@
           <w:b/>
           <w:bCs/>
         </w:rPr>
-        <w:t>UC-405: Generate Reports</w:t>
+        <w:t>UC-406: Manage Departments and Categories</w:t>
       </w:r>
     </w:p>
     <w:tbl>
@@ -18167,7 +18522,7 @@
               <w:pStyle w:val="NormalWeb"/>
             </w:pPr>
             <w:r>
-              <w:t>UC-405</w:t>
+              <w:t>UC-406</w:t>
             </w:r>
           </w:p>
         </w:tc>
@@ -18183,6 +18538,7 @@
               <w:pStyle w:val="NormalWeb"/>
             </w:pPr>
             <w:r>
+              <w:lastRenderedPageBreak/>
               <w:t>Use Case Name</w:t>
             </w:r>
           </w:p>
@@ -18197,7 +18553,7 @@
               <w:pStyle w:val="NormalWeb"/>
             </w:pPr>
             <w:r>
-              <w:t>Generate Reports</w:t>
+              <w:t>Manage Departments and Categories</w:t>
             </w:r>
           </w:p>
         </w:tc>
@@ -18257,7 +18613,7 @@
               <w:pStyle w:val="NormalWeb"/>
             </w:pPr>
             <w:r>
-              <w:t>Admin generates operational and financial reports for hospital management.</w:t>
+              <w:t>Admin creates, updates, or removes hospital departments and service categories.</w:t>
             </w:r>
           </w:p>
         </w:tc>
@@ -18287,7 +18643,7 @@
               <w:pStyle w:val="NormalWeb"/>
             </w:pPr>
             <w:r>
-              <w:t>Sufficient data must exist in the system.</w:t>
+              <w:t>Admin must be authorized.</w:t>
             </w:r>
           </w:p>
         </w:tc>
@@ -18317,19 +18673,15 @@
               <w:pStyle w:val="NormalWeb"/>
             </w:pPr>
             <w:r>
-              <w:t xml:space="preserve">1. Admin selects report type. </w:t>
+              <w:t xml:space="preserve">1. Admin opens departments section. </w:t>
             </w:r>
             <w:r>
               <w:br/>
-              <w:t xml:space="preserve">2. Sets date range or filters. </w:t>
+              <w:t xml:space="preserve">2. Adds, edits, or removes a department. </w:t>
             </w:r>
             <w:r>
               <w:br/>
-              <w:t xml:space="preserve">3. System generates report. </w:t>
-            </w:r>
-            <w:r>
-              <w:br/>
-              <w:t>4. Report displayed or exported.</w:t>
+              <w:t>3. System validates and saves.</w:t>
             </w:r>
           </w:p>
         </w:tc>
@@ -18359,7 +18711,7 @@
               <w:pStyle w:val="NormalWeb"/>
             </w:pPr>
             <w:r>
-              <w:t>No data for selected filters → Message displayed.</w:t>
+              <w:t>Duplicate or empty name → Error.</w:t>
             </w:r>
           </w:p>
         </w:tc>
@@ -18389,7 +18741,7 @@
               <w:pStyle w:val="NormalWeb"/>
             </w:pPr>
             <w:r>
-              <w:t>Report generated and available for review.</w:t>
+              <w:t>Department list updated.</w:t>
             </w:r>
           </w:p>
         </w:tc>
@@ -18403,15 +18755,13 @@
       </w:pPr>
       <w:r>
         <w:rPr>
-          <w:b/>
-          <w:bCs/>
           <w:noProof/>
         </w:rPr>
         <w:drawing>
-          <wp:inline distT="0" distB="0" distL="0" distR="0" wp14:anchorId="2E36B865" wp14:editId="1A8FC3B4">
-            <wp:extent cx="2827020" cy="1455420"/>
+          <wp:inline distT="0" distB="0" distL="0" distR="0" wp14:anchorId="5DE1DBCC" wp14:editId="01F39721">
+            <wp:extent cx="3581400" cy="1684020"/>
             <wp:effectExtent l="0" t="0" r="0" b="0"/>
-            <wp:docPr id="377987156" name="Picture 8"/>
+            <wp:docPr id="496149063" name="Picture 32"/>
             <wp:cNvGraphicFramePr>
               <a:graphicFrameLocks xmlns:a="http://schemas.openxmlformats.org/drawingml/2006/main" noChangeAspect="1"/>
             </wp:cNvGraphicFramePr>
@@ -18419,406 +18769,7 @@
               <a:graphicData uri="http://schemas.openxmlformats.org/drawingml/2006/picture">
                 <pic:pic xmlns:pic="http://schemas.openxmlformats.org/drawingml/2006/picture">
                   <pic:nvPicPr>
-                    <pic:cNvPr id="0" name="Picture 34"/>
-                    <pic:cNvPicPr>
-                      <a:picLocks noChangeAspect="1" noChangeArrowheads="1"/>
-                    </pic:cNvPicPr>
-                  </pic:nvPicPr>
-                  <pic:blipFill rotWithShape="1">
-                    <a:blip r:embed="rId33">
-                      <a:extLst>
-                        <a:ext uri="{28A0092B-C50C-407E-A947-70E740481C1C}">
-                          <a14:useLocalDpi xmlns:a14="http://schemas.microsoft.com/office/drawing/2010/main" val="0"/>
-                        </a:ext>
-                      </a:extLst>
-                    </a:blip>
-                    <a:srcRect l="2024" t="5454" r="22874" b="25092"/>
-                    <a:stretch>
-                      <a:fillRect/>
-                    </a:stretch>
-                  </pic:blipFill>
-                  <pic:spPr bwMode="auto">
-                    <a:xfrm>
-                      <a:off x="0" y="0"/>
-                      <a:ext cx="2827020" cy="1455420"/>
-                    </a:xfrm>
-                    <a:prstGeom prst="rect">
-                      <a:avLst/>
-                    </a:prstGeom>
-                    <a:noFill/>
-                    <a:ln>
-                      <a:noFill/>
-                    </a:ln>
-                    <a:extLst>
-                      <a:ext uri="{53640926-AAD7-44D8-BBD7-CCE9431645EC}">
-                        <a14:shadowObscured xmlns:a14="http://schemas.microsoft.com/office/drawing/2010/main"/>
-                      </a:ext>
-                    </a:extLst>
-                  </pic:spPr>
-                </pic:pic>
-              </a:graphicData>
-            </a:graphic>
-          </wp:inline>
-        </w:drawing>
-      </w:r>
-    </w:p>
-    <w:p>
-      <w:pPr>
-        <w:pStyle w:val="Caption"/>
-        <w:jc w:val="center"/>
-        <w:rPr>
-          <w:b/>
-          <w:bCs/>
-        </w:rPr>
-      </w:pPr>
-      <w:r>
-        <w:t xml:space="preserve">Figure </w:t>
-      </w:r>
-      <w:fldSimple w:instr=" SEQ Figure \* ARABIC ">
-        <w:r>
-          <w:rPr>
-            <w:noProof/>
-          </w:rPr>
-          <w:t>23</w:t>
-        </w:r>
-      </w:fldSimple>
-      <w:r>
-        <w:t xml:space="preserve"> Admin Generate Reports Use Case Diagram</w:t>
-      </w:r>
-    </w:p>
-    <w:p>
-      <w:pPr>
-        <w:pStyle w:val="NormalWeb"/>
-      </w:pPr>
-      <w:r>
-        <w:rPr>
-          <w:b/>
-          <w:bCs/>
-        </w:rPr>
-        <w:t>UC-406: Manage Departments and Categories</w:t>
-      </w:r>
-    </w:p>
-    <w:tbl>
-      <w:tblPr>
-        <w:tblStyle w:val="TableGrid"/>
-        <w:tblW w:w="0" w:type="auto"/>
-        <w:tblLook w:val="04A0" w:firstRow="1" w:lastRow="0" w:firstColumn="1" w:lastColumn="0" w:noHBand="0" w:noVBand="1"/>
-      </w:tblPr>
-      <w:tblGrid>
-        <w:gridCol w:w="4675"/>
-        <w:gridCol w:w="4675"/>
-      </w:tblGrid>
-      <w:tr>
-        <w:tc>
-          <w:tcPr>
-            <w:tcW w:w="4675" w:type="dxa"/>
-            <w:vAlign w:val="center"/>
-          </w:tcPr>
-          <w:p>
-            <w:pPr>
-              <w:pStyle w:val="NormalWeb"/>
-            </w:pPr>
-            <w:r>
-              <w:rPr>
-                <w:b/>
-                <w:bCs/>
-              </w:rPr>
-              <w:t>Field</w:t>
-            </w:r>
-          </w:p>
-        </w:tc>
-        <w:tc>
-          <w:tcPr>
-            <w:tcW w:w="4675" w:type="dxa"/>
-            <w:vAlign w:val="center"/>
-          </w:tcPr>
-          <w:p>
-            <w:pPr>
-              <w:pStyle w:val="NormalWeb"/>
-            </w:pPr>
-            <w:r>
-              <w:rPr>
-                <w:b/>
-                <w:bCs/>
-              </w:rPr>
-              <w:t>Details</w:t>
-            </w:r>
-          </w:p>
-        </w:tc>
-      </w:tr>
-      <w:tr>
-        <w:tc>
-          <w:tcPr>
-            <w:tcW w:w="4675" w:type="dxa"/>
-            <w:vAlign w:val="center"/>
-          </w:tcPr>
-          <w:p>
-            <w:pPr>
-              <w:pStyle w:val="NormalWeb"/>
-            </w:pPr>
-            <w:r>
-              <w:t>Use Case ID</w:t>
-            </w:r>
-          </w:p>
-        </w:tc>
-        <w:tc>
-          <w:tcPr>
-            <w:tcW w:w="4675" w:type="dxa"/>
-            <w:vAlign w:val="center"/>
-          </w:tcPr>
-          <w:p>
-            <w:pPr>
-              <w:pStyle w:val="NormalWeb"/>
-            </w:pPr>
-            <w:r>
-              <w:t>UC-406</w:t>
-            </w:r>
-          </w:p>
-        </w:tc>
-      </w:tr>
-      <w:tr>
-        <w:tc>
-          <w:tcPr>
-            <w:tcW w:w="4675" w:type="dxa"/>
-            <w:vAlign w:val="center"/>
-          </w:tcPr>
-          <w:p>
-            <w:pPr>
-              <w:pStyle w:val="NormalWeb"/>
-            </w:pPr>
-            <w:r>
-              <w:t>Use Case Name</w:t>
-            </w:r>
-          </w:p>
-        </w:tc>
-        <w:tc>
-          <w:tcPr>
-            <w:tcW w:w="4675" w:type="dxa"/>
-            <w:vAlign w:val="center"/>
-          </w:tcPr>
-          <w:p>
-            <w:pPr>
-              <w:pStyle w:val="NormalWeb"/>
-            </w:pPr>
-            <w:r>
-              <w:t>Manage Departments and Categories</w:t>
-            </w:r>
-          </w:p>
-        </w:tc>
-      </w:tr>
-      <w:tr>
-        <w:tc>
-          <w:tcPr>
-            <w:tcW w:w="4675" w:type="dxa"/>
-            <w:vAlign w:val="center"/>
-          </w:tcPr>
-          <w:p>
-            <w:pPr>
-              <w:pStyle w:val="NormalWeb"/>
-            </w:pPr>
-            <w:r>
-              <w:lastRenderedPageBreak/>
-              <w:t>Actors</w:t>
-            </w:r>
-          </w:p>
-        </w:tc>
-        <w:tc>
-          <w:tcPr>
-            <w:tcW w:w="4675" w:type="dxa"/>
-            <w:vAlign w:val="center"/>
-          </w:tcPr>
-          <w:p>
-            <w:pPr>
-              <w:pStyle w:val="NormalWeb"/>
-            </w:pPr>
-            <w:r>
-              <w:t>Administrator</w:t>
-            </w:r>
-          </w:p>
-        </w:tc>
-      </w:tr>
-      <w:tr>
-        <w:tc>
-          <w:tcPr>
-            <w:tcW w:w="4675" w:type="dxa"/>
-            <w:vAlign w:val="center"/>
-          </w:tcPr>
-          <w:p>
-            <w:pPr>
-              <w:pStyle w:val="NormalWeb"/>
-            </w:pPr>
-            <w:r>
-              <w:t>Description</w:t>
-            </w:r>
-          </w:p>
-        </w:tc>
-        <w:tc>
-          <w:tcPr>
-            <w:tcW w:w="4675" w:type="dxa"/>
-            <w:vAlign w:val="center"/>
-          </w:tcPr>
-          <w:p>
-            <w:pPr>
-              <w:pStyle w:val="NormalWeb"/>
-            </w:pPr>
-            <w:r>
-              <w:t>Admin creates, updates, or removes hospital departments and service categories.</w:t>
-            </w:r>
-          </w:p>
-        </w:tc>
-      </w:tr>
-      <w:tr>
-        <w:tc>
-          <w:tcPr>
-            <w:tcW w:w="4675" w:type="dxa"/>
-            <w:vAlign w:val="center"/>
-          </w:tcPr>
-          <w:p>
-            <w:pPr>
-              <w:pStyle w:val="NormalWeb"/>
-            </w:pPr>
-            <w:r>
-              <w:t>Preconditions</w:t>
-            </w:r>
-          </w:p>
-        </w:tc>
-        <w:tc>
-          <w:tcPr>
-            <w:tcW w:w="4675" w:type="dxa"/>
-            <w:vAlign w:val="center"/>
-          </w:tcPr>
-          <w:p>
-            <w:pPr>
-              <w:pStyle w:val="NormalWeb"/>
-            </w:pPr>
-            <w:r>
-              <w:t>Admin must be authorized.</w:t>
-            </w:r>
-          </w:p>
-        </w:tc>
-      </w:tr>
-      <w:tr>
-        <w:tc>
-          <w:tcPr>
-            <w:tcW w:w="4675" w:type="dxa"/>
-            <w:vAlign w:val="center"/>
-          </w:tcPr>
-          <w:p>
-            <w:pPr>
-              <w:pStyle w:val="NormalWeb"/>
-            </w:pPr>
-            <w:r>
-              <w:t>Basic Flow</w:t>
-            </w:r>
-          </w:p>
-        </w:tc>
-        <w:tc>
-          <w:tcPr>
-            <w:tcW w:w="4675" w:type="dxa"/>
-            <w:vAlign w:val="center"/>
-          </w:tcPr>
-          <w:p>
-            <w:pPr>
-              <w:pStyle w:val="NormalWeb"/>
-            </w:pPr>
-            <w:r>
-              <w:t xml:space="preserve">1. Admin opens departments section. </w:t>
-            </w:r>
-            <w:r>
-              <w:br/>
-              <w:t xml:space="preserve">2. Adds, edits, or removes a department. </w:t>
-            </w:r>
-            <w:r>
-              <w:br/>
-              <w:t>3. System validates and saves.</w:t>
-            </w:r>
-          </w:p>
-        </w:tc>
-      </w:tr>
-      <w:tr>
-        <w:tc>
-          <w:tcPr>
-            <w:tcW w:w="4675" w:type="dxa"/>
-            <w:vAlign w:val="center"/>
-          </w:tcPr>
-          <w:p>
-            <w:pPr>
-              <w:pStyle w:val="NormalWeb"/>
-            </w:pPr>
-            <w:r>
-              <w:t>Alternate Flow</w:t>
-            </w:r>
-          </w:p>
-        </w:tc>
-        <w:tc>
-          <w:tcPr>
-            <w:tcW w:w="4675" w:type="dxa"/>
-            <w:vAlign w:val="center"/>
-          </w:tcPr>
-          <w:p>
-            <w:pPr>
-              <w:pStyle w:val="NormalWeb"/>
-            </w:pPr>
-            <w:r>
-              <w:t>Duplicate or empty name → Error.</w:t>
-            </w:r>
-          </w:p>
-        </w:tc>
-      </w:tr>
-      <w:tr>
-        <w:tc>
-          <w:tcPr>
-            <w:tcW w:w="4675" w:type="dxa"/>
-            <w:vAlign w:val="center"/>
-          </w:tcPr>
-          <w:p>
-            <w:pPr>
-              <w:pStyle w:val="NormalWeb"/>
-            </w:pPr>
-            <w:r>
-              <w:t>Postconditions</w:t>
-            </w:r>
-          </w:p>
-        </w:tc>
-        <w:tc>
-          <w:tcPr>
-            <w:tcW w:w="4675" w:type="dxa"/>
-            <w:vAlign w:val="center"/>
-          </w:tcPr>
-          <w:p>
-            <w:pPr>
-              <w:pStyle w:val="NormalWeb"/>
-            </w:pPr>
-            <w:r>
-              <w:t>Department list updated.</w:t>
-            </w:r>
-          </w:p>
-        </w:tc>
-      </w:tr>
-    </w:tbl>
-    <w:p>
-      <w:pPr>
-        <w:pStyle w:val="NormalWeb"/>
-        <w:keepNext/>
-        <w:jc w:val="center"/>
-      </w:pPr>
-      <w:r>
-        <w:rPr>
-          <w:noProof/>
-        </w:rPr>
-        <w:drawing>
-          <wp:inline distT="0" distB="0" distL="0" distR="0" wp14:anchorId="5E281BEF" wp14:editId="4BE8F62B">
-            <wp:extent cx="3832860" cy="1577340"/>
-            <wp:effectExtent l="0" t="0" r="0" b="3810"/>
-            <wp:docPr id="2120607318" name="Picture 7"/>
-            <wp:cNvGraphicFramePr>
-              <a:graphicFrameLocks xmlns:a="http://schemas.openxmlformats.org/drawingml/2006/main" noChangeAspect="1"/>
-            </wp:cNvGraphicFramePr>
-            <a:graphic xmlns:a="http://schemas.openxmlformats.org/drawingml/2006/main">
-              <a:graphicData uri="http://schemas.openxmlformats.org/drawingml/2006/picture">
-                <pic:pic xmlns:pic="http://schemas.openxmlformats.org/drawingml/2006/picture">
-                  <pic:nvPicPr>
-                    <pic:cNvPr id="0" name="Picture 33"/>
+                    <pic:cNvPr id="0" name="Picture 28"/>
                     <pic:cNvPicPr>
                       <a:picLocks noChangeAspect="1" noChangeArrowheads="1"/>
                     </pic:cNvPicPr>
@@ -18831,7 +18782,7 @@
                         </a:ext>
                       </a:extLst>
                     </a:blip>
-                    <a:srcRect l="2124" t="3792" r="21548" b="24829"/>
+                    <a:srcRect l="2884" r="21795" b="23793"/>
                     <a:stretch>
                       <a:fillRect/>
                     </a:stretch>
@@ -18839,7 +18790,7 @@
                   <pic:spPr bwMode="auto">
                     <a:xfrm>
                       <a:off x="0" y="0"/>
-                      <a:ext cx="3832860" cy="1577340"/>
+                      <a:ext cx="3581400" cy="1684020"/>
                     </a:xfrm>
                     <a:prstGeom prst="rect">
                       <a:avLst/>
@@ -27957,7 +27908,7 @@
             <w:noProof/>
             <w:sz w:val="18"/>
           </w:rPr>
-          <w:t>02/20/26</w:t>
+          <w:t>02/21/26</w:t>
         </w:r>
         <w:r>
           <w:rPr>
@@ -41593,6 +41544,7 @@
   <w:style w:type="character" w:default="1" w:styleId="DefaultParagraphFont">
     <w:name w:val="Default Paragraph Font"/>
     <w:uiPriority w:val="1"/>
+    <w:semiHidden/>
     <w:unhideWhenUsed/>
   </w:style>
   <w:style w:type="table" w:default="1" w:styleId="TableNormal">

</xml_diff>